<commit_message>
JHSS draft: every reference cited; rebuilt
</commit_message>
<xml_diff>
--- a/v3/jhss/manuscript.docx
+++ b/v3/jhss/manuscript.docx
@@ -78,7 +78,7 @@
           <w:b w:val="0"/>
           <w:i w:val="0"/>
         </w:rPr>
-        <w:t>Machine learning has been proposed for that decision. The Ariel consortium's population study of the Tier-1 survey presents "a strategy to select candidate planets for reobservation in Ariel's higher resolution Tier", a band metric to classify planets by composition without a retrieval, and four scikit-learn classifiers trained on simulated Tier-1 spectra to flag the presence of individual molecules, reaching 64–89 % per molecule [6]. The annual Ariel Data Challenges have drawn some 23,000 submissions to atmospheric-inference tasks on a database of 105,887 simulated spectra [7–9], and a 2026 review counts machine-learning retrieval, detrending and surrogate modelling among the methods being prepared for the mission [10]. Every one of these is trained on a forward model of an atmosphere and a model of the telescope, because no spectrum of Ariel quality exists for any target.</w:t>
+        <w:t>Machine learning has been proposed for that decision. The Ariel consortium's population study of the Tier-1 survey presents "a strategy to select candidate planets for reobservation in Ariel's higher resolution Tier", a band metric to classify planets by composition without a retrieval, and four scikit-learn classifiers trained on simulated Tier-1 spectra to flag the presence of individual molecules, reaching 64–89 % per molecule [6]. The annual Ariel Data Challenges have drawn some 23,000 submissions to atmospheric-inference tasks on a database of 105,887 simulated spectra [7–9], and a 2026 review counts machine-learning retrieval, detrending and surrogate modelling among the methods being prepared for the mission [10]. Every one of these is trained on a forward model of an atmosphere and a model of the telescope, because no spectrum of Ariel quality exists for any target; the same is true of the machine-learning retrieval lineage from random forests to neural posterior estimation and flow matching [12–15].</w:t>
       </w:r>
     </w:p>
     <w:p>
@@ -90,7 +90,7 @@
           <w:b w:val="0"/>
           <w:i w:val="0"/>
         </w:rPr>
-        <w:t>Each is also validated the same way: on spectra held back from the same simulator. That test gives a reassuring number, but training and testing share every assumption the simulator makes — which molecules exist, which database provides their absorption, whether there are clouds or haze, how the host star's spots contaminate the signal, how the noise is distributed — and the real atmospheres will differ from those assumptions in ways the test cannot expose. The consortium's Tier-1 study says so itself: its spectra "will only be used as 'transmission spectral shapes' to test our methods against", with no claim about the atmospheric model's realism [6]. The nearest exception in the literature tested a retrieval network on spectra with an absorber added, an absorber removed, and unocculted star spots, and found it more robust than nested sampling on those three changes [11]; it did not ask what could be done about the losses, whether the network could tell, or how the answer depends on the binning at which a decision is made. Misspecification of simulation-trained inference is an active concern in cosmology [37, 38]; it has not been asked of exoplanet screens, where the mismatch is physics rather than simulation fidelity.</w:t>
+        <w:t>Each is also validated the same way: on spectra held back from the same simulator. That test gives a reassuring number, but training and testing share every assumption the simulator makes — which molecules exist, which database provides their absorption, whether there are clouds or haze, how the host star's spots contaminate the signal, how the noise is distributed — and the real atmospheres will differ from those assumptions in ways the test cannot expose. The consortium's Tier-1 study says so itself: its spectra "will only be used as 'transmission spectral shapes' to test our methods against", with no claim about the atmospheric model's realism [6]. The nearest exception in the literature tested a retrieval network on spectra with an absorber added, an absorber removed, and unocculted star spots, and found it more robust than nested sampling on those three changes [11]; it did not ask what could be done about the losses, whether the network could tell, or how the answer depends on the binning at which a decision is made. Classical retrievals have had their forward-model dependence priced — across codes [39], across the equilibrium assumption [20] — and misspecification of simulation-trained inference is an active concern in cosmology [37, 38]; the question has not been asked of exoplanet screens, where the mismatch is physics rather than simulation fidelity, and the one Ariel dataset built with a train/test shift varies the instrument, not the atmosphere [45].</w:t>
       </w:r>
     </w:p>
     <w:p>
@@ -367,7 +367,7 @@
           <w:b w:val="0"/>
           <w:i w:val="0"/>
         </w:rPr>
-        <w:t xml:space="preserve"> grid [28] in which every planet carries a random haze density (log-uniform, 10⁵–3 × 10⁸ m⁻³, 60 % of planets), cloud-top pressure (10³–10⁵ Pa, 50 %), spot coverage (0–20 %, 70 %), noise level (SNR 5–15) and equilibrium-or-quenched chemistry, drawn jointly; the same grid rebuilt without one ingredient gives the </w:t>
+        <w:t xml:space="preserve"> grid [28] (noise augmentation acts as a regulariser and cannot undo a particular draw [29]; augmentation with a transformation teaches invariance to it [40]) in which every planet carries a random haze density (log-uniform, 10⁵–3 × 10⁸ m⁻³, 60 % of planets), cloud-top pressure (10³–10⁵ Pa, 50 %), spot coverage (0–20 %, 70 %), noise level (SNR 5–15) and equilibrium-or-quenched chemistry, drawn jointly; the same grid rebuilt without one ingredient gives the </w:t>
       </w:r>
       <w:r>
         <w:rPr>
@@ -381,7 +381,7 @@
           <w:b w:val="0"/>
           <w:i w:val="0"/>
         </w:rPr>
-        <w:t xml:space="preserve"> variant that tests whether robustness transfers to physics never seen. (iv) </w:t>
+        <w:t xml:space="preserve"> variant that tests whether robustness transfers to physics never seen, the held-out-corruption protocol of ref. [41]. (iv) </w:t>
       </w:r>
       <w:r>
         <w:rPr>
@@ -1796,7 +1796,7 @@
           <w:b w:val="0"/>
           <w:i w:val="0"/>
         </w:rPr>
-        <w:t>The decline rules behave the same way throughout this region: the probability margin and ensemble disagreement rank the screen's errors well (AUROC 0.80–0.92) and the distance scores do not (0.37–0.72, mostly near 0.45), so confidence is the right instrument for a distortion of known physics. But no rule restores clean-level reliability. With the ensemble rule fixed to decline 10 % of clean planets, every in-range mismatch keeps its accepted planets at 94.9 % or better, at coverage that falls to 65 % at SNR 5 — and the credit against the clean selective baseline at the same coverage is negative for every rule on every distorted axis (mean −4 points): declining buys back part of the loss, never all of it. A split-conformal calibration that guarantees 90 % coverage on clean data delivers 63–88 % under these mismatches, and its prediction sets come out empty rather than ambiguous, because the screen is wrong with confidence (Appendix C).</w:t>
+        <w:t>The decline rules behave the same way throughout this region: the probability margin and ensemble disagreement rank the screen's errors well (AUROC 0.80–0.92) and the distance scores do not (0.37–0.72, mostly near 0.45), so confidence is the right instrument for a distortion of known physics. But no rule restores clean-level reliability. With the ensemble rule fixed to decline 10 % of clean planets, every in-range mismatch keeps its accepted planets at 94.9 % or better, at coverage that falls to 65 % at SNR 5 — and the credit against the clean selective baseline at the same coverage is negative for every rule on every distorted axis (mean −4 points): declining buys back part of the loss, never all of it. A split-conformal calibration [36] that guarantees 90 % coverage on clean data delivers 63–88 % under these mismatches — the guarantee is valid for the calibration distribution and needs the deployment distribution to hold [44] —, and its prediction sets come out empty rather than ambiguous, because the screen is wrong with confidence (Appendix C).</w:t>
       </w:r>
     </w:p>
     <w:p>

</xml_diff>

<commit_message>
JHSS draft: subscript fix, rebuilt
</commit_message>
<xml_diff>
--- a/v3/jhss/manuscript.docx
+++ b/v3/jhss/manuscript.docx
@@ -266,7 +266,37 @@
           <w:b w:val="0"/>
           <w:i w:val="0"/>
         </w:rPr>
-        <w:t xml:space="preserve"> test planets with one ingredient changed, so every loss is a within-planet difference. The axes and the concern each represents are: an optically thick grey cloud deck at 10⁵ to 10 Pa (aerosols hide the lower atmosphere); a Lee et al. Mie haze at 2 × 10⁵ to 10¹⁰ m⁻³ [22]; unocculted star spots at 2–20 % coverage, with the transit-light-source correction built from PHOENIX spectra at a spot contrast of 0.85 [21]; white and time-correlated noise at effective signal-to-noise 12 to 5; a gain ramp across the detector; the same planets rendered by an independent radiative-transfer code, Exo-Transmit [25], with the same opacities; the same planets rendered with the ExoMol cross sections [26] in place of Exo-Transmit's tables for H₂O, CH₄, CO₂ and CO; quenched chemistry, in which the carbon–oxygen partition is frozen at the level where the mixing timescale for an eddy-diffusion coefficient K_zz overtakes the CO–CH₄ conversion timescale of ref. [18] on a Guillot profile anchored to the isothermal temperature, for K_zz from 10⁷ to 10¹¹ cm² s⁻¹; HCN and C₂H₂ added at their FastChem equilibrium or quenched abundances (Section 4); and compounds of spots, haze and noise on the same planet. Cloud decks at 10² and 10 Pa, haze at 10¹⁰ m⁻³, faculae and the two non-native codes lie outside anything the randomized training grid contains and are tagged as such.</w:t>
+        <w:t xml:space="preserve"> test planets with one ingredient changed, so every loss is a within-planet difference. The axes and the concern each represents are: an optically thick grey cloud deck at 10⁵ to 10 Pa (aerosols hide the lower atmosphere); a Lee et al. Mie haze at 2 × 10⁵ to 10¹⁰ m⁻³ [22]; unocculted star spots at 2–20 % coverage, with the transit-light-source correction built from PHOENIX spectra at a spot contrast of 0.85 [21]; white and time-correlated noise at effective signal-to-noise 12 to 5; a gain ramp across the detector; the same planets rendered by an independent radiative-transfer code, Exo-Transmit [25], with the same opacities; the same planets rendered with the ExoMol cross sections [26] in place of Exo-Transmit's tables for H₂O, CH₄, CO₂ and CO; quenched chemistry, in which the carbon–oxygen partition is frozen at the level where the mixing timescale for an eddy-diffusion coefficient K</w:t>
+      </w:r>
+      <w:r>
+        <w:rPr>
+          <w:b w:val="0"/>
+          <w:i w:val="0"/>
+          <w:vertAlign w:val="subscript"/>
+        </w:rPr>
+        <w:t>zz</w:t>
+      </w:r>
+      <w:r>
+        <w:rPr>
+          <w:b w:val="0"/>
+          <w:i w:val="0"/>
+        </w:rPr>
+        <w:t xml:space="preserve"> overtakes the CO–CH₄ conversion timescale of ref. [18] on a Guillot profile anchored to the isothermal temperature, for K</w:t>
+      </w:r>
+      <w:r>
+        <w:rPr>
+          <w:b w:val="0"/>
+          <w:i w:val="0"/>
+          <w:vertAlign w:val="subscript"/>
+        </w:rPr>
+        <w:t>zz</w:t>
+      </w:r>
+      <w:r>
+        <w:rPr>
+          <w:b w:val="0"/>
+          <w:i w:val="0"/>
+        </w:rPr>
+        <w:t xml:space="preserve"> from 10⁷ to 10¹¹ cm² s⁻¹; HCN and C₂H₂ added at their FastChem equilibrium or quenched abundances (Section 4); and compounds of spots, haze and noise on the same planet. Cloud decks at 10² and 10 Pa, haze at 10¹⁰ m⁻³, faculae and the two non-native codes lie outside anything the randomized training grid contains and are tagged as such.</w:t>
       </w:r>
     </w:p>
     <w:p>
@@ -1565,7 +1595,24 @@
                 <w:i w:val="0"/>
                 <w:sz w:val="18"/>
               </w:rPr>
-              <w:t>none; holds for K_zz 10⁷–10¹¹</w:t>
+              <w:t>none; holds for K</w:t>
+            </w:r>
+            <w:r>
+              <w:rPr>
+                <w:b w:val="0"/>
+                <w:i w:val="0"/>
+                <w:sz w:val="18"/>
+                <w:vertAlign w:val="subscript"/>
+              </w:rPr>
+              <w:t>zz</w:t>
+            </w:r>
+            <w:r>
+              <w:rPr>
+                <w:b w:val="0"/>
+                <w:i w:val="0"/>
+                <w:sz w:val="18"/>
+              </w:rPr>
+              <w:t xml:space="preserve"> 10⁷–10¹¹</w:t>
             </w:r>
           </w:p>
         </w:tc>
@@ -3553,7 +3600,22 @@
           <w:b w:val="0"/>
           <w:i w:val="0"/>
         </w:rPr>
-        <w:t xml:space="preserve">NH₃ carried no absorption in the forward model of our earlier work (MultiREx ships no NH₃ table), a documented simplification that this paper's thesis made indefensible; the Exo-Transmit NH₃ table was added and every result regenerated (haze and opacity-table costs rose; the contamination host gap narrowed; every qualitative statement survived). The MultiREx fork used here fixes a seeding defect in the released package — objects created within the same second draw identical parameters and shuffled clones reproduce their parent — which our grids never exercised because parameters are drawn externally, and adds the cloud and Mie-haze contributions. The quench prescription, the K_zz sweep and the chemistry checks are in </w:t>
+        <w:t>NH₃ carried no absorption in the forward model of our earlier work (MultiREx ships no NH₃ table), a documented simplification that this paper's thesis made indefensible; the Exo-Transmit NH₃ table was added and every result regenerated (haze and opacity-table costs rose; the contamination host gap narrowed; every qualitative statement survived). The MultiREx fork used here fixes a seeding defect in the released package — objects created within the same second draw identical parameters and shuffled clones reproduce their parent — which our grids never exercised because parameters are drawn externally, and adds the cloud and Mie-haze contributions. The quench prescription, the K</w:t>
+      </w:r>
+      <w:r>
+        <w:rPr>
+          <w:b w:val="0"/>
+          <w:i w:val="0"/>
+          <w:vertAlign w:val="subscript"/>
+        </w:rPr>
+        <w:t>zz</w:t>
+      </w:r>
+      <w:r>
+        <w:rPr>
+          <w:b w:val="0"/>
+          <w:i w:val="0"/>
+        </w:rPr>
+        <w:t xml:space="preserve"> sweep and the chemistry checks are in </w:t>
       </w:r>
       <w:r>
         <w:rPr>

</xml_diff>

<commit_message>
JHSS draft: journal reference style with live DOIs, parenthetical citations, title page, keywords, required sections, conclusion; figures as separate JPEGs with title-case labels
</commit_message>
<xml_diff>
--- a/v3/jhss/manuscript.docx
+++ b/v3/jhss/manuscript.docx
@@ -12,6 +12,46 @@
           <w:i w:val="0"/>
         </w:rPr>
         <w:t>When can a simulator-trained screen be trusted? A reliability map for machine-learning triage of Ariel transmission spectra</w:t>
+      </w:r>
+    </w:p>
+    <w:p>
+      <w:pPr>
+        <w:jc w:val="both"/>
+      </w:pPr>
+      <w:r>
+        <w:rPr>
+          <w:b w:val="0"/>
+          <w:i w:val="0"/>
+        </w:rPr>
+        <w:t>Owen Yang</w:t>
+      </w:r>
+      <w:r>
+        <w:rPr>
+          <w:b w:val="0"/>
+          <w:i w:val="0"/>
+          <w:vertAlign w:val="superscript"/>
+        </w:rPr>
+        <w:t>a</w:t>
+      </w:r>
+    </w:p>
+    <w:p>
+      <w:pPr>
+        <w:jc w:val="both"/>
+      </w:pPr>
+      <w:r>
+        <w:rPr>
+          <w:b w:val="0"/>
+          <w:i w:val="0"/>
+          <w:vertAlign w:val="superscript"/>
+        </w:rPr>
+        <w:t>a</w:t>
+      </w:r>
+      <w:r>
+        <w:rPr>
+          <w:b w:val="0"/>
+          <w:i w:val="0"/>
+        </w:rPr>
+        <w:t xml:space="preserve"> Henry M. Gunn High School, 780 Arastradero Rd, Palo Alto, CA 94306, USA. Tel.: +1 650 686 7813. E-mail: owenhyang@gmail.com (corresponding author)</w:t>
       </w:r>
     </w:p>
     <w:p>
@@ -36,6 +76,25 @@
           <w:i w:val="0"/>
         </w:rPr>
         <w:t>Machine-learning screens have been proposed to decide which of the ~1,000 exoplanets Ariel will observe deserve deeper follow-up, including a Tier-1 classification strategy published by the Ariel consortium. Because no Ariel data exist, every such screen is trained and validated on spectra from the same simulator, so its reported accuracy says nothing about deployment on atmospheres whose physics differs from the simulator's. We ask when such a screen can be trusted and answer with measurements. Two screens go through one procedure: the consortium's Tier-1 molecular screen, rebuilt from its published description, and a tuned screen for a stated Ariel science target, the carbon-rich (C/O &gt; 1) regime. The simulator is broken on purpose along ten physically motivated axes, and for each we measure the loss, the part no retraining can recover, what a randomized training grid absorbs, whether a decline rule flags the errors, and what removes the loss — at the Tier-1 binning where triage would occur and on Ariel's actual target list. The map has three regions. Modelled mismatch is largely absorbed and the residual is irreducible information loss. Disequilibrium chemistry helps. Physics the simulator omitted cannot be trusted: HCN and C₂H₂, present at ~10⁻⁵ in carbon-rich atmospheres and absent from the field's standard Ariel training grid, drop the carbon-rich screen from 96.5 % to 71.9 % — chance on carbon-rich planets, with confident probabilities; no retraining on other ingredients helps, only a distance-based novelty score detects it, and adding the two species restores 96.4 %. The same omission leaves the molecule-presence screen untouched: omitted physics is fatal when it sits on the feature that defines the class. At Tier 1, randomization still helps but no decline rule works and most of every serious loss is unrecoverable by any training. The procedure is released for use on any screen.</w:t>
+      </w:r>
+    </w:p>
+    <w:p>
+      <w:pPr>
+        <w:jc w:val="both"/>
+      </w:pPr>
+      <w:r>
+        <w:rPr>
+          <w:b/>
+          <w:i w:val="0"/>
+        </w:rPr>
+        <w:t>Keywords:</w:t>
+      </w:r>
+      <w:r>
+        <w:rPr>
+          <w:b w:val="0"/>
+          <w:i w:val="0"/>
+        </w:rPr>
+        <w:t xml:space="preserve"> exoplanet atmospheres; transmission spectroscopy; Ariel; machine learning; classification; domain shift; simulation-based inference; out-of-distribution detection; selective prediction; forward-model misspecification; carbon-to-oxygen ratio; disequilibrium chemistry; HCN; acetylene; stellar contamination; opacity databases</w:t>
       </w:r>
     </w:p>
     <w:p>
@@ -66,7 +125,7 @@
           <w:b w:val="0"/>
           <w:i w:val="0"/>
         </w:rPr>
-        <w:t>Ariel, launching in 2029, will obtain transmission spectra of roughly a thousand transiting exoplanets between 0.5 and 7.8 µm [1]. The survey is tiered: a reconnaissance pass over all targets at coarse binning (Tier 1), a chemical survey of a few hundred at higher binning (Tier 2), and repeated observations of a few dozen at the instruments' native resolution (Tier 3). A planet reaches a tier when its spectrum, binned as that tier prescribes, is expected to reach a signal-to-noise ratio of seven on an assumed atmospheric modulation after a number of transits computed with the mission's radiometric model [2–4]; the prescribed binnings are approximately R ≈ 1, 3 and 1 in the NIRSpec, AIRS-CH0 and AIRS-CH1 channels at Tier 1 and R ≈ 10, 50 and 10 at Tier 2 [5]. Which planets advance from the reconnaissance pass to the deeper tiers is a decision that has to be made for a thousand objects.</w:t>
+        <w:t>Ariel, launching in 2029, will obtain transmission spectra of roughly a thousand transiting exoplanets between 0.5 and 7.8 µm (1). The survey is tiered: a reconnaissance pass over all targets at coarse binning (Tier 1), a chemical survey of a few hundred at higher binning (Tier 2), and repeated observations of a few dozen at the instruments' native resolution (Tier 3). A planet reaches a tier when its spectrum, binned as that tier prescribes, is expected to reach a signal-to-noise ratio of seven on an assumed atmospheric modulation after a number of transits computed with the mission's radiometric model (2-4); the prescribed binnings are approximately R ≈ 1, 3 and 1 in the NIRSpec, AIRS-CH0 and AIRS-CH1 channels at Tier 1 and R ≈ 10, 50 and 10 at Tier 2 (5). Which planets advance from the reconnaissance pass to the deeper tiers is a decision that has to be made for a thousand objects.</w:t>
       </w:r>
     </w:p>
     <w:p>
@@ -78,7 +137,7 @@
           <w:b w:val="0"/>
           <w:i w:val="0"/>
         </w:rPr>
-        <w:t>Machine learning has been proposed for that decision. The Ariel consortium's population study of the Tier-1 survey presents "a strategy to select candidate planets for reobservation in Ariel's higher resolution Tier", a band metric to classify planets by composition without a retrieval, and four scikit-learn classifiers trained on simulated Tier-1 spectra to flag the presence of individual molecules, reaching 64–89 % per molecule [6]. The annual Ariel Data Challenges have drawn some 23,000 submissions to atmospheric-inference tasks on a database of 105,887 simulated spectra [7–9], and a 2026 review counts machine-learning retrieval, detrending and surrogate modelling among the methods being prepared for the mission [10]. Every one of these is trained on a forward model of an atmosphere and a model of the telescope, because no spectrum of Ariel quality exists for any target; the same is true of the machine-learning retrieval lineage from random forests to neural posterior estimation and flow matching [12–15].</w:t>
+        <w:t>Machine learning has been proposed for that decision. The Ariel consortium's population study of the Tier-1 survey presents "a strategy to select candidate planets for reobservation in Ariel's higher resolution Tier", a band metric to classify planets by composition without a retrieval, and four scikit-learn classifiers trained on simulated Tier-1 spectra to flag the presence of individual molecules, reaching 64–89 % per molecule (6). The annual Ariel Data Challenges have drawn some 23,000 submissions to atmospheric-inference tasks on a database of 105,887 simulated spectra (7-9), and a 2026 review counts machine-learning retrieval, detrending and surrogate modelling among the methods being prepared for the mission (10). Every one of these is trained on a forward model of an atmosphere and a model of the telescope, because no spectrum of Ariel quality exists for any target; the same is true of the machine-learning retrieval lineage from random forests to neural posterior estimation and flow matching (12-15).</w:t>
       </w:r>
     </w:p>
     <w:p>
@@ -90,7 +149,7 @@
           <w:b w:val="0"/>
           <w:i w:val="0"/>
         </w:rPr>
-        <w:t>Each is also validated the same way: on spectra held back from the same simulator. That test gives a reassuring number, but training and testing share every assumption the simulator makes — which molecules exist, which database provides their absorption, whether there are clouds or haze, how the host star's spots contaminate the signal, how the noise is distributed — and the real atmospheres will differ from those assumptions in ways the test cannot expose. The consortium's Tier-1 study says so itself: its spectra "will only be used as 'transmission spectral shapes' to test our methods against", with no claim about the atmospheric model's realism [6]. The nearest exception in the literature tested a retrieval network on spectra with an absorber added, an absorber removed, and unocculted star spots, and found it more robust than nested sampling on those three changes [11]; it did not ask what could be done about the losses, whether the network could tell, or how the answer depends on the binning at which a decision is made. Classical retrievals have had their forward-model dependence priced — across codes [39], across the equilibrium assumption [20] — and misspecification of simulation-trained inference is an active concern in cosmology [37, 38]; the question has not been asked of exoplanet screens, where the mismatch is physics rather than simulation fidelity, and the one Ariel dataset built with a train/test shift varies the instrument, not the atmosphere [45].</w:t>
+        <w:t>Each is also validated the same way: on spectra held back from the same simulator. That test gives a reassuring number, but training and testing share every assumption the simulator makes — which molecules exist, which database provides their absorption, whether there are clouds or haze, how the host star's spots contaminate the signal, how the noise is distributed — and the real atmospheres will differ from those assumptions in ways the test cannot expose. The consortium's Tier-1 study says so itself: its spectra "will only be used as 'transmission spectral shapes' to test our methods against", with no claim about the atmospheric model's realism (6). The nearest exception in the literature tested a retrieval network on spectra with an absorber added, an absorber removed, and unocculted star spots, and found it more robust than nested sampling on those three changes (11); it did not ask what could be done about the losses, whether the network could tell, or how the answer depends on the binning at which a decision is made. Classical retrievals have had their forward-model dependence priced — across codes (39), across the equilibrium assumption (20) — and misspecification of simulation-trained inference is an active concern in cosmology (37, 38); the question has not been asked of exoplanet screens, where the mismatch is physics rather than simulation fidelity, and the one Ariel dataset built with a train/test shift varies the instrument, not the atmosphere (45).</w:t>
       </w:r>
     </w:p>
     <w:p>
@@ -128,7 +187,7 @@
           <w:b w:val="0"/>
           <w:i w:val="0"/>
         </w:rPr>
-        <w:t>The contributions are three. First, a reliability map, computed with one reusable procedure for two screens — the consortium's own Tier-1 design, rebuilt from its published description, and a tuned screen for a stated Ariel science target — that for each of ten simulator mismatches reports the loss, its irreducible part, what a randomized training grid absorbs, whether the errors can be flagged, and what removes the loss (Section 3). Second, the finding that two molecules chemistry has long assigned to carbon-rich atmospheres, and that the field's standard Ariel training grid omits, put a carbon-rich screen at chance on exactly the planets it exists to find, with high confidence, while leaving a molecule-presence screen untouched (Section 4). Third, the map at Tier 1, where triage would actually happen, which is much less comfortable than at Tier 3 (Section 5). No method used here is new: domain randomization, selective prediction, distance-based novelty scores, oracle bounds and held-out-axis evaluation are standard in machine learning and are cited where used. What is new is the question asked of an exoplanet screen, the physics-side axes, the framing of each failure as absorb-or-detect-or-fix, the answer as a table a mission can act on, and the finding about the standard grid.</w:t>
+        <w:t>The contributions are three. First, a reliability map, computed with one reusable procedure for two screens — the consortium's own Tier-1 design, rebuilt from its published description, and a tuned screen for a stated Ariel science target — that for each of ten simulator mismatches reports the loss, its irreducible part, what a randomized training grid absorbs, whether the errors can be flagged, and what removes the loss (Section 3.1). Second, the finding that two molecules chemistry has long assigned to carbon-rich atmospheres, and that the field's standard Ariel training grid omits, put a carbon-rich screen at chance on exactly the planets it exists to find, with high confidence, while leaving a molecule-presence screen untouched (Section 3.2). Third, the map at Tier 1, where triage would actually happen, where the map differs materially from Tier 3 (Section 3.3). No method used here is new: domain randomization, selective prediction, distance-based novelty scores, oracle bounds and held-out-axis evaluation are standard in machine learning and are cited where used. What is new is the question asked of an exoplanet screen, the physics-side axes, the framing of each failure as absorb-or-detect-or-fix, the answer as a table a mission can act on, and the finding about the standard grid.</w:t>
       </w:r>
     </w:p>
     <w:p>
@@ -147,7 +206,7 @@
           <w:b/>
           <w:i w:val="0"/>
         </w:rPr>
-        <w:t>Two screens and one procedure</w:t>
+        <w:t>Materials and Methods</w:t>
       </w:r>
     </w:p>
     <w:p>
@@ -178,7 +237,7 @@
           <w:b w:val="0"/>
           <w:i w:val="0"/>
         </w:rPr>
-        <w:t>The screen of ref. [6] is reproduced from the text as literally as it allows, since its simulator wrapper is not public. Their training population (POP-III) takes the Ariel candidate list, repeats each planet four times, draws the atmospheric temperature uniformly in 0.7–1.05 of the planet's equilibrium temperature, the CH₄, H₂O, CO₂ and NH₃ abundances log-uniformly in 10⁻⁹–10⁻², and a grey cloud deck log-uniformly in 5 × 10²–10⁶ Pa, in an H₂/He atmosphere; their test population (POP-I) uses each planet once with abundances in 10⁻⁷–10⁻². Spectra are binned to the seven Tier-1 points (three photometric bands, one NIRSpec point, two AIRS-CH0 points, one AIRS-CH1 point) and scattered with the Tier-1 requirement noise. Each molecule is labelled present if its abundance exceeds 10⁻⁵, 10⁻⁴ or 10⁻³; inputs are normalised to zero mean and unit variance; the four classifiers are scikit-learn's k-nearest neighbours, multilayer perceptron, random forest and support-vector classifier at default settings [47]. We use the 965 known planets of the current Mission Candidate Sample [3] as the planet list, our forward model (Section 2.2) in place of theirs, and the consortium simulator's noise shape (Section 2.3). At the 10⁻⁴ threshold our rebuild reaches CH₄ 70–72 %, H₂O 63–69 %, CO₂ 60 % and NH₃ 76–78 % against their 82–87, 71–78, 79–83 and 82–87 %; NH₃ and CH₄ reach their values within five points when the noise is halved, CO₂ does not at any noise level because its 4.3 µm band is diluted within the single 3.9–7.8 µm Tier-1 point of our layout. The deviations are listed in Appendix A. Where the rebuild falls short of their Table 6 we report the mismatch costs as differences from our own clean values.</w:t>
+        <w:t>The screen of reference (6) is reproduced from the text as literally as it allows, since its simulator wrapper is not public. Their training population (POP-III) takes the Ariel candidate list, repeats each planet four times, draws the atmospheric temperature uniformly in 0.7–1.05 of the planet's equilibrium temperature, the CH₄, H₂O, CO₂ and NH₃ abundances log-uniformly in 10⁻⁹–10⁻², and a grey cloud deck log-uniformly in 5 × 10²–10⁶ Pa, in an H₂/He atmosphere; their test population (POP-I) uses each planet once with abundances in 10⁻⁷–10⁻². Spectra are binned to the seven Tier-1 points (three photometric bands, one NIRSpec point, two AIRS-CH0 points, one AIRS-CH1 point) and scattered with the Tier-1 requirement noise. Each molecule is labelled present if its abundance exceeds 10⁻⁵, 10⁻⁴ or 10⁻³; inputs are normalised to zero mean and unit variance; the four classifiers are scikit-learn's k-nearest neighbours, multilayer perceptron, random forest and support-vector classifier at default settings (47). We use the 965 known planets of the current Mission Candidate Sample (3) as the planet list, our forward model (Section 2.2) in place of theirs, and the consortium simulator's noise shape (Section 2.3). At the 10⁻⁴ threshold our rebuild reaches CH₄ 70–72 %, H₂O 63–69 %, CO₂ 60 % and NH₃ 76–78 % against their 82–87, 71–78, 79–83 and 82–87 %; NH₃ and CH₄ reach their values within five points when the noise is halved, CO₂ does not at any noise level because its 4.3 µm band is diluted within the single 3.9–7.8 µm Tier-1 point of our layout. The deviations are listed in Appendix A. Where the rebuild falls short of their Table 6 we report the mismatch costs as differences from our own clean values.</w:t>
       </w:r>
     </w:p>
     <w:p>
@@ -209,7 +268,7 @@
           <w:b w:val="0"/>
           <w:i w:val="0"/>
         </w:rPr>
-        <w:t>The second screen targets a chemical regime rather than a molecule: is the atmospheric carbon-to-oxygen ratio above one? The C/O ratio is a stated Ariel science objective, a tracer of where and how a planet formed [1], and C/O = 1 is a physical boundary — above it, oxygen is locked in CO and water is depleted, below it carbon is [16, 17] — so the label is a property of the atmosphere rather than a threshold imposed on the labelling convention. The grid holds 18,040 training and 9,016 test planets in five independent test sets (18,156 and 9,072 were drawn; 0.4–0.9 % failed to render) with bulk parameters drawn independently over ranges informed by the Ariel target samples: planet radius 1–26 R⊕, mass 1–300 M⊕, host temperature 2,500–7,500 K, atmospheric temperature 500–2,500 K, C/O uniform in 0.2–1.8 and metallicity uniform in −1 to 1.5 dex. Abundances of H₂O, CH₄, CO, CO₂, NH₃ and O₃ follow from chemical equilibrium computed with FastChem [19] at the photospheric level (10⁻² bar), held constant with altitude, and the label is C/O &gt; 1, which the draw balances to 0.48–0.52 on every split. Spectra are rendered with MultiREx over TauREx 3 [23, 24] at native resolution, without noise, and binned by exact integration to the Ariel Tier-3 layout: three photometric bands below 1.1 µm, then R = 15 over 1.10–1.95 µm, R = 100 over 1.95–3.90 µm and R = 30 over 3.90–7.80 µm, 102 bins in all [2–4]. Opacities are Exo-Transmit's tables [25], derived from the compilation of ref. [42] with the line-list sources of ref. [43]; tables for CO, NH₃, HCN and C₂H₂ were added from the same source. Noise is Gaussian with a per-spectrum standard deviation equal to the peak-to-peak amplitude divided by 15, shaped in wavelength by the noise-to-signal curve of an ExoRad model of the payload for the host's temperature [4]; the shape of the consortium's ExoSim 2 simulator [27] agrees with it to Spearman 0.985 for solar-type hosts and 0.80 for the coolest, and replacing one shape with the other costs the screen 0.1 points.</w:t>
+        <w:t>The second screen targets a chemical regime rather than a molecule: is the atmospheric carbon-to-oxygen ratio above one? The C/O ratio is a stated Ariel science objective, a tracer of where and how a planet formed (1), and C/O = 1 is a physical boundary — above it, oxygen is locked in CO and water is depleted, below it carbon is (16, 17) — so the label is a property of the atmosphere rather than a threshold imposed on the labelling convention. The grid holds 18,040 training and 9,016 test planets in five independent test sets (18,156 and 9,072 were drawn; 0.4–0.9 % failed to render) with bulk parameters drawn independently over ranges informed by the Ariel target samples: planet radius 1–26 R⊕, mass 1–300 M⊕, host temperature 2,500–7,500 K, atmospheric temperature 500–2,500 K, C/O uniform in 0.2–1.8 and metallicity uniform in −1 to 1.5 dex. Abundances of H₂O, CH₄, CO, CO₂, NH₃ and O₃ follow from chemical equilibrium computed with FastChem (19) at the photospheric level (10⁻² bar), held constant with altitude, and the label is C/O &gt; 1, which the draw balances to 0.48–0.52 on every split. Spectra are rendered with MultiREx over TauREx 3 (23, 24) at native resolution, without noise, and binned by exact integration to the Ariel Tier-3 layout: three photometric bands below 1.1 µm, then R = 15 over 1.10–1.95 µm, R = 100 over 1.95–3.90 µm and R = 30 over 3.90–7.80 µm, 102 bins in all (2-4). Opacities are Exo-Transmit's tables (25), derived from the compilation of reference (42) with the line-list sources of reference (43); tables for CO, NH₃, HCN and C₂H₂ were added from the same source. Noise is Gaussian with a per-spectrum standard deviation equal to the peak-to-peak amplitude divided by 15, shaped in wavelength by the noise-to-signal curve of an ExoRad model of the payload for the host's temperature (4); the shape of the consortium's ExoSim 2 simulator (27) agrees with it to Spearman 0.985 for solar-type hosts and 0.80 for the coolest, and replacing one shape with the other costs the screen 0.1 points.</w:t>
       </w:r>
     </w:p>
     <w:p>
@@ -221,7 +280,7 @@
           <w:b w:val="0"/>
           <w:i w:val="0"/>
         </w:rPr>
-        <w:t>Nine pipelines were tuned by cross-validation on the training set: XGBoost [46], random forests and multilayer perceptrons on raw bins, on principal components, and on per-spectrum-normalised bins. Per-spectrum normalisation (subtracting each spectrum's mean and dividing by its standard deviation, so the classifier sees shape rather than depth) is worth four to ten points over the alternatives, and normalised XGBoost is the screen used throughout: 96.47 ± 0.26 % across the five test sets, 96.32 ± 0.08 % across ten training draws, expected calibration error 0.009. Moving the label's cut away from C/O = 1 and retraining lowers accuracy to 94.8 % at C/O = 0.79 and 85.7 % at 1.26 while the majority-class rate rises to 63 and 66 %, so what the screen learns is the chemistry transition at C/O ≈ 1, not an arbitrary line.</w:t>
+        <w:t>Nine pipelines were tuned by cross-validation on the training set: XGBoost (46), random forests and multilayer perceptrons on raw bins, on principal components, and on per-spectrum-normalised bins. Per-spectrum normalisation (subtracting each spectrum's mean and dividing by its standard deviation, so the classifier sees shape rather than depth) is worth four to ten points over the alternatives, and normalised XGBoost is the screen used throughout: 96.47 ± 0.26 % across the five test sets, 96.32 ± 0.08 % across ten training draws, expected calibration error 0.009. Moving the label's cut away from C/O = 1 and retraining lowers accuracy to 94.8 % at C/O = 0.79 and 85.7 % at 1.26 while the majority-class rate rises to 63 and 66 %, so what the screen learns is the chemistry transition at C/O ≈ 1, not an arbitrary line.</w:t>
       </w:r>
     </w:p>
     <w:p>
@@ -266,7 +325,7 @@
           <w:b w:val="0"/>
           <w:i w:val="0"/>
         </w:rPr>
-        <w:t xml:space="preserve"> test planets with one ingredient changed, so every loss is a within-planet difference. The axes and the concern each represents are: an optically thick grey cloud deck at 10⁵ to 10 Pa (aerosols hide the lower atmosphere); a Lee et al. Mie haze at 2 × 10⁵ to 10¹⁰ m⁻³ [22]; unocculted star spots at 2–20 % coverage, with the transit-light-source correction built from PHOENIX spectra at a spot contrast of 0.85 [21]; white and time-correlated noise at effective signal-to-noise 12 to 5; a gain ramp across the detector; the same planets rendered by an independent radiative-transfer code, Exo-Transmit [25], with the same opacities; the same planets rendered with the ExoMol cross sections [26] in place of Exo-Transmit's tables for H₂O, CH₄, CO₂ and CO; quenched chemistry, in which the carbon–oxygen partition is frozen at the level where the mixing timescale for an eddy-diffusion coefficient K</w:t>
+        <w:t xml:space="preserve"> test planets with one ingredient changed, so every loss is a within-planet difference. The axes and the concern each represents are: an optically thick grey cloud deck at 10⁵ to 10 Pa (aerosols hide the lower atmosphere); a Lee et al. Mie haze at 2 × 10⁵ to 10¹⁰ m⁻³ (22); unocculted star spots at 2–20 % coverage, with the transit-light-source correction built from PHOENIX spectra at a spot contrast of 0.85 (21); white and time-correlated noise at effective signal-to-noise 12 to 5; a gain ramp across the detector; the same planets rendered by an independent radiative-transfer code, Exo-Transmit (25), with the same opacities; the same planets rendered with the ExoMol cross sections (26) in place of Exo-Transmit's tables for H₂O, CH₄, CO₂ and CO; quenched chemistry, in which the carbon–oxygen partition is frozen at the level where the mixing timescale for an eddy-diffusion coefficient K</w:t>
       </w:r>
       <w:r>
         <w:rPr>
@@ -281,7 +340,7 @@
           <w:b w:val="0"/>
           <w:i w:val="0"/>
         </w:rPr>
-        <w:t xml:space="preserve"> overtakes the CO–CH₄ conversion timescale of ref. [18] on a Guillot profile anchored to the isothermal temperature, for K</w:t>
+        <w:t xml:space="preserve"> overtakes the CO–CH₄ conversion timescale of reference (18) on a Guillot profile anchored to the isothermal temperature, for K</w:t>
       </w:r>
       <w:r>
         <w:rPr>
@@ -296,7 +355,7 @@
           <w:b w:val="0"/>
           <w:i w:val="0"/>
         </w:rPr>
-        <w:t xml:space="preserve"> from 10⁷ to 10¹¹ cm² s⁻¹; HCN and C₂H₂ added at their FastChem equilibrium or quenched abundances (Section 4); and compounds of spots, haze and noise on the same planet. Cloud decks at 10² and 10 Pa, haze at 10¹⁰ m⁻³, faculae and the two non-native codes lie outside anything the randomized training grid contains and are tagged as such.</w:t>
+        <w:t xml:space="preserve"> from 10⁷ to 10¹¹ cm² s⁻¹; HCN and C₂H₂ added at their FastChem equilibrium or quenched abundances (Section 3.2); and compounds of spots, haze and noise on the same planet. Cloud decks at 10² and 10 Pa, haze at 10¹⁰ m⁻³, faculae and the two non-native codes lie outside anything the randomized training grid contains and are tagged as such.</w:t>
       </w:r>
     </w:p>
     <w:p>
@@ -397,7 +456,7 @@
           <w:b w:val="0"/>
           <w:i w:val="0"/>
         </w:rPr>
-        <w:t xml:space="preserve"> grid [28] (noise augmentation acts as a regulariser and cannot undo a particular draw [29]; augmentation with a transformation teaches invariance to it [40]) in which every planet carries a random haze density (log-uniform, 10⁵–3 × 10⁸ m⁻³, 60 % of planets), cloud-top pressure (10³–10⁵ Pa, 50 %), spot coverage (0–20 %, 70 %), noise level (SNR 5–15) and equilibrium-or-quenched chemistry, drawn jointly; the same grid rebuilt without one ingredient gives the </w:t>
+        <w:t xml:space="preserve"> grid (28) (noise augmentation acts as a regulariser and cannot undo a particular draw (29); augmentation with a transformation teaches invariance to it (40)) in which every planet carries a random haze density (log-uniform, 10⁵–3 × 10⁸ m⁻³, 60 % of planets), cloud-top pressure (10³–10⁵ Pa, 50 %), spot coverage (0–20 %, 70 %), noise level (SNR 5–15) and equilibrium-or-quenched chemistry, drawn jointly; the same grid rebuilt without one ingredient gives the </w:t>
       </w:r>
       <w:r>
         <w:rPr>
@@ -411,7 +470,7 @@
           <w:b w:val="0"/>
           <w:i w:val="0"/>
         </w:rPr>
-        <w:t xml:space="preserve"> variant that tests whether robustness transfers to physics never seen, the held-out-corruption protocol of ref. [41]. (iv) </w:t>
+        <w:t xml:space="preserve"> variant that tests whether robustness transfers to physics never seen, the held-out-corruption protocol of reference (41). (iv) </w:t>
       </w:r>
       <w:r>
         <w:rPr>
@@ -425,7 +484,7 @@
           <w:b w:val="0"/>
           <w:i w:val="0"/>
         </w:rPr>
-        <w:t xml:space="preserve">: five decline rules — the probability margin [30], the disagreement of an XGBoost/random-forest/perceptron ensemble [33], the Mahalanobis distance from the training cloud in feature space [31], the k-nearest-neighbour distance [32] and a PCA reconstruction error — each thresholded to decline 10 % of </w:t>
+        <w:t xml:space="preserve">: five decline rules — the probability margin (30), the disagreement of an XGBoost/random-forest/perceptron ensemble (33), the Mahalanobis distance from the training cloud in feature space (31), the k-nearest-neighbour distance (32) and a PCA reconstruction error — each thresholded to decline 10 % of </w:t>
       </w:r>
       <w:r>
         <w:rPr>
@@ -453,7 +512,7 @@
           <w:b w:val="0"/>
           <w:i w:val="0"/>
         </w:rPr>
-        <w:t xml:space="preserve"> the clean selective baseline at the same coverage [34], because declining low-confidence planets raises accuracy on clean data too. (v) </w:t>
+        <w:t xml:space="preserve"> the clean selective baseline at the same coverage (34), because declining low-confidence planets raises accuracy on clean data too. (v) </w:t>
       </w:r>
       <w:r>
         <w:rPr>
@@ -486,7 +545,26 @@
           <w:b/>
           <w:i w:val="0"/>
         </w:rPr>
-        <w:t>The map</w:t>
+        <w:t>Results and Discussion</w:t>
+      </w:r>
+    </w:p>
+    <w:p>
+      <w:pPr>
+        <w:pStyle w:val="Heading2"/>
+      </w:pPr>
+      <w:r>
+        <w:rPr>
+          <w:b/>
+          <w:i w:val="0"/>
+        </w:rPr>
+        <w:t xml:space="preserve">3.1 </w:t>
+      </w:r>
+      <w:r>
+        <w:rPr>
+          <w:b w:val="0"/>
+          <w:i/>
+        </w:rPr>
+        <w:t>The map at Tier 3</w:t>
       </w:r>
     </w:p>
     <w:p>
@@ -1831,7 +1909,7 @@
           <w:b w:val="0"/>
           <w:i w:val="0"/>
         </w:rPr>
-        <w:t xml:space="preserve"> Clouds, haze, star spots, noise, a gain ramp, another radiative-transfer code and another opacity database each cost the clean-trained screen 4 to 16 points at the strengths shown. Training on any one of them, at the strength deployed, recovers 95–100 % of what the oracle reaches for spots and haze and 84–107 % for noise when the training noise levels include the test level; the residual is the irreducible part, 0.3–3.5 points for the deterministic re-renders and 4.6–4.8 points for noise at SNR 5, where the information has been removed from the data and only observing longer restores it. The randomized grid — one screen trained with every ingredient drawn at random — halves the loss on clouds, haze, spots and compounds at a cost of 1.06 points on clean spectra, but reaches only 31–83 % of the single-axis ceilings; our pre-registered expectation of ≥ 90 % was wrong, and joint randomization has a capacity price that single-axis training does not. Robustness transfers unevenly to ingredients the randomized grid never contained: 23 % of the achievable improvement for spots, 40 % for aerosols, 49 % for noise; the loss under the other opacity database falls from 15.9 to 7.4 points without those tables ever being seen, while the loss under the other radiative-transfer code does not move. Compound mismatches are sub-additive on this screen (spots and haze together cost 6 points less than the sum of their parts), so compounding is not the danger; the single largest modelled risk is the opacity database, 88 % of whose cost is reducible only by training on the alternative. Stellar contamination is the one axis whose cost depends on the host star: at 20 % coverage M-dwarf hosts lose 16 points, F, G and K hosts 9, as expected from the transit-light-source effect [21]; every other axis is flat across host type.</w:t>
+        <w:t xml:space="preserve"> Clouds, haze, star spots, noise, a gain ramp, another radiative-transfer code and another opacity database each cost the clean-trained screen 4 to 16 points at the strengths shown. Training on any one of them, at the strength deployed, recovers 95–100 % of what the oracle reaches for spots and haze and 84–107 % for noise when the training noise levels include the test level; the residual is the irreducible part, 0.3–3.5 points for the deterministic re-renders and 4.6–4.8 points for noise at SNR 5, where the information has been removed from the data and only observing longer restores it. The randomized grid — one screen trained with every ingredient drawn at random — halves the loss on clouds, haze, spots and compounds at a cost of 1.06 points on clean spectra, but reaches only 31–83 % of the single-axis ceilings; our pre-registered expectation of ≥ 90 % was wrong, and joint randomization has a capacity price that single-axis training does not. Robustness transfers unevenly to ingredients the randomized grid never contained: 23 % of the achievable improvement for spots, 40 % for aerosols, 49 % for noise; the loss under the other opacity database falls from 15.9 to 7.4 points without those tables ever being seen, while the loss under the other radiative-transfer code does not move. Compound mismatches are sub-additive on this screen (spots and haze together cost 6 points less than the sum of their parts), so compounding is not the danger; the single largest modelled risk is the opacity database, 88 % of whose cost is reducible only by training on the alternative. Stellar contamination is the one axis whose cost depends on the host star: at 20 % coverage M-dwarf hosts lose 16 points, F, G and K hosts 9, as expected from the transit-light-source effect (21); every other axis is flat across host type.</w:t>
       </w:r>
     </w:p>
     <w:p>
@@ -1843,7 +1921,7 @@
           <w:b w:val="0"/>
           <w:i w:val="0"/>
         </w:rPr>
-        <w:t>The decline rules behave the same way throughout this region: the probability margin and ensemble disagreement rank the screen's errors well (AUROC 0.80–0.92) and the distance scores do not (0.37–0.72, mostly near 0.45), so confidence is the right instrument for a distortion of known physics. But no rule restores clean-level reliability. With the ensemble rule fixed to decline 10 % of clean planets, every in-range mismatch keeps its accepted planets at 94.9 % or better, at coverage that falls to 65 % at SNR 5 — and the credit against the clean selective baseline at the same coverage is negative for every rule on every distorted axis (mean −4 points): declining buys back part of the loss, never all of it. A split-conformal calibration [36] that guarantees 90 % coverage on clean data delivers 63–88 % under these mismatches — the guarantee is valid for the calibration distribution and needs the deployment distribution to hold [44] —, and its prediction sets come out empty rather than ambiguous, because the screen is wrong with confidence (Appendix C).</w:t>
+        <w:t>The decline rules behave the same way throughout this region: the probability margin and ensemble disagreement rank the screen's errors well (AUROC 0.80–0.92) and the distance scores do not (0.37–0.72, mostly near 0.45), so confidence is the right instrument for a distortion of known physics. But no rule restores clean-level reliability. With the ensemble rule fixed to decline 10 % of clean planets, every in-range mismatch keeps its accepted planets at 94.9 % or better, at coverage that falls to 65 % at SNR 5 — and the credit against the clean selective baseline at the same coverage is negative for every rule on every distorted axis (mean −4 points): declining buys back part of the loss, never all of it. A split-conformal calibration (36) that guarantees 90 % coverage on clean data delivers 63–88 % under these mismatches — the guarantee is valid for the calibration distribution and needs the deployment distribution to hold (44) —, and its prediction sets come out empty rather than ambiguous, because the screen is wrong with confidence (Appendix C).</w:t>
       </w:r>
     </w:p>
     <w:p>
@@ -1895,7 +1973,7 @@
           <w:b w:val="0"/>
           <w:i w:val="0"/>
         </w:rPr>
-        <w:t xml:space="preserve"> the clean-trained screen's accuracy from 96.5 to 98.3 %, by 6.6 points on planets below 1,000 K, at every eddy-diffusion coefficient from 10⁷ to 10¹¹ cm² s⁻¹. The reason is chemical: at depth a carbon-rich atmosphere is depleted of water by orders of magnitude [16, 17], quenching carries that depletion up to the photosphere, and the label's separation in water abundance on cool planets grows from 0.3 to 3.3 dex. The reverse deployment — a screen trained on quenched atmospheres applied to equilibrium ones — loses 10.1 points, of which mixing recovers 72 %. The design rule is to train on the chemistry in which the label is hardest to see. Whether this holds under photochemistry, which the forward model does not include, is not tested here.</w:t>
+        <w:t xml:space="preserve"> the clean-trained screen's accuracy from 96.5 to 98.3 %, by 6.6 points on planets below 1,000 K, at every eddy-diffusion coefficient from 10⁷ to 10¹¹ cm² s⁻¹. The reason is chemical: at depth a carbon-rich atmosphere is depleted of water by orders of magnitude (16, 17), quenching carries that depletion up to the photosphere, and the label's separation in water abundance on cool planets grows from 0.3 to 3.3 dex. The reverse deployment — a screen trained on quenched atmospheres applied to equilibrium ones — loses 10.1 points, of which mixing recovers 72 %. The design rule is to train on the chemistry in which the label is hardest to see. Whether this holds under photochemistry, which the forward model does not include, is not tested here.</w:t>
       </w:r>
     </w:p>
     <w:p>
@@ -1914,24 +1992,24 @@
           <w:b w:val="0"/>
           <w:i w:val="0"/>
         </w:rPr>
-        <w:t xml:space="preserve"> The last two rows are the subject of Section 4.</w:t>
+        <w:t xml:space="preserve"> The last two rows are the subject of Section 3.2.</w:t>
       </w:r>
     </w:p>
     <w:p>
       <w:pPr>
-        <w:pStyle w:val="Heading1"/>
+        <w:pStyle w:val="Heading2"/>
       </w:pPr>
       <w:r>
         <w:rPr>
           <w:b/>
           <w:i w:val="0"/>
         </w:rPr>
-        <w:t xml:space="preserve">4. </w:t>
+        <w:t xml:space="preserve">3.2 </w:t>
       </w:r>
       <w:r>
         <w:rPr>
-          <w:b/>
-          <w:i w:val="0"/>
+          <w:b w:val="0"/>
+          <w:i/>
         </w:rPr>
         <w:t>The omitted species</w:t>
       </w:r>
@@ -2005,7 +2083,7 @@
           <w:b w:val="0"/>
           <w:i w:val="0"/>
         </w:rPr>
-        <w:t>In an atmosphere with C/O ≥ 1 above about 800 K, HCN and C₂H₂ become major constituents, enhanced by three to six orders of magnitude over their solar-composition values, and "can be considered good tracers of the C/O ratio" [16]; disequilibrium chemistry enhances them further [17]. FastChem gives them at ~10⁻⁵ and ~3 × 10⁻⁵ on the carbon-rich planets of our grid (5 × 10⁻⁵ and 1.5 × 10⁻⁴ when quenched) and at 10⁻¹⁰ and 10⁻¹⁴ on the others. Neither molecule is in the forward model that trained the screen. Neither is in the Ariel Data Challenge database, whose forward model states that "the trace gases are H₂O, CH₄, CO, CO₂ and NH₃" [7], nor in the challenge that followed it [8], nor in the free-chemistry training models of ref. [11]. The omission is the field's standard, not ours.</w:t>
+        <w:t>In an atmosphere with C/O ≥ 1 above about 800 K, HCN and C₂H₂ become major constituents, enhanced by three to six orders of magnitude over their solar-composition values, and "can be considered good tracers of the C/O ratio" (16); disequilibrium chemistry enhances them further (17). FastChem gives them at ~10⁻⁵ and ~3 × 10⁻⁵ on the carbon-rich planets of our grid (5 × 10⁻⁵ and 1.5 × 10⁻⁴ when quenched) and at 10⁻¹⁰ and 10⁻¹⁴ on the others. Neither molecule is in the forward model that trained the screen. Neither is in the Ariel Data Challenge database, whose forward model states that "the trace gases are H₂O, CH₄, CO, CO₂ and NH₃" (7), nor in the challenge that followed it (8), nor in the free-chemistry training models of reference (11). The omission is the field's standard, not ours.</w:t>
       </w:r>
     </w:p>
     <w:p>
@@ -2132,21 +2210,21 @@
     </w:p>
     <w:p>
       <w:pPr>
-        <w:pStyle w:val="Heading1"/>
+        <w:pStyle w:val="Heading2"/>
       </w:pPr>
       <w:r>
         <w:rPr>
           <w:b/>
           <w:i w:val="0"/>
         </w:rPr>
-        <w:t xml:space="preserve">5. </w:t>
+        <w:t xml:space="preserve">3.3 </w:t>
       </w:r>
       <w:r>
         <w:rPr>
-          <w:b/>
-          <w:i w:val="0"/>
+          <w:b w:val="0"/>
+          <w:i/>
         </w:rPr>
-        <w:t>Tier 1</w:t>
+        <w:t>Tier 1, where triage would happen</w:t>
       </w:r>
     </w:p>
     <w:p>
@@ -2218,7 +2296,7 @@
           <w:b w:val="0"/>
           <w:i w:val="0"/>
         </w:rPr>
-        <w:t>Everything in Section 3 is a Tier-3 statement. Triage would happen at Tier 1, on seven numbers per planet, so the map was computed again there (Table 2, Figure 4a) with a screen of the same design trained on the seven-point spectra: 88.7 % on clean spectra, 84.1 % at the tier's SNR of seven.</w:t>
+        <w:t>Everything in Section 3.1 is a Tier-3 statement. Triage would happen at Tier 1, on seven numbers per planet, so the map was computed again there (Table 2, Figure 4a) with a screen of the same design trained on the seven-point spectra: 88.7 % on clean spectra, 84.1 % at the tier's SNR of seven.</w:t>
       </w:r>
     </w:p>
     <w:p>
@@ -3185,24 +3263,24 @@
           <w:b w:val="0"/>
           <w:i w:val="0"/>
         </w:rPr>
-        <w:t>The mission's real targets sharpen the picture (Figure 4b). Of the 965 known planets in the Mission Candidate Sample [3], 57 % lie inside the training grid's bulk-parameter box; 29 % exceed its 300 M⊕ mass cap, 12 % orbit stars larger than 1.7 R☉ and 9 % are cooler than 500 K. Rendered with their real hosts, radii, masses and temperatures, C/O drawn as in the grid, and noise set by the mission's own Tier-2 definition (SNR 7 on the five-scale-height modulation after the catalogue's number of transits, with the ExoSim 2 shape), the clean-trained screen scores 94.2 % at Tier-3 binning, 93.1 % at Tier 2 and 79.2 % at Tier 1, where M-dwarf hosts sit at 60 %. The M-dwarf deficit appears with no spots at all: it is the cool, small planets around M dwarfs, in the 500–1,000 K band where the label is hardest, not the star. Planets outside the box score no worse than those inside, so the box edge is not where the screen breaks. The achieved signal-to-noise on the planets' real amplitudes under this convention is 15.6 at the median, so the grid's SNR-15 convention is close to Tier-2 reality for this population. The distance-based decline rules, fixed on grid data, would decline 27–30 % of the real targets under the mission's noise definition against 9–11 % under the grid's: they respond to the noise convention, which is the behaviour Section 4 relies on and a warning for deploying them across simulators.</w:t>
+        <w:t>The mission's real targets sharpen the picture (Figure 4b). Of the 965 known planets in the Mission Candidate Sample (3), 57 % lie inside the training grid's bulk-parameter box; 29 % exceed its 300 M⊕ mass cap, 12 % orbit stars larger than 1.7 R☉ and 9 % are cooler than 500 K. Rendered with their real hosts, radii, masses and temperatures, C/O drawn as in the grid, and noise set by the mission's own Tier-2 definition (SNR 7 on the five-scale-height modulation after the catalogue's number of transits, with the ExoSim 2 shape), the clean-trained screen scores 94.2 % at Tier-3 binning, 93.1 % at Tier 2 and 79.2 % at Tier 1, where M-dwarf hosts sit at 60 %. The M-dwarf deficit appears with no spots at all: it is the cool, small planets around M dwarfs, in the 500–1,000 K band where the label is hardest, not the star. Planets outside the box score no worse than those inside, so the box edge is not where the screen breaks. The achieved signal-to-noise on the planets' real amplitudes under this convention is 15.6 at the median, so the grid's SNR-15 convention is close to Tier-2 reality for this population. The distance-based decline rules, fixed on grid data, would decline 27–30 % of the real targets under the mission's noise definition against 9–11 % under the grid's: they respond to the noise convention, which is the behaviour Section 4 relies on and a warning for deploying them across simulators.</w:t>
       </w:r>
     </w:p>
     <w:p>
       <w:pPr>
-        <w:pStyle w:val="Heading1"/>
+        <w:pStyle w:val="Heading2"/>
       </w:pPr>
       <w:r>
         <w:rPr>
           <w:b/>
           <w:i w:val="0"/>
         </w:rPr>
-        <w:t xml:space="preserve">6. </w:t>
+        <w:t xml:space="preserve">3.4 </w:t>
       </w:r>
       <w:r>
         <w:rPr>
-          <w:b/>
-          <w:i w:val="0"/>
+          <w:b w:val="0"/>
+          <w:i/>
         </w:rPr>
         <w:t>What a mission should do</w:t>
       </w:r>
@@ -3316,19 +3394,19 @@
     </w:p>
     <w:p>
       <w:pPr>
-        <w:pStyle w:val="Heading1"/>
+        <w:pStyle w:val="Heading2"/>
       </w:pPr>
       <w:r>
         <w:rPr>
           <w:b/>
           <w:i w:val="0"/>
         </w:rPr>
-        <w:t xml:space="preserve">7. </w:t>
+        <w:t xml:space="preserve">3.5 </w:t>
       </w:r>
       <w:r>
         <w:rPr>
-          <w:b/>
-          <w:i w:val="0"/>
+          <w:b w:val="0"/>
+          <w:i/>
         </w:rPr>
         <w:t>Limitations and what was not found</w:t>
       </w:r>
@@ -3354,7 +3432,62 @@
           <w:b w:val="0"/>
           <w:i w:val="0"/>
         </w:rPr>
-        <w:t>Four pre-registered expectations were not met and are reported as such: the randomized grid reaches 31–83 % of the single-axis ceilings, not ≥ 90 %; compound mismatches are sub-additive, not super-additive; the omitted species cost the molecule-presence screen under a point, not five; and the divergence of the two noise simulators' shapes on cool hosts costs nothing. A rule from our own earlier work — that what augmentation can repair is set by how many values a mismatch draws per spectrum — did not survive measurement against the oracle ceilings: augmentation recovers essentially all recoverable loss on every axis, and the apparent rule was an artefact of dividing by clean accuracy. It is withdrawn. The inversion of confidence and distance on novel physics reproduces a known result of the failure-detection literature [35] rather than adding to it, and the M-dwarf concentration of contamination loss is expected physics [21].</w:t>
+        <w:t>Four pre-registered expectations were not met and are reported as such: the randomized grid reaches 31–83 % of the single-axis ceilings, not ≥ 90 %; compound mismatches are sub-additive, not super-additive; the omitted species cost the molecule-presence screen under a point, not five; and the divergence of the two noise simulators' shapes on cool hosts costs nothing. A rule from our own earlier work — that what augmentation can repair is set by how many values a mismatch draws per spectrum — did not survive measurement against the oracle ceilings: augmentation recovers essentially all recoverable loss on every axis, and the apparent rule was an artefact of dividing by clean accuracy. It is withdrawn. The inversion of confidence and distance on novel physics reproduces a known result of the failure-detection literature (35) rather than adding to it, and the M-dwarf concentration of contamination loss is expected physics (21).</w:t>
+      </w:r>
+    </w:p>
+    <w:p>
+      <w:pPr>
+        <w:pStyle w:val="Heading1"/>
+      </w:pPr>
+      <w:r>
+        <w:rPr>
+          <w:b/>
+          <w:i w:val="0"/>
+        </w:rPr>
+        <w:t xml:space="preserve">4. </w:t>
+      </w:r>
+      <w:r>
+        <w:rPr>
+          <w:b/>
+          <w:i w:val="0"/>
+        </w:rPr>
+        <w:t>Conclusion</w:t>
+      </w:r>
+    </w:p>
+    <w:p>
+      <w:pPr>
+        <w:jc w:val="both"/>
+      </w:pPr>
+      <w:r>
+        <w:rPr>
+          <w:b w:val="0"/>
+          <w:i w:val="0"/>
+        </w:rPr>
+        <w:t>A machine-learning screen trained on simulated Ariel spectra was tested on spectra whose physics differed from its simulator, for the consortium's own Tier-1 design and for a tuned carbon-rich screen, with one procedure that measured for each mismatch the loss, its irreducible part, what a randomized training grid absorbed, whether a decline rule flagged the errors, and what removed the loss. Modelled mismatch was largely absorbed and its residual was irreducible information loss; disequilibrium chemistry raised the carbon-rich screen's accuracy; and physics the simulator omitted — HCN and C₂H₂, present in carbon-rich atmospheres and absent from the field's standard training grid — put the carbon-rich screen at chance on carbon-rich planets with confident probabilities, was absorbed by nothing, was detected only by distance-based novelty scores, and was repaired only by adding the species to the forward model, while leaving a molecule-presence screen untouched. At the Tier-1 binning at which triage would occur, randomization still helped, no decline rule worked, and most of every serious loss was unrecoverable by any training. A screen validated only on the simulator that built it has not been validated; the procedure released here makes the validation that is possible before launch reproducible on any screen.</w:t>
+      </w:r>
+    </w:p>
+    <w:p>
+      <w:pPr>
+        <w:pStyle w:val="Heading1"/>
+      </w:pPr>
+      <w:r>
+        <w:rPr>
+          <w:b/>
+          <w:i w:val="0"/>
+        </w:rPr>
+        <w:t>Acknowledgements</w:t>
+      </w:r>
+    </w:p>
+    <w:p>
+      <w:pPr>
+        <w:jc w:val="both"/>
+      </w:pPr>
+      <w:r>
+        <w:rPr>
+          <w:b w:val="0"/>
+          <w:i w:val="0"/>
+        </w:rPr>
+        <w:t>Computations used open-source software (MultiREx, TauREx 3, FastChem, Exo-Transmit, ExoSim 2, scikit-learn, XGBoost) and public data (the ExoMolOP tables, the PHOENIX stellar atlas, the Ariel Mission Candidate Sample). No financial support was received.</w:t>
       </w:r>
     </w:p>
     <w:p>
@@ -3430,7 +3563,7 @@
           <w:b w:val="0"/>
           <w:i w:val="0"/>
         </w:rPr>
-        <w:t>The rebuild follows ref. [6] §II.2 and §II.5. Deviations: MultiREx/TauREx 3 with Exo-Transmit tables in place of TauREx 3 with ExoMol k-tables; the ExoSim 2 noise shape scaled to the Tier-1 requirement per target in place of ArielRad's Tier-1 noise; the 965 known planets of the 2026 candidate list in place of their 1,000 (which included TESS predictions); training spectra noised once rather than resampled. Reproduction at the 10⁻⁴ threshold (their Table 6 in parentheses): CH₄ 70–72 (82–87), H₂O 63–69 (71–78), CO₂ 60 (79–83), NH₃ 76–78 (82–87) %; at half the requirement noise NH₃ 82 and CH₄ 78. Mismatch costs on their screen at the requirement noise, mean over the four classifiers: haze 3 × 10⁷ m⁻³ −8 to −17, spots 20 % −6 to −13, cloud deck at 10² Pa −6 to −16, noise doubled −5 to −8, HCN + C₂H₂ at 10⁻⁷–10⁻⁴ −0.2 to −1.1 points. Decline rules on their screen: ensemble disagreement across the four classifiers keeps ~100 % of planets under haze (all four agree on the wrong answer), while the k-nearest-neighbour distance declines 97 % — the same confidence-versus-distance split as on ours, with the distance rule acting as a population alarm rather than a per-planet fix.</w:t>
+        <w:t>The rebuild follows reference (6) §II.2 and §II.5. Deviations: MultiREx/TauREx 3 with Exo-Transmit tables in place of TauREx 3 with ExoMol k-tables; the ExoSim 2 noise shape scaled to the Tier-1 requirement per target in place of ArielRad's Tier-1 noise; the 965 known planets of the 2026 candidate list in place of their 1,000 (which included TESS predictions); training spectra noised once rather than resampled. Reproduction at the 10⁻⁴ threshold (their Table 6 in parentheses): CH₄ 70–72 (82–87), H₂O 63–69 (71–78), CO₂ 60 (79–83), NH₃ 76–78 (82–87) %; at half the requirement noise NH₃ 82 and CH₄ 78. Mismatch costs on their screen at the requirement noise, mean over the four classifiers: haze 3 × 10⁷ m⁻³ −8 to −17, spots 20 % −6 to −13, cloud deck at 10² Pa −6 to −16, noise doubled −5 to −8, HCN + C₂H₂ at 10⁻⁷–10⁻⁴ −0.2 to −1.1 points. Decline rules on their screen: ensemble disagreement across the four classifiers keeps ~100 % of planets under haze (all four agree on the wrong answer), while the k-nearest-neighbour distance declines 97 % — the same confidence-versus-distance split as on ours, with the distance rule acting as a population alarm rather than a per-planet fix.</w:t>
       </w:r>
     </w:p>
     <w:p>
@@ -3680,7 +3813,7 @@
           <w:b w:val="0"/>
           <w:i w:val="0"/>
         </w:rPr>
-        <w:t>Tinetti, G., et al. (2018). A chemical survey of exoplanets with ARIEL. Experimental Astronomy, 46, 135–209. https://doi.org/10.1007/s10686-018-9598-x</w:t>
+        <w:t>Tinetti G, Drossart P, Eccleston P, et al. A chemical survey of exoplanets with ARIEL. Exp Astron, 46: 135-209, 2018. https://doi.org/10.1007/s10686-018-9598-x</w:t>
       </w:r>
     </w:p>
     <w:p>
@@ -3695,7 +3828,7 @@
           <w:b w:val="0"/>
           <w:i w:val="0"/>
         </w:rPr>
-        <w:t>Edwards, B., Mugnai, L., Tinetti, G., Pascale, E., &amp; Sarkar, S. (2019). An updated study of potential targets for Ariel. The Astronomical Journal, 157, 242. https://doi.org/10.3847/1538-3881/ab1cb9</w:t>
+        <w:t>Edwards B, Mugnai L, Tinetti G, Pascale E, Sarkar S. An updated study of potential targets for Ariel. Astron J, 157: 242, 2019. https://doi.org/10.3847/1538-3881/ab1cb9</w:t>
       </w:r>
     </w:p>
     <w:p>
@@ -3710,7 +3843,7 @@
           <w:b w:val="0"/>
           <w:i w:val="0"/>
         </w:rPr>
-        <w:t>Edwards, B., &amp; Tinetti, G. (2022). The Ariel target list: the impact of TESS and the potential for characterizing multiple planets within a system. The Astronomical Journal, 164, 15. https://doi.org/10.3847/1538-3881/ac6bf9</w:t>
+        <w:t>Edwards B, Tinetti G. The Ariel target list: the impact of TESS and the potential for characterizing multiple planets within a system. Astron J, 164: 15, 2022. https://doi.org/10.3847/1538-3881/ac6bf9</w:t>
       </w:r>
     </w:p>
     <w:p>
@@ -3725,7 +3858,7 @@
           <w:b w:val="0"/>
           <w:i w:val="0"/>
         </w:rPr>
-        <w:t>Mugnai, L. V., Pascale, E., Edwards, B., Papageorgiou, A., &amp; Sarkar, S. (2020). ArielRad: the Ariel radiometric model. Experimental Astronomy, 50, 303–328. https://doi.org/10.1007/s10686-020-09676-7</w:t>
+        <w:t>Mugnai LV, Pascale E, Edwards B, Papageorgiou A, Sarkar S. ArielRad: the Ariel radiometric model. Exp Astron, 50: 303-328, 2020. https://doi.org/10.1007/s10686-020-09676-7</w:t>
       </w:r>
     </w:p>
     <w:p>
@@ -3740,7 +3873,7 @@
           <w:b w:val="0"/>
           <w:i w:val="0"/>
         </w:rPr>
-        <w:t>Radica, M., et al. (2026). On the information content of Ariel transmission spectra: reassessing the tier system. arXiv:2604.07598.</w:t>
+        <w:t>Radica M, et al. On the information content of Ariel transmission spectra: reassessing the tier system. arXiv, 2604.07598, 2026. https://doi.org/10.48550/arXiv.2604.07598</w:t>
       </w:r>
     </w:p>
     <w:p>
@@ -3755,7 +3888,7 @@
           <w:b w:val="0"/>
           <w:i w:val="0"/>
         </w:rPr>
-        <w:t>Mugnai, L. V., Al-Refaie, A., Bocchieri, A., Changeat, Q., Pascale, E., &amp; Tinetti, G. (2021). Alfnoor: assessing the information content of Ariel's low-resolution spectra with planetary population studies. The Astronomical Journal, 162, 288. https://doi.org/10.3847/1538-3881/ac2e92</w:t>
+        <w:t>Mugnai LV, Al-Refaie A, Bocchieri A, Changeat Q, Pascale E, Tinetti G. Alfnoor: assessing the information content of Ariel's low-resolution spectra with planetary population studies. Astron J, 162: 288, 2021. https://doi.org/10.3847/1538-3881/ac2e92</w:t>
       </w:r>
     </w:p>
     <w:p>
@@ -3770,7 +3903,7 @@
           <w:b w:val="0"/>
           <w:i w:val="0"/>
         </w:rPr>
-        <w:t>Changeat, Q., &amp; Yip, K. H. (2023). ESA-Ariel Data Challenge NeurIPS 2022: introduction to exo-atmospheric studies and presentation of the Atmospheric Big Challenge (ABC) database. RAS Techniques and Instruments, 2, 45–61. https://doi.org/10.1093/rasti/rzad001</w:t>
+        <w:t>Changeat Q, Yip KH. ESA-Ariel Data Challenge NeurIPS 2022: introduction to exo-atmospheric studies and presentation of the Atmospheric Big Challenge (ABC) database. RAS Tech Instrum, 2: 45-61, 2023. https://doi.org/10.1093/rasti/rzad001</w:t>
       </w:r>
     </w:p>
     <w:p>
@@ -3785,7 +3918,7 @@
           <w:b w:val="0"/>
           <w:i w:val="0"/>
         </w:rPr>
-        <w:t>Aubin, M., et al. (2023). Simulation-based inference for exoplanet atmospheric retrieval: insights from winning the Ariel Data Challenge 2023 using normalizing flows. arXiv:2309.09337.</w:t>
+        <w:t>Aubin M, et al. Simulation-based inference for exoplanet atmospheric retrieval: insights from winning the Ariel Data Challenge 2023 using normalizing flows. arXiv, 2309.09337, 2023. https://doi.org/10.48550/arXiv.2309.09337</w:t>
       </w:r>
     </w:p>
     <w:p>
@@ -3800,7 +3933,7 @@
           <w:b w:val="0"/>
           <w:i w:val="0"/>
         </w:rPr>
-        <w:t>Yip, K. H., et al. (2023). Lessons learned from the 1st Ariel machine learning challenge. Proceedings of Machine Learning Research, 220.</w:t>
+        <w:t>Yip KH, Changeat Q, Nikolaou N, et al. Lessons learned from the 1st Ariel machine learning challenge. Proc Mach Learn Res, 220, 2023. https://proceedings.mlr.press/v220/</w:t>
       </w:r>
     </w:p>
     <w:p>
@@ -3815,7 +3948,7 @@
           <w:b w:val="0"/>
           <w:i w:val="0"/>
         </w:rPr>
-        <w:t>Yakubu, M., &amp; Jude, V. O. (2026). Machine learning and deep learning for exoplanet detection and atmospheric characterization with JWST and the upcoming Ariel mission. arXiv:2606.23766.</w:t>
+        <w:t>Yakubu M, Jude VO. Machine learning and deep learning for exoplanet detection and atmospheric characterization with JWST and the upcoming Ariel mission. arXiv, 2606.23766, 2026. https://doi.org/10.48550/arXiv.2606.23766</w:t>
       </w:r>
     </w:p>
     <w:p>
@@ -3830,7 +3963,7 @@
           <w:b w:val="0"/>
           <w:i w:val="0"/>
         </w:rPr>
-        <w:t>Ardévol Martínez, F., Min, M., Kamp, I., &amp; Palmer, P. I. (2022). Convolutional neural networks as an alternative to Bayesian retrievals for interpreting exoplanet transmission spectra. Astronomy &amp; Astrophysics, 662, A108. https://doi.org/10.1051/0004-6361/202142976</w:t>
+        <w:t>Ardévol Martínez F, Min M, Kamp I, Palmer PI. Convolutional neural networks as an alternative to Bayesian retrievals for interpreting exoplanet transmission spectra. Astron Astrophys, 662: A108, 2022. https://doi.org/10.1051/0004-6361/202142976</w:t>
       </w:r>
     </w:p>
     <w:p>
@@ -3845,7 +3978,7 @@
           <w:b w:val="0"/>
           <w:i w:val="0"/>
         </w:rPr>
-        <w:t>Márquez-Neila, P., Fisher, C., Sznitman, R., &amp; Heng, K. (2018). Supervised machine learning for analysing spectra of exoplanetary atmospheres. Nature Astronomy, 2, 719–724. https://doi.org/10.1038/s41550-018-0504-2</w:t>
+        <w:t>Márquez-Neila P, Fisher C, Sznitman R, Heng K. Supervised machine learning for analysing spectra of exoplanetary atmospheres. Nat Astron, 2: 719-724, 2018. https://doi.org/10.1038/s41550-018-0504-2</w:t>
       </w:r>
     </w:p>
     <w:p>
@@ -3860,7 +3993,7 @@
           <w:b w:val="0"/>
           <w:i w:val="0"/>
         </w:rPr>
-        <w:t>Nixon, M. C., &amp; Madhusudhan, N. (2020). Assessment of supervised machine learning for atmospheric retrieval of exoplanets. Monthly Notices of the Royal Astronomical Society, 496, 269–281. https://doi.org/10.1093/mnras/staa1150</w:t>
+        <w:t>Nixon MC, Madhusudhan N. Assessment of supervised machine learning for atmospheric retrieval of exoplanets. Mon Not R Astron Soc, 496: 269-281, 2020. https://doi.org/10.1093/mnras/staa1150</w:t>
       </w:r>
     </w:p>
     <w:p>
@@ -3875,7 +4008,7 @@
           <w:b w:val="0"/>
           <w:i w:val="0"/>
         </w:rPr>
-        <w:t>Vasist, M., Rozet, F., Absil, O., Mollière, P., Nasedkin, E., &amp; Louppe, G. (2023). Neural posterior estimation for exoplanetary atmospheric retrieval. Astronomy &amp; Astrophysics, 672, A147. https://doi.org/10.1051/0004-6361/202245263</w:t>
+        <w:t>Vasist M, Rozet F, Absil O, Mollière P, Nasedkin E, Louppe G. Neural posterior estimation for exoplanetary atmospheric retrieval. Astron Astrophys, 672: A147, 2023. https://doi.org/10.1051/0004-6361/202245263</w:t>
       </w:r>
     </w:p>
     <w:p>
@@ -3890,7 +4023,7 @@
           <w:b w:val="0"/>
           <w:i w:val="0"/>
         </w:rPr>
-        <w:t>Gebhard, T. D., et al. (2025). Flow matching for atmospheric retrieval of exoplanets: where reliability meets adaptive noise levels. Astronomy &amp; Astrophysics, 693, A42. https://doi.org/10.1051/0004-6361/202451861</w:t>
+        <w:t>Gebhard TD, Wildberger J, Dax M, et al. Flow matching for atmospheric retrieval of exoplanets: where reliability meets adaptive noise levels. Astron Astrophys, 693: A42, 2025. https://doi.org/10.1051/0004-6361/202451861</w:t>
       </w:r>
     </w:p>
     <w:p>
@@ -3905,7 +4038,7 @@
           <w:b w:val="0"/>
           <w:i w:val="0"/>
         </w:rPr>
-        <w:t>Madhusudhan, N. (2012). C/O ratio as a dimension for characterizing exoplanetary atmospheres. The Astrophysical Journal, 758, 36. https://doi.org/10.1088/0004-637X/758/1/36</w:t>
+        <w:t>Madhusudhan N. C/O ratio as a dimension for characterizing exoplanetary atmospheres. Astrophys J, 758: 36, 2012. https://doi.org/10.1088/0004-637X/758/1/36</w:t>
       </w:r>
     </w:p>
     <w:p>
@@ -3920,7 +4053,7 @@
           <w:b w:val="0"/>
           <w:i w:val="0"/>
         </w:rPr>
-        <w:t>Moses, J. I., Madhusudhan, N., Visscher, C., &amp; Freedman, R. S. (2013). Chemical consequences of the C/O ratio on hot Jupiters: examples from WASP-12b, CoRoT-2b, XO-1b, and HD 189733b. The Astrophysical Journal, 763, 25. https://doi.org/10.1088/0004-637X/763/1/25</w:t>
+        <w:t>Moses JI, Madhusudhan N, Visscher C, Freedman RS. Chemical consequences of the C/O ratio on hot Jupiters: examples from WASP-12b, CoRoT-2b, XO-1b, and HD 189733b. Astrophys J, 763: 25, 2013. https://doi.org/10.1088/0004-637X/763/1/25</w:t>
       </w:r>
     </w:p>
     <w:p>
@@ -3935,7 +4068,7 @@
           <w:b w:val="0"/>
           <w:i w:val="0"/>
         </w:rPr>
-        <w:t>Zahnle, K. J., &amp; Marley, M. S. (2014). Methane, carbon monoxide, and ammonia in brown dwarfs and self-luminous giant planets. The Astrophysical Journal, 797, 41. https://doi.org/10.1088/0004-637X/797/1/41</w:t>
+        <w:t>Zahnle KJ, Marley MS. Methane, carbon monoxide, and ammonia in brown dwarfs and self-luminous giant planets. Astrophys J, 797: 41, 2014. https://doi.org/10.1088/0004-637X/797/1/41</w:t>
       </w:r>
     </w:p>
     <w:p>
@@ -3950,7 +4083,7 @@
           <w:b w:val="0"/>
           <w:i w:val="0"/>
         </w:rPr>
-        <w:t>Stock, J. W., Kitzmann, D., Patzer, A. B. C., &amp; Sedlmayr, E. (2018). FastChem: a computer program for efficient complex chemical equilibrium calculations in the neutral/ionized gas phase with applications to stellar and planetary atmospheres. Monthly Notices of the Royal Astronomical Society, 479, 865–874. https://doi.org/10.1093/mnras/sty1531</w:t>
+        <w:t>Stock JW, Kitzmann D, Patzer ABC, Sedlmayr E. FastChem: a computer program for efficient complex chemical equilibrium calculations in the neutral/ionized gas phase with applications to stellar and planetary atmospheres. Mon Not R Astron Soc, 479: 865-874, 2018. https://doi.org/10.1093/mnras/sty1531</w:t>
       </w:r>
     </w:p>
     <w:p>
@@ -3965,7 +4098,7 @@
           <w:b w:val="0"/>
           <w:i w:val="0"/>
         </w:rPr>
-        <w:t>Kawashima, Y., &amp; Min, M. (2021). Implementation of disequilibrium chemistry to spectral retrieval code ARCiS and application to 16 exoplanet transmission spectra. Astronomy &amp; Astrophysics, 656, A90. https://doi.org/10.1051/0004-6361/202141548</w:t>
+        <w:t>Kawashima Y, Min M. Implementation of disequilibrium chemistry to spectral retrieval code ARCiS and application to 16 exoplanet transmission spectra. Astron Astrophys, 656: A90, 2021. https://doi.org/10.1051/0004-6361/202141548</w:t>
       </w:r>
     </w:p>
     <w:p>
@@ -3980,7 +4113,7 @@
           <w:b w:val="0"/>
           <w:i w:val="0"/>
         </w:rPr>
-        <w:t>Rackham, B. V., Apai, D., &amp; Giampapa, M. S. (2018). The transit light source effect: false spectral features and incorrect densities for M-dwarf transiting planets. The Astrophysical Journal, 853, 122. https://doi.org/10.3847/1538-4357/aaa08c</w:t>
+        <w:t>Rackham BV, Apai D, Giampapa MS. The transit light source effect: false spectral features and incorrect densities for M-dwarf transiting planets. Astrophys J, 853: 122, 2018. https://doi.org/10.3847/1538-4357/aaa08c</w:t>
       </w:r>
     </w:p>
     <w:p>
@@ -3995,7 +4128,7 @@
           <w:b w:val="0"/>
           <w:i w:val="0"/>
         </w:rPr>
-        <w:t>Lee, J.-M., Heng, K., &amp; Irwin, P. G. J. (2013). Atmospheric retrieval analysis of the directly imaged exoplanet HR 8799b. The Astrophysical Journal, 778, 97. https://doi.org/10.1088/0004-637X/778/2/97</w:t>
+        <w:t>Lee J-M, Heng K, Irwin PGJ. Atmospheric retrieval analysis of the directly imaged exoplanet HR 8799b. Astrophys J, 778: 97, 2013. https://doi.org/10.1088/0004-637X/778/2/97</w:t>
       </w:r>
     </w:p>
     <w:p>
@@ -4010,7 +4143,7 @@
           <w:b w:val="0"/>
           <w:i w:val="0"/>
         </w:rPr>
-        <w:t>Al-Refaie, A. F., Changeat, Q., Waldmann, I. P., &amp; Tinetti, G. (2021). TauREx 3: a fast, dynamic, and extendable framework for retrievals. The Astrophysical Journal, 917, 37. https://doi.org/10.3847/1538-4357/ac0252</w:t>
+        <w:t>Al-Refaie AF, Changeat Q, Waldmann IP, Tinetti G. TauREx 3: a fast, dynamic, and extendable framework for retrievals. Astrophys J, 917: 37, 2021. https://doi.org/10.3847/1538-4357/ac0252</w:t>
       </w:r>
     </w:p>
     <w:p>
@@ -4025,7 +4158,7 @@
           <w:b w:val="0"/>
           <w:i w:val="0"/>
         </w:rPr>
-        <w:t>Duque-Castaño, D. S., Zuluaga, J. I., &amp; Flor-Torres, L. (2025). Machine-assisted classification of potential biosignatures in Earth-like exoplanets using low signal-to-noise ratio transmission spectra. Monthly Notices of the Royal Astronomical Society, 539, 1528–1552.</w:t>
+        <w:t>Duque-Castaño DS, Zuluaga JI, Flor-Torres L. Machine-assisted classification of potential biosignatures in Earth-like exoplanets using low signal-to-noise ratio transmission spectra. Mon Not R Astron Soc, 539: 1528-1552, 2025. https://doi.org/10.1093/mnras/staf605</w:t>
       </w:r>
     </w:p>
     <w:p>
@@ -4040,7 +4173,7 @@
           <w:b w:val="0"/>
           <w:i w:val="0"/>
         </w:rPr>
-        <w:t>Kempton, E. M.-R., Lupu, R., Owusu-Asare, A., Slough, P., &amp; Cale, B. (2017). Exo-Transmit: an open-source code for calculating transmission spectra for exoplanet atmospheres of varied composition. Publications of the Astronomical Society of the Pacific, 129, 044402. https://doi.org/10.1088/1538-3873/aa61ef</w:t>
+        <w:t>Kempton EM-R, Lupu R, Owusu-Asare A, Slough P, Cale B. Exo-Transmit: an open-source code for calculating transmission spectra for exoplanet atmospheres of varied composition. Publ Astron Soc Pac, 129: 044402, 2017. https://doi.org/10.1088/1538-3873/aa61ef</w:t>
       </w:r>
     </w:p>
     <w:p>
@@ -4055,7 +4188,7 @@
           <w:b w:val="0"/>
           <w:i w:val="0"/>
         </w:rPr>
-        <w:t>Chubb, K. L., et al. (2021). The ExoMolOP database: cross sections and k-tables for molecules of interest in high-temperature exoplanet atmospheres. Astronomy &amp; Astrophysics, 646, A21. https://doi.org/10.1051/0004-6361/202038350</w:t>
+        <w:t>Chubb KL, Rocchetto M, Yurchenko SN, et al. The ExoMolOP database: cross sections and k-tables for molecules of interest in high-temperature exoplanet atmospheres. Astron Astrophys, 646: A21, 2021. https://doi.org/10.1051/0004-6361/202038350</w:t>
       </w:r>
     </w:p>
     <w:p>
@@ -4070,7 +4203,7 @@
           <w:b w:val="0"/>
           <w:i w:val="0"/>
         </w:rPr>
-        <w:t>Mugnai, L. V., Bocchieri, A., Pascale, E., Lorenzani, A., &amp; Papageorgiou, A. (2025). ExoSim 2: the new exoplanet observation simulator applied to the Ariel space mission. Experimental Astronomy, 59, 9. https://doi.org/10.1007/s10686-024-09976-2</w:t>
+        <w:t>Mugnai LV, Bocchieri A, Pascale E, Lorenzani A, Papageorgiou A. ExoSim 2: the new exoplanet observation simulator applied to the Ariel space mission. Exp Astron, 59: 9, 2025. https://doi.org/10.1007/s10686-024-09976-2</w:t>
       </w:r>
     </w:p>
     <w:p>
@@ -4085,7 +4218,7 @@
           <w:b w:val="0"/>
           <w:i w:val="0"/>
         </w:rPr>
-        <w:t>Tobin, J., Fong, R., Ray, A., Schneider, J., Zaremba, W., &amp; Abbeel, P. (2017). Domain randomization for transferring deep neural networks from simulation to the real world. IEEE/RSJ International Conference on Intelligent Robots and Systems. arXiv:1703.06907.</w:t>
+        <w:t>Tobin J, Fong R, Ray A, Schneider J, Zaremba W, Abbeel P. Domain randomization for transferring deep neural networks from simulation to the real world. Proc IEEE/RSJ Int Conf Intell Robots Syst, 23-30, 2017. https://doi.org/10.1109/IROS.2017.8202133</w:t>
       </w:r>
     </w:p>
     <w:p>
@@ -4100,7 +4233,7 @@
           <w:b w:val="0"/>
           <w:i w:val="0"/>
         </w:rPr>
-        <w:t>Bishop, C. M. (1995). Training with noise is equivalent to Tikhonov regularization. Neural Computation, 7, 108–116. https://doi.org/10.1162/neco.1995.7.1.108</w:t>
+        <w:t>Bishop CM. Training with noise is equivalent to Tikhonov regularization. Neural Comput, 7: 108-116, 1995. https://doi.org/10.1162/neco.1995.7.1.108</w:t>
       </w:r>
     </w:p>
     <w:p>
@@ -4115,7 +4248,7 @@
           <w:b w:val="0"/>
           <w:i w:val="0"/>
         </w:rPr>
-        <w:t>Hendrycks, D., &amp; Gimpel, K. (2017). A baseline for detecting misclassified and out-of-distribution examples in neural networks. International Conference on Learning Representations. arXiv:1610.02136.</w:t>
+        <w:t>Hendrycks D, Gimpel K. A baseline for detecting misclassified and out-of-distribution examples in neural networks. Int Conf Learn Represent, 2017. https://doi.org/10.48550/arXiv.1610.02136</w:t>
       </w:r>
     </w:p>
     <w:p>
@@ -4130,7 +4263,7 @@
           <w:b w:val="0"/>
           <w:i w:val="0"/>
         </w:rPr>
-        <w:t>Lee, K., Lee, K., Lee, H., &amp; Shin, J. (2018). A simple unified framework for detecting out-of-distribution samples and adversarial attacks. Advances in Neural Information Processing Systems, 31. arXiv:1807.03888.</w:t>
+        <w:t>Lee K, Lee K, Lee H, Shin J. A simple unified framework for detecting out-of-distribution samples and adversarial attacks. Adv Neural Inf Process Syst, 31, 2018. https://doi.org/10.48550/arXiv.1807.03888</w:t>
       </w:r>
     </w:p>
     <w:p>
@@ -4145,7 +4278,7 @@
           <w:b w:val="0"/>
           <w:i w:val="0"/>
         </w:rPr>
-        <w:t>Sun, Y., Ming, Y., Zhu, X., &amp; Li, Y. (2022). Out-of-distribution detection with deep nearest neighbors. International Conference on Machine Learning. arXiv:2204.06507.</w:t>
+        <w:t>Sun Y, Ming Y, Zhu X, Li Y. Out-of-distribution detection with deep nearest neighbors. Proc Int Conf Mach Learn, 162: 20827-20840, 2022. https://doi.org/10.48550/arXiv.2204.06507</w:t>
       </w:r>
     </w:p>
     <w:p>
@@ -4160,7 +4293,7 @@
           <w:b w:val="0"/>
           <w:i w:val="0"/>
         </w:rPr>
-        <w:t>Lakshminarayanan, B., Pritzel, A., &amp; Blundell, C. (2017). Simple and scalable predictive uncertainty estimation using deep ensembles. Advances in Neural Information Processing Systems, 30. arXiv:1612.01474.</w:t>
+        <w:t>Lakshminarayanan B, Pritzel A, Blundell C. Simple and scalable predictive uncertainty estimation using deep ensembles. Adv Neural Inf Process Syst, 30, 2017. https://doi.org/10.48550/arXiv.1612.01474</w:t>
       </w:r>
     </w:p>
     <w:p>
@@ -4175,7 +4308,7 @@
           <w:b w:val="0"/>
           <w:i w:val="0"/>
         </w:rPr>
-        <w:t>Geifman, Y., &amp; El-Yaniv, R. (2017). Selective classification for deep neural networks. Advances in Neural Information Processing Systems, 30. arXiv:1705.08500.</w:t>
+        <w:t>Geifman Y, El-Yaniv R. Selective classification for deep neural networks. Adv Neural Inf Process Syst, 30, 2017. https://doi.org/10.48550/arXiv.1705.08500</w:t>
       </w:r>
     </w:p>
     <w:p>
@@ -4190,7 +4323,7 @@
           <w:b w:val="0"/>
           <w:i w:val="0"/>
         </w:rPr>
-        <w:t>Jaeger, P. F., Lüth, C. T., Klein, L., &amp; Bungert, T. J. (2023). A call to reflect on evaluation practices for failure detection in image classification. International Conference on Learning Representations. arXiv:2211.15259.</w:t>
+        <w:t>Jaeger PF, Lüth CT, Klein L, Bungert TJ. A call to reflect on evaluation practices for failure detection in image classification. Int Conf Learn Represent, 2023. https://doi.org/10.48550/arXiv.2211.15259</w:t>
       </w:r>
     </w:p>
     <w:p>
@@ -4205,7 +4338,7 @@
           <w:b w:val="0"/>
           <w:i w:val="0"/>
         </w:rPr>
-        <w:t>Angelopoulos, A. N., &amp; Bates, S. (2021). A gentle introduction to conformal prediction and distribution-free uncertainty quantification. arXiv:2107.07511.</w:t>
+        <w:t>Angelopoulos AN, Bates S. A gentle introduction to conformal prediction and distribution-free uncertainty quantification. arXiv, 2107.07511, 2021. https://doi.org/10.48550/arXiv.2107.07511</w:t>
       </w:r>
     </w:p>
     <w:p>
@@ -4220,7 +4353,7 @@
           <w:b w:val="0"/>
           <w:i w:val="0"/>
         </w:rPr>
-        <w:t>Schmitt, M., Bürkner, P.-C., Köthe, U., &amp; Radev, S. T. (2021). Detecting model misspecification in amortized Bayesian inference with neural networks. arXiv:2112.08866.</w:t>
+        <w:t>Schmitt M, Bürkner P-C, Köthe U, Radev ST. Detecting model misspecification in amortized Bayesian inference with neural networks. arXiv, 2112.08866, 2021. https://doi.org/10.48550/arXiv.2112.08866</w:t>
       </w:r>
     </w:p>
     <w:p>
@@ -4235,7 +4368,7 @@
           <w:b w:val="0"/>
           <w:i w:val="0"/>
         </w:rPr>
-        <w:t>Cannon, P., Ward, D., &amp; Schmon, S. M. (2022). Investigating the impact of model misspecification in neural simulation-based inference. arXiv:2209.01845.</w:t>
+        <w:t>Cannon P, Ward D, Schmon SM. Investigating the impact of model misspecification in neural simulation-based inference. arXiv, 2209.01845, 2022. https://doi.org/10.48550/arXiv.2209.01845</w:t>
       </w:r>
     </w:p>
     <w:p>
@@ -4250,7 +4383,7 @@
           <w:b w:val="0"/>
           <w:i w:val="0"/>
         </w:rPr>
-        <w:t>Barstow, J. K., Changeat, Q., Garland, R., Line, M. R., Rocchetto, M., &amp; Waldmann, I. P. (2020). A comparison of exoplanet spectroscopic retrieval tools. Monthly Notices of the Royal Astronomical Society, 493, 4884–4909. https://doi.org/10.1093/mnras/staa548</w:t>
+        <w:t>Barstow JK, Changeat Q, Garland R, Line MR, Rocchetto M, Waldmann IP. A comparison of exoplanet spectroscopic retrieval tools. Mon Not R Astron Soc, 493: 4884-4909, 2020. https://doi.org/10.1093/mnras/staa548</w:t>
       </w:r>
     </w:p>
     <w:p>
@@ -4265,7 +4398,7 @@
           <w:b w:val="0"/>
           <w:i w:val="0"/>
         </w:rPr>
-        <w:t>Chen, S., Dobriban, E., &amp; Lee, J. H. (2020). A group-theoretic framework for data augmentation. Journal of Machine Learning Research, 21(245), 1–71.</w:t>
+        <w:t>Chen S, Dobriban E, Lee JH. A group-theoretic framework for data augmentation. J Mach Learn Res, 21: 1-71, 2020. https://doi.org/10.48550/arXiv.1907.10905</w:t>
       </w:r>
     </w:p>
     <w:p>
@@ -4280,7 +4413,7 @@
           <w:b w:val="0"/>
           <w:i w:val="0"/>
         </w:rPr>
-        <w:t>Hendrycks, D., &amp; Dietterich, T. (2019). Benchmarking neural network robustness to common corruptions and perturbations. International Conference on Learning Representations. arXiv:1903.12261.</w:t>
+        <w:t>Hendrycks D, Dietterich T. Benchmarking neural network robustness to common corruptions and perturbations. Int Conf Learn Represent, 2019. https://doi.org/10.48550/arXiv.1903.12261</w:t>
       </w:r>
     </w:p>
     <w:p>
@@ -4295,7 +4428,7 @@
           <w:b w:val="0"/>
           <w:i w:val="0"/>
         </w:rPr>
-        <w:t>Freedman, R. S., Lustig-Yaeger, J., Fortney, J. J., Lupu, R. E., Marley, M. S., &amp; Lodders, K. (2014). Gaseous mean opacities for giant planet and ultracool dwarf atmospheres over a range of metallicities and temperatures. The Astrophysical Journal Supplement Series, 214, 25. https://doi.org/10.1088/0067-0049/214/2/25</w:t>
+        <w:t>Freedman RS, Lustig-Yaeger J, Fortney JJ, Lupu RE, Marley MS, Lodders K. Gaseous mean opacities for giant planet and ultracool dwarf atmospheres over a range of metallicities and temperatures. Astrophys J Suppl Ser, 214: 25, 2014. https://doi.org/10.1088/0067-0049/214/2/25</w:t>
       </w:r>
     </w:p>
     <w:p>
@@ -4310,7 +4443,7 @@
           <w:b w:val="0"/>
           <w:i w:val="0"/>
         </w:rPr>
-        <w:t>Lupu, R. E., et al. (2014). The atmospheres of Earthlike planets after giant impact events. The Astrophysical Journal, 784, 27. https://doi.org/10.1088/0004-637X/784/1/27</w:t>
+        <w:t>Lupu RE, Zahnle K, Marley MS, et al. The atmospheres of Earthlike planets after giant impact events. Astrophys J, 784: 27, 2014. https://doi.org/10.1088/0004-637X/784/1/27</w:t>
       </w:r>
     </w:p>
     <w:p>
@@ -4325,7 +4458,7 @@
           <w:b w:val="0"/>
           <w:i w:val="0"/>
         </w:rPr>
-        <w:t>Tibshirani, R. J., Foygel Barber, R., Candès, E. J., &amp; Ramdas, A. (2019). Conformal prediction under covariate shift. Advances in Neural Information Processing Systems, 32. arXiv:1904.06019.</w:t>
+        <w:t>Tibshirani RJ, Foygel Barber R, Candès EJ, Ramdas A. Conformal prediction under covariate shift. Adv Neural Inf Process Syst, 32, 2019. https://doi.org/10.48550/arXiv.1904.06019</w:t>
       </w:r>
     </w:p>
     <w:p>
@@ -4340,7 +4473,7 @@
           <w:b w:val="0"/>
           <w:i w:val="0"/>
         </w:rPr>
-        <w:t>Mugnai, L. V., et al. (2026). A public dataset of Ariel simulated observations for developing exoplanetary atmosphere data reduction pipelines. arXiv:2605.03719.</w:t>
+        <w:t>Mugnai LV, et al. A public dataset of Ariel simulated observations for developing exoplanetary atmosphere data reduction pipelines. arXiv, 2605.03719, 2026. https://doi.org/10.48550/arXiv.2605.03719</w:t>
       </w:r>
     </w:p>
     <w:p>
@@ -4355,7 +4488,7 @@
           <w:b w:val="0"/>
           <w:i w:val="0"/>
         </w:rPr>
-        <w:t>Chen, T., &amp; Guestrin, C. (2016). XGBoost: a scalable tree boosting system. Proceedings of the 22nd ACM SIGKDD International Conference on Knowledge Discovery and Data Mining, 785–794. https://doi.org/10.1145/2939672.2939785</w:t>
+        <w:t>Chen T, Guestrin C. XGBoost: a scalable tree boosting system. Proc 22nd ACM SIGKDD Int Conf Knowl Discov Data Min, 785-794, 2016. https://doi.org/10.1145/2939672.2939785</w:t>
       </w:r>
     </w:p>
     <w:p>
@@ -4370,7 +4503,7 @@
           <w:b w:val="0"/>
           <w:i w:val="0"/>
         </w:rPr>
-        <w:t>Pedregosa, F., et al. (2011). Scikit-learn: machine learning in Python. Journal of Machine Learning Research, 12, 2825–2830.</w:t>
+        <w:t>Pedregosa F, Varoquaux G, Gramfort A, et al. Scikit-learn: machine learning in Python. J Mach Learn Res, 12: 2825-2830, 2011. https://doi.org/10.48550/arXiv.1201.0490</w:t>
       </w:r>
     </w:p>
     <w:sectPr>

</xml_diff>

<commit_message>
Consortium-screen reproduction checks: split and transit correction change nothing, noise would have to be ~3x lower, CO2 never reproduces; note to authors drafted
</commit_message>
<xml_diff>
--- a/v3/jhss/manuscript.docx
+++ b/v3/jhss/manuscript.docx
@@ -237,7 +237,7 @@
           <w:b w:val="0"/>
           <w:i w:val="0"/>
         </w:rPr>
-        <w:t>The screen of reference (6) is reproduced from the text as literally as it allows, since its simulator wrapper is not public. Their training population (POP-III) takes the Ariel candidate list, repeats each planet four times, draws the atmospheric temperature uniformly in 0.7–1.05 of the planet's equilibrium temperature, the CH₄, H₂O, CO₂ and NH₃ abundances log-uniformly in 10⁻⁹–10⁻², and a grey cloud deck log-uniformly in 5 × 10²–10⁶ Pa, in an H₂/He atmosphere; their test population (POP-I) uses each planet once with abundances in 10⁻⁷–10⁻². Spectra are binned to the seven Tier-1 points (three photometric bands, one NIRSpec point, two AIRS-CH0 points, one AIRS-CH1 point) and scattered with the Tier-1 requirement noise. Each molecule is labelled present if its abundance exceeds 10⁻⁵, 10⁻⁴ or 10⁻³; inputs are normalised to zero mean and unit variance; the four classifiers are scikit-learn's k-nearest neighbours, multilayer perceptron, random forest and support-vector classifier at default settings (47). We use the 965 known planets of the current Mission Candidate Sample (3) as the planet list, our forward model (Section 2.2) in place of theirs, and the consortium simulator's noise shape (Section 2.3). At the 10⁻⁴ threshold our rebuild reaches CH₄ 70–72 %, H₂O 63–69 %, CO₂ 60 % and NH₃ 76–78 % against their 82–87, 71–78, 79–83 and 82–87 %; NH₃ and CH₄ reach their values within five points when the noise is halved, CO₂ does not at any noise level because its 4.3 µm band is diluted within the single 3.9–7.8 µm Tier-1 point of our layout. The deviations are listed in Appendix A. Where the rebuild falls short of their Table 6 we report the mismatch costs as differences from our own clean values.</w:t>
+        <w:t>The screen of reference (6) is reproduced from the text as literally as it allows, since its simulator wrapper is not public. Their training population (POP-III) takes the Ariel candidate list, repeats each planet four times, draws the atmospheric temperature uniformly in 0.7–1.05 of the planet's equilibrium temperature, the CH₄, H₂O, CO₂ and NH₃ abundances log-uniformly in 10⁻⁹–10⁻², and a grey cloud deck log-uniformly in 5 × 10²–10⁶ Pa, in an H₂/He atmosphere; their test population (POP-I) uses each planet once with abundances in 10⁻⁷–10⁻². Spectra are binned to the seven Tier-1 points (three photometric bands, one NIRSpec point, two AIRS-CH0 points, one AIRS-CH1 point) and scattered with the Tier-1 requirement noise. Each molecule is labelled present if its abundance exceeds 10⁻⁵, 10⁻⁴ or 10⁻³; inputs are normalised to zero mean and unit variance; the four classifiers are scikit-learn's k-nearest neighbours, multilayer perceptron, random forest and support-vector classifier at default settings (47). We use the 965 known planets of the current Mission Candidate Sample (3) as the planet list, our forward model (Section 2.2) in place of theirs, and the consortium simulator's noise shape (Section 2.3). At the 10⁻⁴ threshold our rebuild reaches CH₄ 70–72 %, H₂O 63–69 %, CO₂ 60 % and NH₃ 76–78 % against their 82–87, 71–78, 79–83 and 82–87 %; The shortfall is most likely ours: CH₄, H₂O and NH₃ reach their values when our noise is reduced to about a third, which points to the per-target noise (theirs comes from ArielRad after the integer number of transits each target needs; ours is set exactly at the requirement), while CO₂ does not reproduce at any noise level or with alternative placements of the AIRS-CH0 split, which points to the binning of its 4.3 µm band or to the opacity tables. The deviations and the checks are listed in Appendix A. Where the rebuild falls short of their Table 6 we report the mismatch costs as differences from our own clean values.</w:t>
       </w:r>
     </w:p>
     <w:p>
@@ -3563,7 +3563,7 @@
           <w:b w:val="0"/>
           <w:i w:val="0"/>
         </w:rPr>
-        <w:t>The rebuild follows reference (6) §II.2 and §II.5. Deviations: MultiREx/TauREx 3 with Exo-Transmit tables in place of TauREx 3 with ExoMol k-tables; the ExoSim 2 noise shape scaled to the Tier-1 requirement per target in place of ArielRad's Tier-1 noise; the 965 known planets of the 2026 candidate list in place of their 1,000 (which included TESS predictions); training spectra noised once rather than resampled. Reproduction at the 10⁻⁴ threshold (their Table 6 in parentheses): CH₄ 70–72 (82–87), H₂O 63–69 (71–78), CO₂ 60 (79–83), NH₃ 76–78 (82–87) %; at half the requirement noise NH₃ 82 and CH₄ 78. Mismatch costs on their screen at the requirement noise, mean over the four classifiers: haze 3 × 10⁷ m⁻³ −8 to −17, spots 20 % −6 to −13, cloud deck at 10² Pa −6 to −16, noise doubled −5 to −8, HCN + C₂H₂ at 10⁻⁷–10⁻⁴ −0.2 to −1.1 points. Decline rules on their screen: ensemble disagreement across the four classifiers keeps ~100 % of planets under haze (all four agree on the wrong answer), while the k-nearest-neighbour distance declines 97 % — the same confidence-versus-distance split as on ours, with the distance rule acting as a population alarm rather than a per-planet fix.</w:t>
+        <w:t>The rebuild follows reference (6) §II.2 and §II.5. Deviations: MultiREx/TauREx 3 with Exo-Transmit tables in place of TauREx 3 with ExoMol k-tables; the ExoSim 2 noise shape scaled to the Tier-1 requirement per target in place of ArielRad's Tier-1 noise; the 965 known planets of the 2026 candidate list in place of their 1,000 (which included TESS predictions); training spectra noised once rather than resampled. Reproduction at the 10⁻⁴ threshold (their Table 6 in parentheses): CH₄ 70–72 (82–87), H₂O 63–69 (71–78), CO₂ 60 (79–83), NH₃ 76–78 (82–87) %. Checks: moving the AIRS-CH0 split from 2.76 to 3.0 or 2.5 µm changes the four by at most 2 points; correcting the noise for the integer number of Tier-1 transits per target (a target needing N transits reaches the requirement with N − 0.5 on average) changes them by at most 1.4; scaling the noise to 0.75, 0.5, 0.35 and 0.25 of the requirement gives CH₄ 76, 78, 82, 86, H₂O 70, 72, 72, 86 and NH₃ 80, 82, 84, 61 %, so three of the four classifiers reach their published values at roughly a third of our noise, while CO₂ stays at the majority rate (60–62 %) until the noise is a quarter (71 %). Mismatch costs on their screen at the requirement noise, mean over the four classifiers: haze 3 × 10⁷ m⁻³ −8 to −17, spots 20 % −6 to −13, cloud deck at 10² Pa −6 to −16, noise doubled −5 to −8, HCN + C₂H₂ at 10⁻⁷–10⁻⁴ −0.2 to −1.1 points. Decline rules on their screen: ensemble disagreement across the four classifiers keeps ~100 % of planets under haze (all four agree on the wrong answer), while the k-nearest-neighbour distance declines 97 % — the same confidence-versus-distance split as on ours, with the distance rule acting as a population alarm rather than a per-planet fix.</w:t>
       </w:r>
     </w:p>
     <w:p>

</xml_diff>

<commit_message>
JHSS draft: zero-coverage cells rendered as 'declines all'
</commit_message>
<xml_diff>
--- a/v3/jhss/manuscript.docx
+++ b/v3/jhss/manuscript.docx
@@ -7525,23 +7525,23 @@
                 <w:i w:val="0"/>
                 <w:sz w:val="18"/>
               </w:rPr>
-              <w:t>nan (0 %; +nan)</w:t>
-            </w:r>
-          </w:p>
-        </w:tc>
-        <w:tc>
-          <w:tcPr>
-            <w:tcW w:type="dxa" w:w="1560"/>
-          </w:tcPr>
-          <w:p>
-            <w:r/>
-            <w:r>
-              <w:rPr>
-                <w:b w:val="0"/>
-                <w:i w:val="0"/>
-                <w:sz w:val="18"/>
-              </w:rPr>
-              <w:t>nan (0 %; +nan)</w:t>
+              <w:t>declines all</w:t>
+            </w:r>
+          </w:p>
+        </w:tc>
+        <w:tc>
+          <w:tcPr>
+            <w:tcW w:type="dxa" w:w="1560"/>
+          </w:tcPr>
+          <w:p>
+            <w:r/>
+            <w:r>
+              <w:rPr>
+                <w:b w:val="0"/>
+                <w:i w:val="0"/>
+                <w:sz w:val="18"/>
+              </w:rPr>
+              <w:t>declines all</w:t>
             </w:r>
           </w:p>
         </w:tc>

</xml_diff>

<commit_message>
Figure 1: oracle legend entry; rebuilt
</commit_message>
<xml_diff>
--- a/v3/jhss/manuscript.docx
+++ b/v3/jhss/manuscript.docx
@@ -1370,7 +1370,7 @@
       <w:r>
         <w:drawing>
           <wp:inline xmlns:a="http://schemas.openxmlformats.org/drawingml/2006/main" xmlns:pic="http://schemas.openxmlformats.org/drawingml/2006/picture">
-            <wp:extent cx="5669280" cy="3427559"/>
+            <wp:extent cx="5669280" cy="3319140"/>
             <wp:docPr id="1" name="Picture 1"/>
             <wp:cNvGraphicFramePr>
               <a:graphicFrameLocks noChangeAspect="1"/>
@@ -1391,7 +1391,7 @@
                   <pic:spPr>
                     <a:xfrm>
                       <a:off x="0" y="0"/>
-                      <a:ext cx="5669280" cy="3427559"/>
+                      <a:ext cx="5669280" cy="3319140"/>
                     </a:xfrm>
                     <a:prstGeom prst="rect"/>
                   </pic:spPr>

</xml_diff>

<commit_message>
JHSS draft: acknowledgements (mentors, AI-assistance disclosure) carried over from the previous submission
</commit_message>
<xml_diff>
--- a/v3/jhss/manuscript.docx
+++ b/v3/jhss/manuscript.docx
@@ -4284,6 +4284,30 @@
           <w:i w:val="0"/>
         </w:rPr>
         <w:t>Computations used open-source software (MultiREx, TauREx 3, FastChem, Exo-Transmit, ExoSim 2, scikit-learn, XGBoost) and public data (the ExoMolOP tables, the PHOENIX stellar atlas, the Ariel Mission Candidate Sample). No financial support was received.</w:t>
+      </w:r>
+    </w:p>
+    <w:p>
+      <w:pPr>
+        <w:jc w:val="both"/>
+      </w:pPr>
+      <w:r>
+        <w:rPr>
+          <w:b w:val="0"/>
+          <w:i w:val="0"/>
+        </w:rPr>
+        <w:t>The author thanks Rachael Kaci, instructor of the Advanced Authentic Research (AAR) program at Henry M. Gunn High School, and research mentor Victoria Lloyd, for their guidance and feedback throughout this project.</w:t>
+      </w:r>
+    </w:p>
+    <w:p>
+      <w:pPr>
+        <w:jc w:val="both"/>
+      </w:pPr>
+      <w:r>
+        <w:rPr>
+          <w:b w:val="0"/>
+          <w:i w:val="0"/>
+        </w:rPr>
+        <w:t>In the interest of transparency, the author discloses the following assistance: Anthropic's Claude Code was used to help implement the Python analysis code, to manage the project's GitHub repository, and to help draft and revise the manuscript text. These tools were used under the author's direction; the author designed the study, directed the analysis, interpreted the results, and is responsible for all content, having reviewed and validated all AI-assisted code and text.</w:t>
       </w:r>
     </w:p>
     <w:p>

</xml_diff>

<commit_message>
JHSS draft reframed as a Technical note: workflow first, findings as its output; Contributions subsection
</commit_message>
<xml_diff>
--- a/v3/jhss/manuscript.docx
+++ b/v3/jhss/manuscript.docx
@@ -75,7 +75,7 @@
           <w:b w:val="0"/>
           <w:i w:val="0"/>
         </w:rPr>
-        <w:t>Machine-learning screens have been proposed to decide which of the ~1,000 exoplanets Ariel will observe deserve deeper follow-up, including a Tier-1 classification strategy published by the Ariel consortium. Because no Ariel data exist, every such screen is trained and validated on spectra from the same simulator, so its reported accuracy says nothing about deployment on atmospheres whose physics differs from the simulator's. We ask when such a screen can be trusted and answer with measurements. Two screens go through one procedure: the consortium's Tier-1 molecular screen, rebuilt from its published description, and a tuned screen for a stated Ariel science target, the carbon-rich (C/O &gt; 1) regime. The simulator is broken on purpose along ten physically motivated axes, and for each we measure the loss, the part no retraining can recover, what a randomized training grid absorbs, whether a decline rule flags the errors, and what removes the loss — at the Tier-1 binning where triage would occur and on Ariel's actual target list. The map has three regions. Modelled mismatch is largely absorbed and the residual is irreducible information loss. Disequilibrium chemistry helps. Physics the simulator omitted cannot be trusted: HCN and C₂H₂, present at ~10⁻⁵ in carbon-rich atmospheres and absent from the field's standard Ariel training grid, drop the carbon-rich screen from 96.5 % to 71.9 % — chance on carbon-rich planets, with confident probabilities; no retraining on other ingredients helps, only a distance-based novelty score detects it, and adding the two species restores 96.4 %. The same omission leaves the molecule-presence screen untouched: omitted physics is fatal when it sits on the feature that defines the class. At Tier 1, randomization still helps but no decline rule works and most of every serious loss is unrecoverable by any training. The procedure is released for use on any screen.</w:t>
+        <w:t>Machine-learning screens have been proposed to decide which of the ~1,000 exoplanets Ariel will observe deserve deeper follow-up, including a Tier-1 classification strategy published by the Ariel consortium. Because no Ariel data exist, every such screen is trained and validated on spectra from the same simulator, so its reported accuracy says nothing about deployment on atmospheres whose physics differs from the simulator's. This note presents a workflow for mapping when such a screen can be trusted, built from standard tools — target-trained oracle bounds, domain randomization, held-out-axis evaluation and selective prediction — and demonstrates it on two screens: the consortium's Tier-1 molecular screen, rebuilt from its published description, and a tuned screen for a stated Ariel science target, the carbon-rich (C/O &gt; 1) regime. The simulator is broken on purpose along ten physically motivated axes, and for each the workflow measures the loss, the part no retraining can recover, what a randomized training grid absorbs, whether a decline rule flags the errors, and what removes the loss — at the Tier-1 binning where triage would occur and on Ariel's actual target list. The map it produces has three regions. Modelled mismatch is largely absorbed and the residual is irreducible information loss. Disequilibrium chemistry helps. Physics the simulator omitted cannot be trusted: HCN and C₂H₂, present at ~10⁻⁵ in carbon-rich atmospheres and absent from the field's standard Ariel training grid, drop the carbon-rich screen from 96.5 % to 71.9 % — chance on carbon-rich planets, with confident probabilities; no retraining on other ingredients helps, only a distance-based novelty score detects it, and adding the two species restores 96.4 %. The same omission leaves the molecule-presence screen untouched: omitted physics is fatal when it sits on the feature that defines the class. At Tier 1, randomization still helps but no decline rule works and most of every serious loss is unrecoverable by any training. The workflow is released as scripts that take any screen and any forward model.</w:t>
       </w:r>
     </w:p>
     <w:p>
@@ -161,7 +161,7 @@
           <w:b w:val="0"/>
           <w:i w:val="0"/>
         </w:rPr>
-        <w:t xml:space="preserve">A screen that fails quietly returns confident answers, and a mission acts on them. This paper asks the question a mission faces before launch — </w:t>
+        <w:t xml:space="preserve">A screen that fails quietly returns confident answers, and a mission acts on them. This note takes the question a mission faces before launch — </w:t>
       </w:r>
       <w:r>
         <w:rPr>
@@ -175,7 +175,26 @@
           <w:b w:val="0"/>
           <w:i w:val="0"/>
         </w:rPr>
-        <w:t xml:space="preserve"> — and answers it operationally: on data whose physics differs from the training simulator, in ways we anticipate and in ways we deliberately hold out, which planets does the screen still classify at a stated accuracy, does it know which planets it cannot, and what fixes what?</w:t>
+        <w:t xml:space="preserve"> — and turns it into a workflow that can be run on any screen: on data whose physics differs from the training simulator, in ways one anticipates and in ways one deliberately holds out, which planets does the screen still classify at a stated accuracy, does it know which planets it cannot, and what fixes what? The workflow is assembled from standard machine-learning tools and applied to a published screen and to one of our own; the findings reported are what that application produced.</w:t>
+      </w:r>
+    </w:p>
+    <w:p>
+      <w:pPr>
+        <w:pStyle w:val="Heading2"/>
+      </w:pPr>
+      <w:r>
+        <w:rPr>
+          <w:b/>
+          <w:i w:val="0"/>
+        </w:rPr>
+        <w:t xml:space="preserve">1.1 </w:t>
+      </w:r>
+      <w:r>
+        <w:rPr>
+          <w:b w:val="0"/>
+          <w:i/>
+        </w:rPr>
+        <w:t>Contributions</w:t>
       </w:r>
     </w:p>
     <w:p>
@@ -187,7 +206,19 @@
           <w:b w:val="0"/>
           <w:i w:val="0"/>
         </w:rPr>
-        <w:t>The contributions are three. First, a reliability map, computed with one reusable procedure for two screens — the consortium's own Tier-1 design, rebuilt from its published description, and a tuned screen for a stated Ariel science target — that for each of ten simulator mismatches reports the loss, its irreducible part, what a randomized training grid absorbs, whether the errors can be flagged, and what removes the loss (Section 3.1). Second, the finding that two molecules chemistry has long assigned to carbon-rich atmospheres, and that the field's standard Ariel training grid omits, put a carbon-rich screen at chance on exactly the planets it exists to find, with high confidence, while leaving a molecule-presence screen untouched (Section 3.2). Third, the map at Tier 1, where triage would actually happen, where the map differs materially from Tier 3 (Section 3.3). No method used here is new: domain randomization, selective prediction, distance-based novelty scores, oracle bounds and held-out-axis evaluation are standard in machine learning and are cited where used. What is new is the question asked of an exoplanet screen, the physics-side axes, the framing of each failure as absorb-or-detect-or-fix, the answer as a table a mission can act on, and the finding about the standard grid.</w:t>
+        <w:t>The workflow (Section 2.4) combines five standard measurements — loss under a re-rendered mismatch, the ceiling from a screen trained at the test condition, absorption by a randomized training grid with each ingredient held out in turn, decline rules judged against the clean selective baseline, and evaluation at the decision tier and on the mission's target list — into one reliability map, and is released as scripts that take any screen and any forward model. No method in it is new: domain randomization, selective prediction, distance-based novelty scores, oracle bounds and held-out-axis evaluation are standard in machine learning and are cited where used; the assembly, the physics-side mismatch axes, and the absorb-or-detect-or-fix reading of each row are what the workflow adds.</w:t>
+      </w:r>
+    </w:p>
+    <w:p>
+      <w:pPr>
+        <w:jc w:val="both"/>
+      </w:pPr>
+      <w:r>
+        <w:rPr>
+          <w:b w:val="0"/>
+          <w:i w:val="0"/>
+        </w:rPr>
+        <w:t>Applied to two screens — the consortium's own Tier-1 design, rebuilt from its published description, and a tuned screen for a stated Ariel science target — the workflow produced three results. First, the map itself, for ten simulator mismatches at Tier 3 (Section 3.1). Second, that two molecules chemistry has long assigned to carbon-rich atmospheres, and that the field's standard Ariel training grid omits, put a carbon-rich screen at chance on exactly the planets it exists to find, with high confidence, while leaving a molecule-presence screen untouched (Section 3.2). Third, the map at Tier 1, where triage would actually happen, where it differs materially from Tier 3 (Section 3.3).</w:t>
       </w:r>
     </w:p>
     <w:p>
@@ -4259,7 +4290,7 @@
           <w:b w:val="0"/>
           <w:i w:val="0"/>
         </w:rPr>
-        <w:t>A machine-learning screen trained on simulated Ariel spectra was tested on spectra whose physics differed from its simulator, for the consortium's own Tier-1 design and for a tuned carbon-rich screen, with one procedure that measured for each mismatch the loss, its irreducible part, what a randomized training grid absorbed, whether a decline rule flagged the errors, and what removed the loss. Modelled mismatch was largely absorbed and its residual was irreducible information loss; disequilibrium chemistry raised the carbon-rich screen's accuracy; and physics the simulator omitted — HCN and C₂H₂, present in carbon-rich atmospheres and absent from the field's standard training grid — put the carbon-rich screen at chance on carbon-rich planets with confident probabilities, was absorbed by nothing, was detected only by distance-based novelty scores, and was repaired only by adding the species to the forward model, while leaving a molecule-presence screen untouched. At the Tier-1 binning at which triage would occur, randomization still helped, no decline rule worked, and most of every serious loss was unrecoverable by any training. A screen validated only on the simulator that built it has not been validated; the procedure released here makes the validation that is possible before launch reproducible on any screen.</w:t>
+        <w:t>A workflow for mapping when a simulator-trained screen can be trusted — measuring, for each mismatch between simulator and deployment, the loss, its irreducible part, what a randomized training grid absorbs, whether a decline rule flags the errors, and what removes the loss — was assembled from standard tools and demonstrated on the consortium's own Tier-1 design and on a tuned carbon-rich screen. Modelled mismatch was largely absorbed and its residual was irreducible information loss; disequilibrium chemistry raised the carbon-rich screen's accuracy; and physics the simulator omitted — HCN and C₂H₂, present in carbon-rich atmospheres and absent from the field's standard training grid — put the carbon-rich screen at chance on carbon-rich planets with confident probabilities, was absorbed by nothing, was detected only by distance-based novelty scores, and was repaired only by adding the species to the forward model, while leaving a molecule-presence screen untouched. At the Tier-1 binning at which triage would occur, randomization still helped, no decline rule worked, and most of every serious loss was unrecoverable by any training. A screen validated only on the simulator that built it has not been validated; the workflow released here makes the validation that is possible before launch reproducible on any screen.</w:t>
       </w:r>
     </w:p>
     <w:p>
@@ -4331,7 +4362,7 @@
           <w:b w:val="0"/>
           <w:i w:val="0"/>
         </w:rPr>
-        <w:t xml:space="preserve">Every number in this paper is read from a committed result file. The code, the result tables, the pre-registered expectations and their outcomes, the figures, and the documented changes to the forward model (a seeding fix and an aerosol feature in the MultiREx fork, and the added opacity tables) are at https://github.com/oy2017/BioSignatureDetectionModel, directory </w:t>
+        <w:t xml:space="preserve">Every number in this note is read from a committed result file. The code, the result tables, the pre-registered expectations and their outcomes, the figures, and the documented changes to the forward model (a seeding fix and an aerosol feature in the MultiREx fork, and the added opacity tables) are at https://github.com/oy2017/BioSignatureDetectionModel, directory </w:t>
       </w:r>
       <w:r>
         <w:rPr>

</xml_diff>

<commit_message>
JHSS draft: wording consistency, abstract trimmed
</commit_message>
<xml_diff>
--- a/v3/jhss/manuscript.docx
+++ b/v3/jhss/manuscript.docx
@@ -75,7 +75,7 @@
           <w:b w:val="0"/>
           <w:i w:val="0"/>
         </w:rPr>
-        <w:t>Machine-learning screens have been proposed to decide which of the ~1,000 exoplanets Ariel will observe deserve deeper follow-up, including a Tier-1 classification strategy published by the Ariel consortium. Because no Ariel data exist, every such screen is trained and validated on spectra from the same simulator, so its reported accuracy says nothing about deployment on atmospheres whose physics differs from the simulator's. This note presents a workflow for mapping when such a screen can be trusted, built from standard tools — target-trained oracle bounds, domain randomization, held-out-axis evaluation and selective prediction — and demonstrates it on two screens: the consortium's Tier-1 molecular screen, rebuilt from its published description, and a tuned screen for a stated Ariel science target, the carbon-rich (C/O &gt; 1) regime. The simulator is broken on purpose along ten physically motivated axes, and for each the workflow measures the loss, the part no retraining can recover, what a randomized training grid absorbs, whether a decline rule flags the errors, and what removes the loss — at the Tier-1 binning where triage would occur and on Ariel's actual target list. The map it produces has three regions. Modelled mismatch is largely absorbed and the residual is irreducible information loss. Disequilibrium chemistry helps. Physics the simulator omitted cannot be trusted: HCN and C₂H₂, present at ~10⁻⁵ in carbon-rich atmospheres and absent from the field's standard Ariel training grid, drop the carbon-rich screen from 96.5 % to 71.9 % — chance on carbon-rich planets, with confident probabilities; no retraining on other ingredients helps, only a distance-based novelty score detects it, and adding the two species restores 96.4 %. The same omission leaves the molecule-presence screen untouched: omitted physics is fatal when it sits on the feature that defines the class. At Tier 1, randomization still helps but no decline rule works and most of every serious loss is unrecoverable by any training. The workflow is released as scripts that take any screen and any forward model.</w:t>
+        <w:t>Machine-learning screens have been proposed to decide which of the ~1,000 exoplanets Ariel will observe deserve deeper follow-up, including a Tier-1 classification strategy published by the Ariel consortium. Because no Ariel data exist, every such screen is trained and validated on spectra from the same simulator, so its reported accuracy says nothing about deployment on atmospheres whose physics differs from the simulator's. This note presents a workflow for mapping when such a screen can be trusted, built from standard tools, and demonstrates it on two screens: the consortium's Tier-1 molecular screen, rebuilt from its published description, and a tuned screen for a stated Ariel science target, the carbon-rich (C/O &gt; 1) regime. The simulator is broken on purpose along ten physically motivated axes; for each, the workflow measures the loss, the part no retraining can recover, what a randomized training grid absorbs, whether a decline rule flags the errors, and what removes the loss, at the Tier-1 binning where triage would occur and on Ariel's actual target list. The map it produces has three regions. Modelled mismatch is largely absorbed and the residual is irreducible information loss. Disequilibrium chemistry helps. Physics the simulator omitted cannot be trusted: HCN and C₂H₂, present at ~10⁻⁵ in carbon-rich atmospheres and absent from the field's standard Ariel training grid, drop the carbon-rich screen from 96.5 % to 71.9 % — chance on carbon-rich planets, with confident probabilities; no retraining on other ingredients helps, only a distance-based novelty score detects it, and adding the two species restores 96.4 %. The same omission leaves the molecule-presence screen untouched: omitted physics is fatal when it sits on the feature that defines the class. At Tier 1, randomization still helps but no decline rule works and most of every serious loss is unrecoverable by any training. The workflow is released as scripts that take any screen and any forward model.</w:t>
       </w:r>
     </w:p>
     <w:p>
@@ -15140,7 +15140,7 @@
           <w:b w:val="0"/>
           <w:i w:val="0"/>
         </w:rPr>
-        <w:t>NH₃ carried no absorption in the forward model of our earlier work (MultiREx ships no NH₃ table), a documented simplification that this paper's thesis made indefensible; the Exo-Transmit NH₃ table was added and every result regenerated (haze and opacity-table costs rose; the contamination host gap narrowed; every qualitative statement survived). The MultiREx fork used here fixes a seeding defect in the released package — objects created within the same second draw identical parameters and shuffled clones reproduce their parent — which our grids never exercised because parameters are drawn externally, and adds the cloud and Mie-haze contributions. The quench prescription, the K</w:t>
+        <w:t>NH₃ carried no absorption in the forward model of our earlier work (MultiREx ships no NH₃ table), a documented simplification that this note's thesis made indefensible; the Exo-Transmit NH₃ table was added and every result regenerated (haze and opacity-table costs rose; the contamination host gap narrowed; every qualitative statement survived). The MultiREx fork used here fixes a seeding defect in the released package — objects created within the same second draw identical parameters and shuffled clones reproduce their parent — which our grids never exercised because parameters are drawn externally, and adds the cloud and Mie-haze contributions. The quench prescription, the K</w:t>
       </w:r>
       <w:r>
         <w:rPr>

</xml_diff>

<commit_message>
Introduction rewritten: transmission-spectrum background, why classifiers, concrete ways simulators differ from real atmospheres and what a silent failure costs, why a re-implementation is needed, preview of results and who can use them
</commit_message>
<xml_diff>
--- a/v3/jhss/manuscript.docx
+++ b/v3/jhss/manuscript.docx
@@ -125,7 +125,7 @@
           <w:b w:val="0"/>
           <w:i w:val="0"/>
         </w:rPr>
-        <w:t>Ariel, scheduled for launch in 2029, will observe transmission spectra of about 1,000 transiting exoplanets between 0.5 and 7.8 µm (1). The survey is organised in tiers. Every target is observed first at low signal-to-noise in a Tier-1 reconnaissance pass, and a substantial subset is then re-observed at higher precision in Tier 2 (1-4). Tier-1 data are expected to reveal the presence of molecular features and the degree of cloudiness (4), which makes them the natural input for deciding which planets deserve the deeper observations.</w:t>
+        <w:t>When a planet passes in front of its star, a small fraction of the starlight passes through the planet's atmosphere on its way to the observer. Molecules in the atmosphere absorb that light at their own characteristic wavelengths, so the apparent size of the planet changes with wavelength. The record of that change, the transmission spectrum, shows which molecules are present. Ariel, a European Space Agency mission scheduled for launch in 2029, will measure transmission spectra of about 1,000 transiting exoplanets between 0.5 and 7.8 µm, using three broadband photometers below 1.1 µm and three spectrometers above (1). Telescope time will not allow every planet to be studied deeply. The survey is therefore organised in tiers: every target is observed first at low signal-to-noise in a Tier-1 reconnaissance pass, and a substantial subset is then re-observed at higher precision in Tier 2 (1-4). Tier-1 data are expected to reveal the presence of molecular features and the degree of cloudiness (4), so they are the natural basis for deciding which planets receive the deeper observations. A planet judged uninteresting at Tier 1 may never be observed again.</w:t>
       </w:r>
     </w:p>
     <w:p>
@@ -137,7 +137,7 @@
           <w:b w:val="0"/>
           <w:i w:val="0"/>
         </w:rPr>
-        <w:t>The Ariel consortium's population study of the Tier-1 survey proposed two ways of classifying planets from Tier-1 spectra without a retrieval: a band-based metric, and, as a preliminary assessment, four scikit-learn classifiers trained on simulated spectra to flag the presence of CH₄, H₂O, CO₂ and NH₃ (5). The classifiers reached 64-89 % accuracy on a held-out simulated population. Their code and trained models were not released. Like the classifiers and retrieval networks developed for the Ariel Data Challenges (6) and the wider machine-learning retrieval literature (7, 8), they were trained and tested on spectra from the same simulator. Such a test shows that a classifier has learned its simulator. It does not show how the classifier behaves when a real atmosphere contains something the simulator left out, and no Ariel observation exists yet against which to check. The authors of the study noted this themselves, describing their spectra as "transmission spectral shapes" to test methods against (5).</w:t>
+        <w:t>Making that decision for about 1,000 planets is itself a problem. The standard way to read a spectrum, an atmospheric retrieval, fits a physical model with sampling algorithms that need between 10⁵ and 10⁸ model evaluations per planet (5), and its assumptions and priors must be chosen and checked by a specialist (6). Machine-learning classifiers are an attractive alternative: once trained, they return an answer for every planet in seconds. The Ariel consortium's population study of the Tier-1 survey proposed two retrieval-free ways of classifying planets: a band-based metric and, as a preliminary assessment, four scikit-learn classifiers trained to flag the presence of CH₄, H₂O, CO₂ and NH₃ (6). The classifiers reached 64-89 % accuracy on a held-out simulated population. Their code and trained models were not released.</w:t>
       </w:r>
     </w:p>
     <w:p>
@@ -149,7 +149,7 @@
           <w:b w:val="0"/>
           <w:i w:val="0"/>
         </w:rPr>
-        <w:t>Deliberately changing the test data and measuring the consequences is established practice in machine learning (9, 10) and in simulation-based inference (11, 12). In exoplanet atmospheres, the nearest study tested a retrieval network on spectra with an added absorber, a removed absorber and unocculted star spots (13), and a recent flow-matching retrieval left model mismatch such as unmodelled clouds to future work (8). No published classifier proposed for Ariel's Tier-1 selection had been tested this way.</w:t>
+        <w:t>Because Ariel has not yet flown, these classifiers, like the classifiers and retrieval networks developed for the Ariel Data Challenges (5) and the wider machine-learning retrieval literature (7, 8), were trained and tested on spectra from the same simulator. That test shows that a classifier has learned its simulator. It cannot show how the classifier behaves when real atmospheres differ from the simulator, and there are well-documented ways in which they will. Hazes and clouds are common in observed hot Jupiters and mute or reshape their spectra across a continuum from clear to strongly obscured (9, 10). Unocculted spots on the host star imprint false spectral features, most strongly for cool stars (11). Opacity data compiled from different line lists give different absorption cross sections (12, 13). Training grids include only a handful of absorbers: the database of the first Ariel Data Challenge contains five (5), while carbon-rich atmospheres, for example, are expected to carry HCN and C₂H₂ in abundance (14). The authors of the consortium study acknowledged the limitation, describing their spectra as "transmission spectral shapes" to test methods against (6). The concern is practical. A classifier that fails in these situations does not announce it; it returns confident answers, and the planets it wrongly dismisses do not receive the observations that would have revealed them.</w:t>
       </w:r>
     </w:p>
     <w:p>
@@ -161,7 +161,31 @@
           <w:b w:val="0"/>
           <w:i w:val="0"/>
         </w:rPr>
-        <w:t>This technical note carried out that test. It re-implemented the consortium's Tier-1 molecular classifiers from their published description and verified the re-implementation against the published accuracies (Section 3.1). It then tested the classifiers against fifteen departures from their simulator, measuring for each how much accuracy was lost, how much of the loss was recoverable, and whether the classifiers could tell (Sections 3.2-3.4). Finally, it asked whether the answers were a property of the classifier or of Ariel machine-learning classifiers in general. To answer that, the same test was applied to a second classifier, built for a different Ariel science question. One classifier with a different trust profile is enough to show that a stress test of one classifier cannot stand in for another (Section 3.5). All code, result tables and the expectations recorded before the runs are in a public repository directory (see Data and Code Availability).</w:t>
+        <w:t>Deliberately altering the test data and measuring the consequences is established practice in machine learning (15, 16) and in simulation-based inference (17, 18). In exoplanet atmospheres, the nearest study tested a retrieval network on spectra with an added absorber, a removed absorber and unocculted star spots (19), and a recent flow-matching retrieval left model mismatch such as unmodelled clouds to future work (8). No test of this kind had been reported for a classifier proposed for Ariel's Tier-1 survey, and because the consortium's code was not released, any such test first requires an independent re-implementation that demonstrably matches the published results.</w:t>
+      </w:r>
+    </w:p>
+    <w:p>
+      <w:pPr>
+        <w:jc w:val="both"/>
+      </w:pPr>
+      <w:r>
+        <w:rPr>
+          <w:b w:val="0"/>
+          <w:i w:val="0"/>
+        </w:rPr>
+        <w:t>This technical note asked whether the consortium's Tier-1 molecular classifiers could be trusted when real atmospheres differ from their simulator, and whether the answer carries over to other classifiers. It re-implemented the classifiers from their published description and verified the re-implementation against all 48 published accuracies (Section 3.1). It then subjected them to a stress test of fifteen physically motivated departures from the simulator, measuring for each how much accuracy was lost, how much of the loss any retraining could recover, whether training on a randomized grid absorbed it, and whether the classifiers' confidence, distance-based novelty scores or conformal prediction flagged the errors (Sections 3.2-3.4). To find out whether the resulting trust profile belonged to this classifier or to Ariel classifiers in general, the same test was applied to a second classifier, built for a different Ariel science question, the carbon-to-oxygen ratio; a single classifier with a different profile is enough to show that one classifier's stress test cannot stand in for another's (Section 3.5).</w:t>
+      </w:r>
+    </w:p>
+    <w:p>
+      <w:pPr>
+        <w:jc w:val="both"/>
+      </w:pPr>
+      <w:r>
+        <w:rPr>
+          <w:b w:val="0"/>
+          <w:i w:val="0"/>
+        </w:rPr>
+        <w:t>The test showed that the published design was robust to a different opacity database, a different radiative-transfer code and omitted absorbers, but was confidently blind to haze of an observed strength: it reported methane and water absent while their infrared bands were intact, because it relied on the three optical photometric points. The second classifier had a nearly opposite profile. These results are useful in three ways. Anyone applying or extending the consortium design gains a specific weakness and two remedies. Anyone proposing a classifier for Ariel gains a stress-test procedure, applicable to any classifier trained on simulated spectra, with released scripts for the two classifiers studied here. And selecting Ariel's deeper-tier targets with any simulator-trained classifier gains a concrete requirement: the classifier must be tested on its own, against the ways its simulator can be wrong, before its outputs are used. All code, result tables and the expectations recorded before the runs are in a public repository directory (see Data and Code Availability).</w:t>
       </w:r>
     </w:p>
     <w:p>
@@ -211,7 +235,7 @@
           <w:b w:val="0"/>
           <w:i w:val="0"/>
         </w:rPr>
-        <w:t>The re-implementation followed Sections 2.2 and 2.5 of the consortium study (5) element by element (Table 1). Planet populations were built on the Ariel candidate list. The training population (POP-III) repeated each planet four times with independently drawn atmospheres, and the test population (POP-I) used each planet once. Each atmosphere was isothermal at a temperature drawn between 0.7 and 1.05 times the planet's equilibrium temperature, with 100 layers spanning 10⁻⁴ to 10⁶ Pa, an H₂/He fill with He/H₂ = 0.17, constant-with-altitude abundances of CH₄, H₂O, CO₂ and NH₃ drawn log-uniformly (10⁻⁹-10⁻² for training, 10⁻⁷-10⁻² for testing), and a grey opaque cloud deck at a pressure drawn log-uniformly between 5 × 10² and 10⁶ Pa. Each spectrum was binned at the study's Tier-3 resolution (R = 20, 100 and 30 in NIRSpec, AIRS-CH0 and AIRS-CH1, plus the three photometric channels; 104 points) and scattered with Gaussian noise equal to the Tier-3 noise of each bin rescaled to the number of transits the planet needs for Tier 1. Each spectrum was normalised to zero mean and unit dispersion. A molecule was labelled present if its abundance exceeded 10⁻⁵, 10⁻⁴ or 10⁻³. The classifiers were scikit-learn's k-nearest-neighbour (k = 5), multilayer-perceptron (one hidden layer of 100 units), random-forest and support-vector classifiers at default settings (14). These defaults have not changed since version 0.22, the version the study cites.</w:t>
+        <w:t>The re-implementation followed Sections 2.2 and 2.5 of the consortium study (6) element by element (Table 1). Planet populations were built on the Ariel candidate list. The training population (POP-III) repeated each planet four times with independently drawn atmospheres, and the test population (POP-I) used each planet once. Each atmosphere was isothermal at a temperature drawn between 0.7 and 1.05 times the planet's equilibrium temperature, with 100 layers spanning 10⁻⁴ to 10⁶ Pa, an H₂/He fill with He/H₂ = 0.17, constant-with-altitude abundances of CH₄, H₂O, CO₂ and NH₃ drawn log-uniformly (10⁻⁹-10⁻² for training, 10⁻⁷-10⁻² for testing), and a grey opaque cloud deck at a pressure drawn log-uniformly between 5 × 10² and 10⁶ Pa. Each spectrum was binned at the study's Tier-3 resolution (R = 20, 100 and 30 in NIRSpec, AIRS-CH0 and AIRS-CH1, plus the three photometric channels; 104 points) and scattered with Gaussian noise equal to the Tier-3 noise of each bin rescaled to the number of transits the planet needs for Tier 1. Each spectrum was normalised to zero mean and unit dispersion. A molecule was labelled present if its abundance exceeded 10⁻⁵, 10⁻⁴ or 10⁻³. The classifiers were scikit-learn's k-nearest-neighbour (k = 5), multilayer-perceptron (one hidden layer of 100 units), random-forest and support-vector classifiers at default settings (20). These defaults have not changed since version 0.22, the version the study cites.</w:t>
       </w:r>
     </w:p>
     <w:p>
@@ -230,7 +254,7 @@
           <w:b w:val="0"/>
           <w:i w:val="0"/>
         </w:rPr>
-        <w:t xml:space="preserve"> Elements of the published classifier design, the statement in the consortium study (5) (page of the arXiv version), and the re-implementation.</w:t>
+        <w:t xml:space="preserve"> Elements of the published classifier design, the statement in the consortium study (6) (page of the arXiv version), and the re-implementation.</w:t>
       </w:r>
     </w:p>
     <w:tbl>
@@ -656,7 +680,7 @@
                 <w:i w:val="0"/>
                 <w:sz w:val="18"/>
               </w:rPr>
-              <w:t>Exo-Transmit tables (15); no collision-induced absorption (Section 2.2)</w:t>
+              <w:t>Exo-Transmit tables (12); no collision-induced absorption (Section 2.2)</w:t>
             </w:r>
           </w:p>
         </w:tc>
@@ -941,7 +965,7 @@
           <w:b w:val="0"/>
           <w:i w:val="0"/>
         </w:rPr>
-        <w:t>Two details were not stated explicitly, and each was resolved from the text and checked against the published results. First, the study did not state explicitly that the classifier input included the three optical photometric points. It stated that the classifiers learn "from their spectral shape over the whole wavelength range sampled by Ariel" and "gather information from all the spectral data points" (5), and its figures of the observed Tier-1 spectra show the photometric points. The re-implementation therefore included them. Second, the noise of each Tier-3 bin was computed from a payload noise model rather than from ArielRad, which is not public (Section 2.3).</w:t>
+        <w:t>Two details were not stated explicitly, and each was resolved from the text and checked against the published results. First, the study did not state explicitly that the classifier input included the three optical photometric points. It stated that the classifiers learn "from their spectral shape over the whole wavelength range sampled by Ariel" and "gather information from all the spectral data points" (6), and its figures of the observed Tier-1 spectra show the photometric points. The re-implementation therefore included them. Second, the noise of each Tier-3 bin was computed from a payload noise model rather than from ArielRad, which is not public (Section 2.3).</w:t>
       </w:r>
     </w:p>
     <w:p>
@@ -953,7 +977,7 @@
           <w:b w:val="0"/>
           <w:i w:val="0"/>
         </w:rPr>
-        <w:t>Three deviations could not be avoided. (i) The opacities were Exo-Transmit's tables (15, 16) rather than ExoMol cross sections. Replacing the tables with ExoMol cross sections (17) for H₂O, CH₄, CO₂ and CO cost the re-implemented classifier 2.9 points (Section 3.2), which bounds the effect of this choice. (ii) Collision-induced absorption was not included. Adding the H₂-H₂ and H₂-He contributions changed test spectra by at most 3 ppm, against feature amplitudes of 270-1,400 ppm. (iii) The planet list was the 965 known planets of the current candidate sample (3) instead of the 1,000 planets of the 2019 list (2), which included predicted TESS discoveries.</w:t>
+        <w:t>Three deviations could not be avoided. (i) The opacities were Exo-Transmit's tables (12, 21) rather than ExoMol cross sections. Replacing the tables with ExoMol cross sections (13) for H₂O, CH₄, CO₂ and CO cost the re-implemented classifier 2.9 points (Section 3.2), which bounds the effect of this choice. (ii) Collision-induced absorption was not included. Adding the H₂-H₂ and H₂-He contributions changed test spectra by at most 3 ppm, against feature amplitudes of 270-1,400 ppm. (iii) The planet list was the 965 known planets of the current candidate sample (3) instead of the 1,000 planets of the 2019 list (2), which included predicted TESS discoveries.</w:t>
       </w:r>
     </w:p>
     <w:p>
@@ -996,7 +1020,7 @@
           <w:b w:val="0"/>
           <w:i w:val="0"/>
         </w:rPr>
-        <w:t>Spectra were computed with TauREx 3 (18) through MultiREx (19) at a native resolution of R ≈ 1,000 and binned by integration. TauREx 3.3.2 reads the pressure grid of Exo-Transmit opacity tables as bar, whereas Exo-Transmit's own reader and manual treat it as Pa; the pressure grid was therefore divided by 10⁵ at load. The inconsistency was reported to the TauREx developers (20). With the correction, TauREx spectra of 1,804 test atmospheres matched Exo-Transmit's own code more closely (median shape correlation 0.9986 against 0.986 without it).</w:t>
+        <w:t>Spectra were computed with TauREx 3 (22) through MultiREx (23) at a native resolution of R ≈ 1,000 and binned by integration. TauREx 3.3.2 reads the pressure grid of Exo-Transmit opacity tables as bar, whereas Exo-Transmit's own reader and manual treat it as Pa; the pressure grid was therefore divided by 10⁵ at load. The inconsistency was reported to the TauREx developers (24). With the correction, TauREx spectra of 1,804 test atmospheres matched Exo-Transmit's own code more closely (median shape correlation 0.9986 against 0.986 without it).</w:t>
       </w:r>
     </w:p>
     <w:p>
@@ -1008,7 +1032,7 @@
           <w:b w:val="0"/>
           <w:i w:val="0"/>
         </w:rPr>
-        <w:t>The noise of each bin came from a payload noise model built with ExoSim 2 (21): the one-hour noise-to-signal ratio of each bin for the host's effective temperature, scaled to the host's distance and radius and to the transit duration, divided by the square root of the number of transits. Its single free level was calibrated so that a signal-to-noise ratio of 7 on the five-scale-height atmospheric signal reproduced the candidate sample's Tier-3 transit counts; the calibrated model predicted those counts with a scatter of 0.07 dex (17 %). For the three example planets of the study's Figure 1 (HD 209458 b, GJ 1214 b and WASP-79 b), the model's per-bin noise in the AIRS channels (about 75, 430 and 230 ppm) was of the same size as the published noise bands.</w:t>
+        <w:t>The noise of each bin came from a payload noise model built with ExoSim 2 (25): the one-hour noise-to-signal ratio of each bin for the host's effective temperature, scaled to the host's distance and radius and to the transit duration, divided by the square root of the number of transits. Its single free level was calibrated so that a signal-to-noise ratio of 7 on the five-scale-height atmospheric signal reproduced the candidate sample's Tier-3 transit counts; the calibrated model predicted those counts with a scatter of 0.07 dex (17 %). For the three example planets of the study's Figure 1 (HD 209458 b, GJ 1214 b and WASP-79 b), the model's per-bin noise in the AIRS channels (about 75, 430 and 230 ppm) was of the same size as the published noise bands.</w:t>
       </w:r>
     </w:p>
     <w:p>
@@ -1039,7 +1063,7 @@
           <w:b w:val="0"/>
           <w:i w:val="0"/>
         </w:rPr>
-        <w:t>A second classifier was built to test whether the results for the consortium classifier were specific to it. It addressed the atmospheric carbon-to-oxygen ratio, a stated Ariel science objective (1), and labelled an atmosphere carbon-rich if C/O &gt; 1, the chemical boundary above which oxygen is locked in CO and water is depleted (22, 23). The grid held 18,040 training and 9,016 test atmospheres in five independent test sets, with planet radius 1-26 R⊕, mass 1-300 M⊕, host temperature 2,500-7,500 K, atmospheric temperature 500-2,500 K, C/O uniform in 0.2-1.8 and metallicity uniform in −1 to 1.5 dex, each drawn independently. Abundances of H₂O, CH₄, CO, CO₂, NH₃ and O₃ followed from chemical equilibrium computed with FastChem (24) at 10⁻² bar. Spectra were binned to the Ariel Tier-3 layout of the mission's radiometric model (R = 15, 100 and 30, 102 points) (25) and at the seven-point Tier-1 layout. The classifier was gradient-boosted trees (26) on per-spectrum-normalised bins, tuned by cross-validation, with noise at a signal-to-noise ratio of 15 on each spectrum's amplitude; on the known Ariel targets, noise came from the payload model of Section 2.3. It reached 96.1 % on the simulated test sets (95.9 ± 0.1 % across ten training resamples).</w:t>
+        <w:t>A second classifier was built to test whether the results for the consortium classifier were specific to it. It addressed the atmospheric carbon-to-oxygen ratio, a stated Ariel science objective (1), and labelled an atmosphere carbon-rich if C/O &gt; 1, the chemical boundary above which oxygen is locked in CO and water is depleted (14, 26). The grid held 18,040 training and 9,016 test atmospheres in five independent test sets, with planet radius 1-26 R⊕, mass 1-300 M⊕, host temperature 2,500-7,500 K, atmospheric temperature 500-2,500 K, C/O uniform in 0.2-1.8 and metallicity uniform in −1 to 1.5 dex, each drawn independently. Abundances of H₂O, CH₄, CO, CO₂, NH₃ and O₃ followed from chemical equilibrium computed with FastChem (27) at 10⁻² bar. Spectra were binned to the Ariel Tier-3 layout of the mission's radiometric model (R = 15, 100 and 30, 102 points) (28) and at the seven-point Tier-1 layout. The classifier was gradient-boosted trees (29) on per-spectrum-normalised bins, tuned by cross-validation, with noise at a signal-to-noise ratio of 15 on each spectrum's amplitude; on the known Ariel targets, noise came from the payload model of Section 2.3. It reached 96.1 % on the simulated test sets (95.9 ± 0.1 % across ten training resamples).</w:t>
       </w:r>
     </w:p>
     <w:p>
@@ -1082,7 +1106,7 @@
           <w:b w:val="0"/>
           <w:i w:val="0"/>
         </w:rPr>
-        <w:t>Each departure from the simulator re-rendered or modified the same test planets, so every loss was a within-planet difference against the same noise draw. Table 2 lists the departures. Hazes and clouds are common among observed hot Jupiters, whose spectra span a continuum from clear to strongly muted (27). Haze followed the Lee et al. prescription (28) with 0.1 µm particles. On the Rayleigh-enhancement scale used in retrievals of observed hot Jupiters (29), where the haze opacity at 0.35 µm is expressed as a multiple a of the H₂ Rayleigh opacity, the densities 3 × 10⁷, 2.4 × 10⁸ and 10¹⁰ m⁻³ correspond to log₁₀ a ≈ 2.4-2.7, 3.3-3.6 and 4.9-5.2 at 1 mbar. The ten hot Jupiters of that retrieval study spanned log₁₀ a = 2.1-5.7 (29), so 3 × 10⁷ m⁻³ lies at the weak end of the observed range. Unocculted spots used PHOENIX spectra (30) at a spot-to-photosphere temperature ratio of 0.85 (31).</w:t>
+        <w:t>Each departure from the simulator re-rendered or modified the same test planets, so every loss was a within-planet difference against the same noise draw. Table 2 lists the departures. Hazes and clouds are common among observed hot Jupiters, whose spectra span a continuum from clear to strongly muted (9). Haze followed the Lee et al. prescription (30) with 0.1 µm particles. On the Rayleigh-enhancement scale used in retrievals of observed hot Jupiters (10), where the haze opacity at 0.35 µm is expressed as a multiple a of the H₂ Rayleigh opacity, the densities 3 × 10⁷, 2.4 × 10⁸ and 10¹⁰ m⁻³ correspond to log₁₀ a ≈ 2.4-2.7, 3.3-3.6 and 4.9-5.2 at 1 mbar. The ten hot Jupiters of that retrieval study spanned log₁₀ a = 2.1-5.7 (10), so 3 × 10⁷ m⁻³ lies at the weak end of the observed range. Unocculted spots used PHOENIX spectra (31) at a spot-to-photosphere temperature ratio of 0.85 (11).</w:t>
       </w:r>
     </w:p>
     <w:p>
@@ -1643,7 +1667,7 @@
           <w:b w:val="0"/>
           <w:i w:val="0"/>
         </w:rPr>
-        <w:t>Five quantities were measured for each departure, at the 10⁻⁴ threshold and averaged over the four classifiers and four molecules unless stated. (i) The loss: clean accuracy minus accuracy under the departure. (ii) The irreducible loss: clean accuracy minus the accuracy of the same design retrained on training spectra with the same departure, so that the reducible part of a loss was measured against what retraining could achieve. (iii) Absorption: the loss of the design retrained on a randomized training grid, in which each planet carried a haze (60 % of planets, log-uniform 10⁵-3 × 10⁸ m⁻³), spots (70 %, 0-20 %) and a noise level 1-3 times the nominal one, drawn independently (32); three further variants each left one ingredient out, to measure whether robustness transferred to a departure never seen (9). (iv) Detection: five rules for declining a planet, namely the probability margin, the spread of the four classifiers' probabilities (33), the Mahalanobis distance (34), the k-nearest-neighbour distance (35) and a principal-component reconstruction error. Each rule's threshold was fixed to decline 10 % of clean test planets, and each rule was credited only with the accuracy of accepted planets above the clean selective baseline at the same coverage (10, 36). (v) Calibration: expected calibration error and the coverage of split-conformal prediction sets calibrated to 90 % on half of the clean planets (37, 38), for the three classifiers that output probabilities.</w:t>
+        <w:t>Five quantities were measured for each departure, at the 10⁻⁴ threshold and averaged over the four classifiers and four molecules unless stated. (i) The loss: clean accuracy minus accuracy under the departure. (ii) The irreducible loss: clean accuracy minus the accuracy of the same design retrained on training spectra with the same departure, so that the reducible part of a loss was measured against what retraining could achieve. (iii) Absorption: the loss of the design retrained on a randomized training grid, in which each planet carried a haze (60 % of planets, log-uniform 10⁵-3 × 10⁸ m⁻³), spots (70 %, 0-20 %) and a noise level 1-3 times the nominal one, drawn independently (32); three further variants each left one ingredient out, to measure whether robustness transferred to a departure never seen (15). (iv) Detection: five rules for declining a planet, namely the probability margin, the spread of the four classifiers' probabilities (33), the Mahalanobis distance (34), the k-nearest-neighbour distance (35) and a principal-component reconstruction error. Each rule's threshold was fixed to decline 10 % of clean test planets, and each rule was credited only with the accuracy of accepted planets above the clean selective baseline at the same coverage (16, 36). (v) Calibration: expected calibration error and the coverage of split-conformal prediction sets calibrated to 90 % on half of the clean planets (37, 38), for the three classifiers that output probabilities.</w:t>
       </w:r>
     </w:p>
     <w:p>
@@ -5319,7 +5343,7 @@
           <w:b w:val="0"/>
           <w:i w:val="0"/>
         </w:rPr>
-        <w:t>The carbon-rich classifier responded almost oppositely to the two departures that separated trust from distrust for the consortium classifier (Figure 4). HCN and C₂H₂ become major constituents of carbon-rich atmospheres above about 800 K (22, 23) but are absent from the five-gas grid of the Ariel Data Challenge database (6) and from the second classifier's training grid. Adding them at their equilibrium abundances lowered accuracy on carbon-rich planets from 97.6 % to 48.9 % on the simulated test sets, while accuracy on oxygen-rich planets was unchanged (94.5 and 95.7 %). On the known Ariel targets under the payload noise model, the corresponding accuracy fell from 93.0 to 65.0 % at Tier-3 binning, from 91.4 to 61.9 % at Tier-2 binning and from 84.0 to 58.4 % at Tier-1 binning. The classifier remained confident: its expected calibration error rose from 0.009 to 0.240 and the mean probability it assigned to a true carbon-rich planet fell from 0.96 to 0.47. Retraining with the two absorbers in the grid restored 96.1 %, and a randomized grid containing haze, clouds, spots, noise and disequilibrium chemistry did not help (75.6 %). Unlike the consortium classifier, this classifier's errors were flagged by distance scores (AUROC 0.90-0.91 for ranking errors) and not by its confidence (0.70). Two absorbers that carry no information about whether CH₄ or H₂O exceeds 10⁻⁴ cost the consortium classifier nothing; two absorbers tied by chemistry to C/O cost the carbon-rich classifier 26-30 points on carbon-rich targets.</w:t>
+        <w:t>The carbon-rich classifier responded almost oppositely to the two departures that separated trust from distrust for the consortium classifier (Figure 4). HCN and C₂H₂ become major constituents of carbon-rich atmospheres above about 800 K (14, 26) but are absent from the five-gas grid of the Ariel Data Challenge database (5) and from the second classifier's training grid. Adding them at their equilibrium abundances lowered accuracy on carbon-rich planets from 97.6 % to 48.9 % on the simulated test sets, while accuracy on oxygen-rich planets was unchanged (94.5 and 95.7 %). On the known Ariel targets under the payload noise model, the corresponding accuracy fell from 93.0 to 65.0 % at Tier-3 binning, from 91.4 to 61.9 % at Tier-2 binning and from 84.0 to 58.4 % at Tier-1 binning. The classifier remained confident: its expected calibration error rose from 0.009 to 0.240 and the mean probability it assigned to a true carbon-rich planet fell from 0.96 to 0.47. Retraining with the two absorbers in the grid restored 96.1 %, and a randomized grid containing haze, clouds, spots, noise and disequilibrium chemistry did not help (75.6 %). Unlike the consortium classifier, this classifier's errors were flagged by distance scores (AUROC 0.90-0.91 for ranking errors) and not by its confidence (0.70). Two absorbers that carry no information about whether CH₄ or H₂O exceeds 10⁻⁴ cost the consortium classifier nothing; two absorbers tied by chemistry to C/O cost the carbon-rich classifier 26-30 points on carbon-rich targets.</w:t>
       </w:r>
     </w:p>
     <w:p>
@@ -5861,7 +5885,7 @@
           <w:b w:val="0"/>
           <w:i w:val="0"/>
         </w:rPr>
-        <w:t>The main surprise was not among the expectations: the classifier's failure under haze came from its optical photometric inputs while the molecular bands were intact, and it became more confident as it failed. Four expectations about recoverability were wrong in the same direction, since the losses to aerosols turned out to be largely recoverable. The reversed dependence of the spot loss on host type, which is contrary to the stronger chromatic contamination of M dwarfs (31), was not explained and is not used in any conclusion.</w:t>
+        <w:t>The main surprise was not among the expectations: the classifier's failure under haze came from its optical photometric inputs while the molecular bands were intact, and it became more confident as it failed. Four expectations about recoverability were wrong in the same direction, since the losses to aerosols turned out to be largely recoverable. The reversed dependence of the spot loss on host type, which is contrary to the stronger chromatic contamination of M dwarfs (11), was not explained and is not used in any conclusion.</w:t>
       </w:r>
     </w:p>
     <w:p>
@@ -5892,7 +5916,7 @@
           <w:b w:val="0"/>
           <w:i w:val="0"/>
         </w:rPr>
-        <w:t>All spectra, including those of the known Ariel targets, were simulated, so the test measured behaviour under departures from one simulator family rather than on real observations. The consortium classifiers were described as a preliminary assessment (5), not as an adopted mission pipeline, and the results apply to the published design as re-implemented here; the trained models of the original study were not available. The re-implementation used Exo-Transmit opacities and a payload noise model in place of ExoMol and ArielRad, with the measured consequences given in Section 2.2. The haze prescription was one parameterisation, anchored to retrieved hot-Jupiter hazes through an order-of-magnitude conversion that depends on the assumed pressure level. The carbon-rich classifier is not a published proposal; it served as a counterexample, and its grid of independently drawn parameters and its atmosphere truncated at 1-10 Pa are assumptions documented in the repository. No machine-learning retrieval trained on the Ariel Data Challenge database was tested.</w:t>
+        <w:t>All spectra, including those of the known Ariel targets, were simulated, so the test measured behaviour under departures from one simulator family rather than on real observations. The consortium classifiers were described as a preliminary assessment (6), not as an adopted mission pipeline, and the results apply to the published design as re-implemented here; the trained models of the original study were not available. The re-implementation used Exo-Transmit opacities and a payload noise model in place of ExoMol and ArielRad, with the measured consequences given in Section 2.2. The haze prescription was one parameterisation, anchored to retrieved hot-Jupiter hazes through an order-of-magnitude conversion that depends on the assumed pressure level. The carbon-rich classifier is not a published proposal; it served as a counterexample, and its grid of independently drawn parameters and its atmosphere truncated at 1-10 Pa are assumptions documented in the repository. No machine-learning retrieval trained on the Ariel Data Challenge database was tested.</w:t>
       </w:r>
     </w:p>
     <w:p>
@@ -6040,7 +6064,7 @@
           <w:b w:val="0"/>
           <w:i w:val="0"/>
         </w:rPr>
-        <w:t xml:space="preserve"> Accuracy (%) of the re-implemented classifiers and the published values (5) for each classifier, molecule and abundance threshold (POP-III training, POP-I test).</w:t>
+        <w:t xml:space="preserve"> Accuracy (%) of the re-implemented classifiers and the published values (6) for each classifier, molecule and abundance threshold (POP-III training, POP-I test).</w:t>
       </w:r>
     </w:p>
     <w:tbl>
@@ -8387,7 +8411,7 @@
           <w:b w:val="0"/>
           <w:i w:val="0"/>
         </w:rPr>
-        <w:t>Mugnai LV, Al-Refaie A, Bocchieri A, Changeat Q, Pascale E, Tinetti G. Alfnoor: assessing the information content of Ariel's low-resolution spectra with planetary population studies. Astron J, 162: 288, 2021. https://doi.org/10.3847/1538-3881/ac2e92</w:t>
+        <w:t>Changeat Q, Yip KH. ESA-Ariel Data Challenge NeurIPS 2022: introduction to exo-atmospheric studies and presentation of the Atmospheric Big Challenge (ABC) database. RAS Tech Instrum, 2: 45-61, 2023. https://doi.org/10.1093/rasti/rzad001</w:t>
       </w:r>
     </w:p>
     <w:p>
@@ -8402,7 +8426,7 @@
           <w:b w:val="0"/>
           <w:i w:val="0"/>
         </w:rPr>
-        <w:t>Changeat Q, Yip KH. ESA-Ariel Data Challenge NeurIPS 2022: introduction to exo-atmospheric studies and presentation of the Atmospheric Big Challenge (ABC) database. RAS Tech Instrum, 2: 45-61, 2023. https://doi.org/10.1093/rasti/rzad001</w:t>
+        <w:t>Mugnai LV, Al-Refaie A, Bocchieri A, Changeat Q, Pascale E, Tinetti G. Alfnoor: assessing the information content of Ariel's low-resolution spectra with planetary population studies. Astron J, 162: 288, 2021. https://doi.org/10.3847/1538-3881/ac2e92</w:t>
       </w:r>
     </w:p>
     <w:p>
@@ -8447,7 +8471,7 @@
           <w:b w:val="0"/>
           <w:i w:val="0"/>
         </w:rPr>
-        <w:t>Hendrycks D, Dietterich T. Benchmarking neural network robustness to common corruptions and perturbations. Int Conf Learn Represent, 2019. https://doi.org/10.48550/arXiv.1903.12261</w:t>
+        <w:t>Sing DK, Fortney JJ, Nikolov N, et al. A continuum from clear to cloudy hot-Jupiter exoplanets without primordial water depletion. Nature, 529: 59-62, 2016. https://doi.org/10.1038/nature16068</w:t>
       </w:r>
     </w:p>
     <w:p>
@@ -8462,7 +8486,7 @@
           <w:b w:val="0"/>
           <w:i w:val="0"/>
         </w:rPr>
-        <w:t>Jaeger PF, Lüth CT, Klein L, Bungert TJ. A call to reflect on evaluation practices for failure detection in image classification. Int Conf Learn Represent, 2023. https://doi.org/10.48550/arXiv.2211.15259</w:t>
+        <w:t>Pinhas A, Madhusudhan N, Gandhi S, MacDonald R. H2O abundances and cloud properties in ten hot giant exoplanets. Mon Not R Astron Soc, 482: 1485-1498, 2019. https://doi.org/10.1093/mnras/sty2544</w:t>
       </w:r>
     </w:p>
     <w:p>
@@ -8477,7 +8501,7 @@
           <w:b w:val="0"/>
           <w:i w:val="0"/>
         </w:rPr>
-        <w:t>Cannon P, Ward D, Schmon SM. Investigating the impact of model misspecification in neural simulation-based inference. arXiv, 2209.01845, 2022. https://doi.org/10.48550/arXiv.2209.01845</w:t>
+        <w:t>Rackham BV, Apai D, Giampapa MS. The transit light source effect: false spectral features and incorrect densities for M-dwarf transiting planets. Astrophys J, 853: 122, 2018. https://doi.org/10.3847/1538-4357/aaa08c</w:t>
       </w:r>
     </w:p>
     <w:p>
@@ -8492,7 +8516,7 @@
           <w:b w:val="0"/>
           <w:i w:val="0"/>
         </w:rPr>
-        <w:t>Schmitt M, Bürkner P-C, Köthe U, Radev ST. Detecting model misspecification in amortized Bayesian inference with neural networks. In: Pattern Recognition (DAGM GCPR 2023), Lecture Notes in Computer Science 14264: 541-557, 2024. https://doi.org/10.1007/978-3-031-54605-1_35</w:t>
+        <w:t>Kempton EM-R, Lupu R, Owusu-Asare A, Slough P, Cale B. Exo-Transmit: an open-source code for calculating transmission spectra for exoplanet atmospheres of varied composition. Publ Astron Soc Pac, 129: 044402, 2017. https://doi.org/10.1088/1538-3873/aa61ef</w:t>
       </w:r>
     </w:p>
     <w:p>
@@ -8507,7 +8531,7 @@
           <w:b w:val="0"/>
           <w:i w:val="0"/>
         </w:rPr>
-        <w:t>Ardévol Martínez F, Min M, Kamp I, Palmer PI. Convolutional neural networks as an alternative to Bayesian retrievals for interpreting exoplanet transmission spectra. Astron Astrophys, 662: A108, 2022. https://doi.org/10.1051/0004-6361/202142976</w:t>
+        <w:t>Chubb KL, Rocchetto M, Yurchenko SN, et al. The ExoMolOP database: cross sections and k-tables for molecules of interest in high-temperature exoplanet atmospheres. Astron Astrophys, 646: A21, 2021. https://doi.org/10.1051/0004-6361/202038350</w:t>
       </w:r>
     </w:p>
     <w:p>
@@ -8522,7 +8546,7 @@
           <w:b w:val="0"/>
           <w:i w:val="0"/>
         </w:rPr>
-        <w:t>Pedregosa F, Varoquaux G, Gramfort A, et al. Scikit-learn: machine learning in Python. J Mach Learn Res, 12: 2825-2830, 2011. https://doi.org/10.48550/arXiv.1201.0490</w:t>
+        <w:t>Madhusudhan N. C/O ratio as a dimension for characterizing exoplanetary atmospheres. Astrophys J, 758: 36, 2012. https://doi.org/10.1088/0004-637X/758/1/36</w:t>
       </w:r>
     </w:p>
     <w:p>
@@ -8537,7 +8561,7 @@
           <w:b w:val="0"/>
           <w:i w:val="0"/>
         </w:rPr>
-        <w:t>Kempton EM-R, Lupu R, Owusu-Asare A, Slough P, Cale B. Exo-Transmit: an open-source code for calculating transmission spectra for exoplanet atmospheres of varied composition. Publ Astron Soc Pac, 129: 044402, 2017. https://doi.org/10.1088/1538-3873/aa61ef</w:t>
+        <w:t>Hendrycks D, Dietterich T. Benchmarking neural network robustness to common corruptions and perturbations. Int Conf Learn Represent, 2019. https://doi.org/10.48550/arXiv.1903.12261</w:t>
       </w:r>
     </w:p>
     <w:p>
@@ -8552,7 +8576,7 @@
           <w:b w:val="0"/>
           <w:i w:val="0"/>
         </w:rPr>
-        <w:t>Freedman RS, Lustig-Yaeger J, Fortney JJ, Lupu RE, Marley MS, Lodders K. Gaseous mean opacities for giant planet and ultracool dwarf atmospheres over a range of metallicities and temperatures. Astrophys J Suppl Ser, 214: 25, 2014. https://doi.org/10.1088/0067-0049/214/2/25</w:t>
+        <w:t>Jaeger PF, Lüth CT, Klein L, Bungert TJ. A call to reflect on evaluation practices for failure detection in image classification. Int Conf Learn Represent, 2023. https://doi.org/10.48550/arXiv.2211.15259</w:t>
       </w:r>
     </w:p>
     <w:p>
@@ -8567,7 +8591,7 @@
           <w:b w:val="0"/>
           <w:i w:val="0"/>
         </w:rPr>
-        <w:t>Chubb KL, Rocchetto M, Yurchenko SN, et al. The ExoMolOP database: cross sections and k-tables for molecules of interest in high-temperature exoplanet atmospheres. Astron Astrophys, 646: A21, 2021. https://doi.org/10.1051/0004-6361/202038350</w:t>
+        <w:t>Cannon P, Ward D, Schmon SM. Investigating the impact of model misspecification in neural simulation-based inference. arXiv, 2209.01845, 2022. https://doi.org/10.48550/arXiv.2209.01845</w:t>
       </w:r>
     </w:p>
     <w:p>
@@ -8582,7 +8606,7 @@
           <w:b w:val="0"/>
           <w:i w:val="0"/>
         </w:rPr>
-        <w:t>Al-Refaie AF, Changeat Q, Waldmann IP, Tinetti G. TauREx 3: a fast, dynamic, and extendable framework for retrievals. Astrophys J, 917: 37, 2021. https://doi.org/10.3847/1538-4357/ac0252</w:t>
+        <w:t>Schmitt M, Bürkner P-C, Köthe U, Radev ST. Detecting model misspecification in amortized Bayesian inference with neural networks. In: Pattern Recognition (DAGM GCPR 2023), Lecture Notes in Computer Science 14264: 541-557, 2024. https://doi.org/10.1007/978-3-031-54605-1_35</w:t>
       </w:r>
     </w:p>
     <w:p>
@@ -8597,7 +8621,7 @@
           <w:b w:val="0"/>
           <w:i w:val="0"/>
         </w:rPr>
-        <w:t>Duque-Castaño DS, Zuluaga JI, Flor-Torres L. Machine-assisted classification of potential biosignatures in Earth-like exoplanets using low signal-to-noise ratio transmission spectra. Mon Not R Astron Soc, 539: 1528-1552, 2025. https://doi.org/10.1093/mnras/staf563</w:t>
+        <w:t>Ardévol Martínez F, Min M, Kamp I, Palmer PI. Convolutional neural networks as an alternative to Bayesian retrievals for interpreting exoplanet transmission spectra. Astron Astrophys, 662: A108, 2022. https://doi.org/10.1051/0004-6361/202142976</w:t>
       </w:r>
     </w:p>
     <w:p>
@@ -8612,7 +8636,7 @@
           <w:b w:val="0"/>
           <w:i w:val="0"/>
         </w:rPr>
-        <w:t>Yang O. ExoTransmitOpacity reads Exo-Transmit table pressures as bar (x1e5), but the tables are in Pa. TauREx 3 issue 172, GitHub, 2026. https://github.com/ucl-exoplanets/taurex3/issues/172</w:t>
+        <w:t>Pedregosa F, Varoquaux G, Gramfort A, et al. Scikit-learn: machine learning in Python. J Mach Learn Res, 12: 2825-2830, 2011. https://doi.org/10.48550/arXiv.1201.0490</w:t>
       </w:r>
     </w:p>
     <w:p>
@@ -8627,7 +8651,7 @@
           <w:b w:val="0"/>
           <w:i w:val="0"/>
         </w:rPr>
-        <w:t>Mugnai LV, Bocchieri A, Pascale E, Lorenzani A, Papageorgiou A. ExoSim 2: the new exoplanet observation simulator applied to the Ariel space mission. Exp Astron, 59: 9, 2025. https://doi.org/10.1007/s10686-024-09976-2</w:t>
+        <w:t>Freedman RS, Lustig-Yaeger J, Fortney JJ, Lupu RE, Marley MS, Lodders K. Gaseous mean opacities for giant planet and ultracool dwarf atmospheres over a range of metallicities and temperatures. Astrophys J Suppl Ser, 214: 25, 2014. https://doi.org/10.1088/0067-0049/214/2/25</w:t>
       </w:r>
     </w:p>
     <w:p>
@@ -8642,7 +8666,7 @@
           <w:b w:val="0"/>
           <w:i w:val="0"/>
         </w:rPr>
-        <w:t>Madhusudhan N. C/O ratio as a dimension for characterizing exoplanetary atmospheres. Astrophys J, 758: 36, 2012. https://doi.org/10.1088/0004-637X/758/1/36</w:t>
+        <w:t>Al-Refaie AF, Changeat Q, Waldmann IP, Tinetti G. TauREx 3: a fast, dynamic, and extendable framework for retrievals. Astrophys J, 917: 37, 2021. https://doi.org/10.3847/1538-4357/ac0252</w:t>
       </w:r>
     </w:p>
     <w:p>
@@ -8657,7 +8681,7 @@
           <w:b w:val="0"/>
           <w:i w:val="0"/>
         </w:rPr>
-        <w:t>Moses JI, Madhusudhan N, Visscher C, Freedman RS. Chemical consequences of the C/O ratio on hot Jupiters: examples from WASP-12b, CoRoT-2b, XO-1b, and HD 189733b. Astrophys J, 763: 25, 2013. https://doi.org/10.1088/0004-637X/763/1/25</w:t>
+        <w:t>Duque-Castaño DS, Zuluaga JI, Flor-Torres L. Machine-assisted classification of potential biosignatures in Earth-like exoplanets using low signal-to-noise ratio transmission spectra. Mon Not R Astron Soc, 539: 1528-1552, 2025. https://doi.org/10.1093/mnras/staf563</w:t>
       </w:r>
     </w:p>
     <w:p>
@@ -8672,7 +8696,7 @@
           <w:b w:val="0"/>
           <w:i w:val="0"/>
         </w:rPr>
-        <w:t>Stock JW, Kitzmann D, Patzer ABC, Sedlmayr E. FastChem: a computer program for efficient complex chemical equilibrium calculations in the neutral/ionized gas phase with applications to stellar and planetary atmospheres. Mon Not R Astron Soc, 479: 865-874, 2018. https://doi.org/10.1093/mnras/sty1531</w:t>
+        <w:t>Yang O. ExoTransmitOpacity reads Exo-Transmit table pressures as bar (x1e5), but the tables are in Pa. TauREx 3 issue 172, GitHub, 2026. https://github.com/ucl-exoplanets/taurex3/issues/172</w:t>
       </w:r>
     </w:p>
     <w:p>
@@ -8687,7 +8711,7 @@
           <w:b w:val="0"/>
           <w:i w:val="0"/>
         </w:rPr>
-        <w:t>Mugnai LV, Pascale E, Edwards B, Papageorgiou A, Sarkar S. ArielRad: the Ariel radiometric model. Exp Astron, 50: 303-328, 2020. https://doi.org/10.1007/s10686-020-09676-7</w:t>
+        <w:t>Mugnai LV, Bocchieri A, Pascale E, Lorenzani A, Papageorgiou A. ExoSim 2: the new exoplanet observation simulator applied to the Ariel space mission. Exp Astron, 59: 9, 2025. https://doi.org/10.1007/s10686-024-09976-2</w:t>
       </w:r>
     </w:p>
     <w:p>
@@ -8702,7 +8726,7 @@
           <w:b w:val="0"/>
           <w:i w:val="0"/>
         </w:rPr>
-        <w:t>Chen T, Guestrin C. XGBoost: a scalable tree boosting system. Proc 22nd ACM SIGKDD Int Conf Knowl Discov Data Min, 785-794, 2016. https://doi.org/10.1145/2939672.2939785</w:t>
+        <w:t>Moses JI, Madhusudhan N, Visscher C, Freedman RS. Chemical consequences of the C/O ratio on hot Jupiters: examples from WASP-12b, CoRoT-2b, XO-1b, and HD 189733b. Astrophys J, 763: 25, 2013. https://doi.org/10.1088/0004-637X/763/1/25</w:t>
       </w:r>
     </w:p>
     <w:p>
@@ -8717,7 +8741,7 @@
           <w:b w:val="0"/>
           <w:i w:val="0"/>
         </w:rPr>
-        <w:t>Sing DK, Fortney JJ, Nikolov N, et al. A continuum from clear to cloudy hot-Jupiter exoplanets without primordial water depletion. Nature, 529: 59-62, 2016. https://doi.org/10.1038/nature16068</w:t>
+        <w:t>Stock JW, Kitzmann D, Patzer ABC, Sedlmayr E. FastChem: a computer program for efficient complex chemical equilibrium calculations in the neutral/ionized gas phase with applications to stellar and planetary atmospheres. Mon Not R Astron Soc, 479: 865-874, 2018. https://doi.org/10.1093/mnras/sty1531</w:t>
       </w:r>
     </w:p>
     <w:p>
@@ -8732,7 +8756,7 @@
           <w:b w:val="0"/>
           <w:i w:val="0"/>
         </w:rPr>
-        <w:t>Lee J-M, Heng K, Irwin PGJ. Atmospheric retrieval analysis of the directly imaged exoplanet HR 8799b. Astrophys J, 778: 97, 2013. https://doi.org/10.1088/0004-637X/778/2/97</w:t>
+        <w:t>Mugnai LV, Pascale E, Edwards B, Papageorgiou A, Sarkar S. ArielRad: the Ariel radiometric model. Exp Astron, 50: 303-328, 2020. https://doi.org/10.1007/s10686-020-09676-7</w:t>
       </w:r>
     </w:p>
     <w:p>
@@ -8747,7 +8771,7 @@
           <w:b w:val="0"/>
           <w:i w:val="0"/>
         </w:rPr>
-        <w:t>Pinhas A, Madhusudhan N, Gandhi S, MacDonald R. H2O abundances and cloud properties in ten hot giant exoplanets. Mon Not R Astron Soc, 482: 1485-1498, 2019. https://doi.org/10.1093/mnras/sty2544</w:t>
+        <w:t>Chen T, Guestrin C. XGBoost: a scalable tree boosting system. Proc 22nd ACM SIGKDD Int Conf Knowl Discov Data Min, 785-794, 2016. https://doi.org/10.1145/2939672.2939785</w:t>
       </w:r>
     </w:p>
     <w:p>
@@ -8762,7 +8786,7 @@
           <w:b w:val="0"/>
           <w:i w:val="0"/>
         </w:rPr>
-        <w:t>Husser T-O, Wende-von Berg S, Dreizler S, et al. A new extensive library of PHOENIX stellar atmospheres and synthetic spectra. Astron Astrophys, 553: A6, 2013. https://doi.org/10.1051/0004-6361/201219058</w:t>
+        <w:t>Lee J-M, Heng K, Irwin PGJ. Atmospheric retrieval analysis of the directly imaged exoplanet HR 8799b. Astrophys J, 778: 97, 2013. https://doi.org/10.1088/0004-637X/778/2/97</w:t>
       </w:r>
     </w:p>
     <w:p>
@@ -8777,7 +8801,7 @@
           <w:b w:val="0"/>
           <w:i w:val="0"/>
         </w:rPr>
-        <w:t>Rackham BV, Apai D, Giampapa MS. The transit light source effect: false spectral features and incorrect densities for M-dwarf transiting planets. Astrophys J, 853: 122, 2018. https://doi.org/10.3847/1538-4357/aaa08c</w:t>
+        <w:t>Husser T-O, Wende-von Berg S, Dreizler S, et al. A new extensive library of PHOENIX stellar atmospheres and synthetic spectra. Astron Astrophys, 553: A6, 2013. https://doi.org/10.1051/0004-6361/201219058</w:t>
       </w:r>
     </w:p>
     <w:p>

</xml_diff>

<commit_message>
Figure 1 and 2 sized per figure; separate JPEG figures for submission (old figures moved to superseded); references corrected against Crossref/DataCite records (Radica authors, Tibshirani co-author name, NeurIPS pages); abstract/conclusion scoped to full resolution; release of the re-implementation named in the introduction
</commit_message>
<xml_diff>
--- a/v3/jhss/manuscript.docx
+++ b/v3/jhss/manuscript.docx
@@ -75,7 +75,7 @@
           <w:b w:val="0"/>
           <w:i w:val="0"/>
         </w:rPr>
-        <w:t>Machine-learning classifiers have been proposed for sorting the roughly 1,000 planets of Ariel's Tier-1 reconnaissance survey by composition, but no Ariel data exist, so such classifiers have been trained and validated only on spectra from the simulator that produced them. This technical note asked whether one such classifier could be trusted when real atmospheres differ from the simulator. The molecular classifiers proposed in the Ariel consortium's Tier-1 population study, whose code was not released, were re-implemented from the published description; the re-implementation reproduced all 48 published accuracies within 3.7 points. The classifier was then tested against fifteen physically motivated departures from its simulator. For each departure the test measured the accuracy lost, the part of that loss a retrained classifier could recover, whether training on a randomized grid absorbed it, and whether confidence scores, distance-based novelty scores or conformal prediction flagged the errors. The classifier was robust to an alternative opacity database, an alternative radiative-transfer code and two omitted absorbers (losses of 0.1-3.5 points). It was not robust to haze: at a haze strength comparable to the weakest retrieved for observed hot Jupiters, it reported methane and water absent on nearly every planet that contained them, with rising confidence and no warning from its own ensemble, although 87 % of the loss was recoverable. Removing the three optical photometric points from its input removed most of this failure, which identified those points as the cause. A second classifier, built for a different Ariel science question, showed the opposite pattern, so the trust profile of one classifier did not carry over to another. Each classifier therefore needs its own stress test before its outputs are used to select planets.</w:t>
+        <w:t>Machine-learning classifiers have been proposed for sorting the roughly 1,000 planets of Ariel's Tier-1 reconnaissance survey by composition, but no Ariel data exist, so such classifiers have been trained and validated only on spectra from the simulator that produced them. This technical note asked whether one such classifier could be trusted when real atmospheres differ from the simulator. The molecular classifiers proposed in the Ariel consortium's Tier-1 population study, whose code was not released, were re-implemented from the published description; the re-implementation reproduced all 48 published accuracies within 3.7 points. The classifier was then tested against fifteen physically motivated departures from its simulator. For each departure the test measured the accuracy lost, the part of that loss a retrained classifier could recover, whether training on a randomized grid absorbed it, and whether confidence scores, distance-based novelty scores or conformal prediction flagged the errors. The classifier was robust to an alternative opacity database, an alternative radiative-transfer code and two omitted absorbers (losses of 0.1-3.5 points). It was not robust to haze: at a haze strength comparable to the weakest retrieved for observed hot Jupiters, it reported methane and water absent on nearly every planet that contained them, with rising confidence and no warning from its own ensemble, although 87 % of the loss was recoverable. Removing the three optical photometric points from its input removed most of this failure, which identified those points as the cause. A second classifier, built for a different Ariel science question, showed a nearly opposite pattern at full resolution, so the trust profile of one classifier did not carry over to another. Each classifier therefore needs its own stress test before its outputs are used to select planets.</w:t>
       </w:r>
     </w:p>
     <w:p>
@@ -185,7 +185,7 @@
           <w:b w:val="0"/>
           <w:i w:val="0"/>
         </w:rPr>
-        <w:t>The test showed that the published design was robust to a different opacity database, a different radiative-transfer code and omitted absorbers, but was confidently blind to haze of an observed strength: it reported methane and water absent while their infrared bands were intact, because it relied on the three optical photometric points. The second classifier had a nearly opposite profile. These results are useful in three ways. Anyone applying or extending the consortium design gains a specific weakness and two remedies. Anyone proposing a classifier for Ariel gains a stress-test procedure, applicable to any classifier trained on simulated spectra, with released scripts for the two classifiers studied here. And selecting Ariel's deeper-tier targets with any simulator-trained classifier gains a concrete requirement: the classifier must be tested on its own, against the ways its simulator can be wrong, before its outputs are used. All code, result tables and the expectations recorded before the runs are in a public repository directory (see Data and Code Availability).</w:t>
+        <w:t>The test showed that the published design was robust to a different opacity database, a different radiative-transfer code and omitted absorbers, but was confidently blind to haze of an observed strength: it reported methane and water absent while their infrared bands were intact, because it relied on the three optical photometric points. The second classifier had a nearly opposite profile. These results are useful in three ways. Anyone applying or extending the consortium design gains an openly released re-implementation that reproduces the published results, together with a specific weakness and two remedies. Anyone proposing a classifier for Ariel gains a stress-test procedure, applicable to any classifier trained on simulated spectra, with released scripts for the two classifiers studied here. And selecting Ariel's deeper-tier targets with any simulator-trained classifier gains a concrete requirement: the classifier must be tested on its own, against the ways its simulator can be wrong, before its outputs are used. All code, result tables and the expectations recorded before the runs are in a public repository directory (see Data and Code Availability).</w:t>
       </w:r>
     </w:p>
     <w:p>
@@ -953,7 +953,7 @@
           <w:b w:val="0"/>
           <w:i/>
         </w:rPr>
-        <w:t>Unstated details and unavoidable deviations</w:t>
+        <w:t>Interpretation and unavoidable deviations</w:t>
       </w:r>
     </w:p>
     <w:p>
@@ -1715,7 +1715,7 @@
       <w:r>
         <w:drawing>
           <wp:inline xmlns:a="http://schemas.openxmlformats.org/drawingml/2006/main" xmlns:pic="http://schemas.openxmlformats.org/drawingml/2006/picture">
-            <wp:extent cx="5669280" cy="5576019"/>
+            <wp:extent cx="3108960" cy="3057817"/>
             <wp:docPr id="1" name="Picture 1"/>
             <wp:cNvGraphicFramePr>
               <a:graphicFrameLocks noChangeAspect="1"/>
@@ -1736,7 +1736,7 @@
                   <pic:spPr>
                     <a:xfrm>
                       <a:off x="0" y="0"/>
-                      <a:ext cx="5669280" cy="5576019"/>
+                      <a:ext cx="3108960" cy="3057817"/>
                     </a:xfrm>
                     <a:prstGeom prst="rect"/>
                   </pic:spPr>
@@ -1806,7 +1806,7 @@
       <w:r>
         <w:drawing>
           <wp:inline xmlns:a="http://schemas.openxmlformats.org/drawingml/2006/main" xmlns:pic="http://schemas.openxmlformats.org/drawingml/2006/picture">
-            <wp:extent cx="5669280" cy="3603381"/>
+            <wp:extent cx="5120640" cy="3254667"/>
             <wp:docPr id="2" name="Picture 2"/>
             <wp:cNvGraphicFramePr>
               <a:graphicFrameLocks noChangeAspect="1"/>
@@ -1827,7 +1827,7 @@
                   <pic:spPr>
                     <a:xfrm>
                       <a:off x="0" y="0"/>
-                      <a:ext cx="5669280" cy="3603381"/>
+                      <a:ext cx="5120640" cy="3254667"/>
                     </a:xfrm>
                     <a:prstGeom prst="rect"/>
                   </pic:spPr>
@@ -5319,7 +5319,7 @@
           <w:b w:val="0"/>
           <w:i w:val="0"/>
         </w:rPr>
-        <w:t>The carbon-rich classifier responded almost oppositely to the two departures that divided trust from distrust for the consortium classifier (Figure 4). HCN and C₂H₂, abundant in carbon-rich atmospheres above about 800 K (14, 26), are absent from its training grid, as from the Ariel Data Challenge grid (5). Added at equilibrium abundances, they lowered accuracy on carbon-rich planets from 97.6 to 48.9 % on the simulated test sets, leaving oxygen-rich planets unaffected (94.5 and 95.7 %). On the known Ariel targets with payload noise, carbon-rich accuracy fell from 93.0 to 65.0 % at Tier-3 binning, from 91.4 to 61.9 % at Tier 2 and from 84.0 to 58.4 % at Tier 1. The classifier stayed confident: expected calibration error rose from 0.009 to 0.240 and the mean probability assigned to true carbon-rich planets fell from 0.96 to 0.47. Retraining with the absorbers restored 96.1 %, while a randomized grid of haze, clouds, spots, noise and disequilibrium chemistry did not help (75.6 %). Unlike the consortium classifier's, its errors were ranked by distance scores (AUROC 0.90-0.91) but not by confidence (0.70). The contrast has a chemical reading: the added absorbers carry no information on whether CH₄ or H₂O exceeds 10⁻⁴, but are tied to C/O.</w:t>
+        <w:t>The carbon-rich classifier responded almost oppositely to the two departures that divided trust from distrust for the consortium classifier (Figure 4). HCN and C₂H₂, abundant in carbon-rich atmospheres above about 800 K (14, 26), are absent from its training grid, as from the Ariel Data Challenge grid (5). Added at equilibrium abundances, they lowered accuracy on carbon-rich planets from 97.6 to 48.9 % on the simulated test sets, leaving oxygen-rich planets unaffected (94.5 and 95.7 %). On the known Ariel targets with payload noise, carbon-rich accuracy fell from 93.0 to 65.0 % at Tier-3 binning, from 91.4 to 61.9 % at Tier 2 and from 84.0 to 58.4 % at Tier 1. The classifier stayed confident: expected calibration error rose from 0.009 to 0.240 and the mean probability assigned to true carbon-rich planets fell from 0.96 to 0.47. Retraining with the absorbers restored 96.1 %, while a randomized grid of haze, clouds, spots, noise and disequilibrium chemistry did not help (75.6 %). Its errors, unlike the consortium classifier's errors under haze, were ranked well by distance scores (AUROC 0.90-0.91), though not by confidence (0.70). The contrast has a chemical reading: the added absorbers carry no information on whether CH₄ or H₂O exceeds 10⁻⁴, but are tied to C/O.</w:t>
       </w:r>
     </w:p>
     <w:p>
@@ -5923,7 +5923,7 @@
           <w:b w:val="0"/>
           <w:i w:val="0"/>
         </w:rPr>
-        <w:t>The molecular classifiers proposed for Ariel's Tier-1 survey were re-implemented from their published description and reproduced the published accuracies within 3.7 points. A stress test against fifteen departures from the simulator showed that the classifiers could be trusted under changes of opacity database, radiative-transfer code and omitted absorbers, and could not be trusted under haze, star spots and high clouds. Under haze at the weak end of the range retrieved for observed hot Jupiters, the classifiers reported methane and water absent while the infrared bands were intact, became more confident, and gave no warning; the failure came from the three optical photometric inputs, and removing those inputs or training with hazes largely removed it. A second classifier, built for Ariel's carbon-to-oxygen objective, had a nearly opposite trust profile, so a stress test of one classifier does not stand in for another. Before any simulator-trained classifier is used to select planets for Ariel's deeper tiers, it should be subjected to its own stress test. The procedure applies to any classifier trained on simulated spectra whose forward model can be re-run; the scripts released with this note implement it for the two classifiers studied and can be adapted to others.</w:t>
+        <w:t>The molecular classifiers proposed for Ariel's Tier-1 survey were re-implemented from their published description and reproduced the published accuracies within 3.7 points. A stress test against fifteen departures from the simulator showed that the classifiers could be trusted under changes of opacity database, radiative-transfer code and omitted absorbers, and could not be trusted under haze, star spots and high clouds. Under haze at the weak end of the range retrieved for observed hot Jupiters, the classifiers reported methane and water absent while the infrared bands were intact, became more confident, and gave no warning; the failure came from the three optical photometric inputs, and removing those inputs or training with hazes largely removed it. A second classifier, built for Ariel's carbon-to-oxygen objective, had a nearly opposite trust profile at full resolution, so a stress test of one classifier does not stand in for another. Before any simulator-trained classifier is used to select planets for Ariel's deeper tiers, it should be subjected to its own stress test. The procedure applies to any classifier trained on simulated spectra whose forward model can be re-run; the scripts released with this note implement it for the two classifiers studied and can be adapted to others.</w:t>
       </w:r>
     </w:p>
     <w:p>
@@ -8372,7 +8372,7 @@
           <w:b w:val="0"/>
           <w:i w:val="0"/>
         </w:rPr>
-        <w:t>Radica M, et al. On the information content of Ariel transmission spectra: reassessing the tier system. arXiv, 2604.07598, 2026. https://doi.org/10.48550/arXiv.2604.07598</w:t>
+        <w:t>Radica M, Cowan NB, Cloutier R, Wang LY. On the information content of Ariel transmission spectra: reassessing the tier system. arXiv, 2604.07598, 2026. https://doi.org/10.48550/arXiv.2604.07598</w:t>
       </w:r>
     </w:p>
     <w:p>
@@ -8807,7 +8807,7 @@
           <w:b w:val="0"/>
           <w:i w:val="0"/>
         </w:rPr>
-        <w:t>Lakshminarayanan B, Pritzel A, Blundell C. Simple and scalable predictive uncertainty estimation using deep ensembles. Adv Neural Inf Process Syst, 30, 2017. https://doi.org/10.48550/arXiv.1612.01474</w:t>
+        <w:t>Lakshminarayanan B, Pritzel A, Blundell C. Simple and scalable predictive uncertainty estimation using deep ensembles. Adv Neural Inf Process Syst, 30: 6402-6413, 2017. https://doi.org/10.48550/arXiv.1612.01474</w:t>
       </w:r>
     </w:p>
     <w:p>
@@ -8822,7 +8822,7 @@
           <w:b w:val="0"/>
           <w:i w:val="0"/>
         </w:rPr>
-        <w:t>Lee K, Lee K, Lee H, Shin J. A simple unified framework for detecting out-of-distribution samples and adversarial attacks. Adv Neural Inf Process Syst, 31, 2018. https://doi.org/10.48550/arXiv.1807.03888</w:t>
+        <w:t>Lee K, Lee K, Lee H, Shin J. A simple unified framework for detecting out-of-distribution samples and adversarial attacks. Adv Neural Inf Process Syst, 31: 7167-7177, 2018. https://doi.org/10.48550/arXiv.1807.03888</w:t>
       </w:r>
     </w:p>
     <w:p>
@@ -8852,7 +8852,7 @@
           <w:b w:val="0"/>
           <w:i w:val="0"/>
         </w:rPr>
-        <w:t>Geifman Y, El-Yaniv R. Selective classification for deep neural networks. Adv Neural Inf Process Syst, 30, 2017. https://doi.org/10.48550/arXiv.1705.08500</w:t>
+        <w:t>Geifman Y, El-Yaniv R. Selective classification for deep neural networks. Adv Neural Inf Process Syst, 30: 4878-4887, 2017. https://doi.org/10.48550/arXiv.1705.08500</w:t>
       </w:r>
     </w:p>
     <w:p>
@@ -8882,7 +8882,7 @@
           <w:b w:val="0"/>
           <w:i w:val="0"/>
         </w:rPr>
-        <w:t>Tibshirani RJ, Foygel Barber R, Candès EJ, Ramdas A. Conformal prediction under covariate shift. Adv Neural Inf Process Syst, 32, 2019. https://doi.org/10.48550/arXiv.1904.06019</w:t>
+        <w:t>Tibshirani RJ, Barber RF, Candès EJ, Ramdas A. Conformal prediction under covariate shift. Adv Neural Inf Process Syst, 32: 2530-2540, 2019. https://doi.org/10.48550/arXiv.1904.06019</w:t>
       </w:r>
     </w:p>
     <w:sectPr>

</xml_diff>

<commit_message>
Figure 1 redrawn as a wide two-panel figure (reproduction scatter and per-cell differences) to remove the white space around it in the DOCX
</commit_message>
<xml_diff>
--- a/v3/jhss/manuscript.docx
+++ b/v3/jhss/manuscript.docx
@@ -1715,7 +1715,7 @@
       <w:r>
         <w:drawing>
           <wp:inline xmlns:a="http://schemas.openxmlformats.org/drawingml/2006/main" xmlns:pic="http://schemas.openxmlformats.org/drawingml/2006/picture">
-            <wp:extent cx="3108960" cy="3057817"/>
+            <wp:extent cx="5669280" cy="2348848"/>
             <wp:docPr id="1" name="Picture 1"/>
             <wp:cNvGraphicFramePr>
               <a:graphicFrameLocks noChangeAspect="1"/>
@@ -1736,7 +1736,7 @@
                   <pic:spPr>
                     <a:xfrm>
                       <a:off x="0" y="0"/>
-                      <a:ext cx="3108960" cy="3057817"/>
+                      <a:ext cx="5669280" cy="2348848"/>
                     </a:xfrm>
                     <a:prstGeom prst="rect"/>
                   </pic:spPr>
@@ -1765,7 +1765,7 @@
           <w:i w:val="0"/>
           <w:sz w:val="20"/>
         </w:rPr>
-        <w:t xml:space="preserve"> Re-implemented against published accuracy for the 48 combinations of classifier, molecule and abundance threshold. Dashed line: equality; grey band: ±5 points.</w:t>
+        <w:t xml:space="preserve"> The re-implementation against the published accuracies for the 48 combinations of classifier, molecule and abundance threshold. (a) Re-implemented against published accuracy; dashed line, equality. (b) Difference between the two for each combination, grouped by molecule, with marker shape giving the abundance threshold. Grey bands: ±5 points.</w:t>
       </w:r>
     </w:p>
     <w:p>

</xml_diff>

<commit_message>
Language pass: consistent American spelling (quotations kept verbatim), AUROC/NIRSpec/AIRS defined, abstract number agreement, awkward constructions fixed
</commit_message>
<xml_diff>
--- a/v3/jhss/manuscript.docx
+++ b/v3/jhss/manuscript.docx
@@ -75,7 +75,7 @@
           <w:b w:val="0"/>
           <w:i w:val="0"/>
         </w:rPr>
-        <w:t>Machine-learning classifiers have been proposed for sorting the roughly 1,000 planets of Ariel's Tier-1 reconnaissance survey by composition, but no Ariel data exist, so such classifiers have been trained and validated only on spectra from the simulator that produced them. This technical note asked whether one such classifier could be trusted when real atmospheres differ from the simulator. The molecular classifiers proposed in the Ariel consortium's Tier-1 population study, whose code was not released, were re-implemented from the published description; the re-implementation reproduced all 48 published accuracies within 3.7 points. The classifier was then tested against fifteen physically motivated departures from its simulator. For each departure the test measured the accuracy lost, the part of that loss a retrained classifier could recover, whether training on a randomized grid absorbed it, and whether confidence scores, distance-based novelty scores or conformal prediction flagged the errors. The classifier was robust to an alternative opacity database, an alternative radiative-transfer code and two omitted absorbers (losses of 0.1-3.5 points). It was not robust to haze: at a haze strength comparable to the weakest retrieved for observed hot Jupiters, it reported methane and water absent on nearly every planet that contained them, with rising confidence and no warning from its own ensemble, although 87 % of the loss was recoverable. Removing the three optical photometric points from its input removed most of this failure, which identified those points as the cause. A second classifier, built for a different Ariel science question, showed a nearly opposite pattern at full resolution, so the trust profile of one classifier did not carry over to another. Each classifier therefore needs its own stress test before its outputs are used to select planets.</w:t>
+        <w:t>Machine-learning classifiers have been proposed for sorting the roughly 1,000 planets of Ariel's Tier-1 reconnaissance survey by composition, but no Ariel data exist, so such classifiers have been trained and validated only on spectra from the simulator that produced them. This technical note asked whether one such classifier could be trusted when real atmospheres differ from the simulator. The molecular classifiers proposed in the Ariel consortium's Tier-1 population study, whose code was not released, were re-implemented from the published description; the re-implementation reproduced all 48 published accuracies within 3.7 points. The re-implemented classifiers were then tested against fifteen physically motivated departures from their simulator. For each departure the test measured the accuracy lost, the part of that loss a retrained classifier could recover, whether training on a randomized grid absorbed it, and whether confidence scores, distance-based novelty scores or conformal prediction flagged the errors. The classifiers were robust to an alternative opacity database, an alternative radiative-transfer code and two omitted absorbers (losses of 0.1-3.5 points). They were not robust to haze: at a haze strength comparable to the weakest retrieved for observed hot Jupiters, they reported methane and water absent on nearly every planet that contained them, with rising confidence and no warning from their own ensemble, although 87 % of the loss was recoverable. Removing the three optical photometric points from their input removed most of this failure, which identified those points as the cause. A second classifier, built for a different Ariel science question, showed a nearly opposite pattern at full resolution, so the trust profile of one classifier did not carry over to another. Each classifier therefore needs its own stress test before its outputs are used to select planets.</w:t>
       </w:r>
     </w:p>
     <w:p>
@@ -125,7 +125,7 @@
           <w:b w:val="0"/>
           <w:i w:val="0"/>
         </w:rPr>
-        <w:t>When a planet passes in front of its star, a small fraction of the starlight passes through the planet's atmosphere on its way to the observer. Molecules in the atmosphere absorb that light at their own characteristic wavelengths, so the apparent size of the planet changes with wavelength. The record of that change, the transmission spectrum, shows which molecules are present. Ariel, a European Space Agency mission scheduled for launch in 2029, will measure transmission spectra of about 1,000 transiting exoplanets between 0.5 and 7.8 µm, using three broadband photometers below 1.1 µm and three spectrometers above (1). Telescope time will not allow every planet to be studied deeply. The survey is therefore organised in tiers: every target is observed first at low signal-to-noise in a Tier-1 reconnaissance pass, and a substantial subset is then re-observed at higher precision in Tier 2 (1-4). Tier-1 data are expected to reveal the presence of molecular features and the degree of cloudiness (4), so they are the natural basis for deciding which planets receive the deeper observations. A planet judged uninteresting at Tier 1 may never be observed again.</w:t>
+        <w:t>When a planet passes in front of its star, a small fraction of the starlight passes through the planet's atmosphere on its way to the observer. Molecules in the atmosphere absorb that light at their own characteristic wavelengths, so the apparent size of the planet changes with wavelength. The record of that change, the transmission spectrum, shows which molecules are present. Ariel, a European Space Agency mission scheduled for launch in 2029, will measure transmission spectra of about 1,000 transiting exoplanets between 0.5 and 7.8 µm, using three broadband photometers below 1.1 µm and three spectrometer channels above it, NIRSpec, AIRS-CH0 and AIRS-CH1 (1). Telescope time will not allow every planet to be studied deeply. The survey is therefore organized in tiers: every target is observed first at low signal-to-noise in a Tier-1 reconnaissance pass, and a substantial subset is then re-observed at higher precision in Tier 2 (1-4). Tier-1 data are expected to reveal the presence of molecular features and the degree of cloudiness (4), so they are the natural basis for deciding which planets receive the deeper observations. A planet judged uninteresting at Tier 1 may never be observed again.</w:t>
       </w:r>
     </w:p>
     <w:p>
@@ -161,7 +161,7 @@
           <w:b w:val="0"/>
           <w:i w:val="0"/>
         </w:rPr>
-        <w:t>Deliberately altering the test data and measuring the consequences is established practice in machine learning (15, 16) and in simulation-based inference (17, 18). In exoplanet atmospheres, the nearest study tested a retrieval network on spectra with an added absorber, a removed absorber and unocculted star spots (19), and a recent flow-matching retrieval left model mismatch such as unmodelled clouds to future work (8). No test of this kind had been reported for a classifier proposed for Ariel's Tier-1 survey, and because the consortium's code was not released, any such test first requires an independent re-implementation that demonstrably matches the published results.</w:t>
+        <w:t>Deliberately altering the test data and measuring the consequences is established practice in machine learning (15, 16) and in simulation-based inference (17, 18). In exoplanet atmospheres, the nearest study tested a retrieval network on spectra with an added absorber, a removed absorber and unocculted star spots (19), and a recent flow-matching retrieval left model mismatch such as unmodeled clouds to future work (8). No test of this kind had been reported for a classifier proposed for Ariel's Tier-1 survey, and because the consortium's code was not released, any such test first requires an independent re-implementation that demonstrably matches the published results.</w:t>
       </w:r>
     </w:p>
     <w:p>
@@ -185,7 +185,7 @@
           <w:b w:val="0"/>
           <w:i w:val="0"/>
         </w:rPr>
-        <w:t>The test showed that the published design was robust to a different opacity database, a different radiative-transfer code and omitted absorbers, but was confidently blind to haze of an observed strength: it reported methane and water absent while their infrared bands were intact, because it relied on the three optical photometric points. The second classifier had a nearly opposite profile. These results are useful in three ways. Anyone applying or extending the consortium design gains an openly released re-implementation that reproduces the published results, together with a specific weakness and two remedies. Anyone proposing a classifier for Ariel gains a stress-test procedure, applicable to any classifier trained on simulated spectra, with released scripts for the two classifiers studied here. And selecting Ariel's deeper-tier targets with any simulator-trained classifier gains a concrete requirement: the classifier must be tested on its own, against the ways its simulator can be wrong, before its outputs are used. All code, result tables and the expectations recorded before the runs are in a public repository directory (see Data and Code Availability).</w:t>
+        <w:t>The test showed that the published design was robust to a different opacity database, a different radiative-transfer code and omitted absorbers, but was confidently blind to haze of an observed strength: it reported methane and water absent while their infrared bands were intact, because it relied on the three optical photometric points. The second classifier had a nearly opposite profile. These results are useful in three ways. Anyone applying or extending the consortium design gains an openly released re-implementation that reproduces the published results, together with a specific weakness and two remedies. Anyone proposing a classifier for Ariel gains a stress-test procedure, applicable to any classifier trained on simulated spectra, with released scripts for the two classifiers studied here. And anyone selecting Ariel's deeper-tier targets with a simulator-trained classifier gains a concrete requirement: the classifier must be tested on its own, against the ways its simulator can be wrong, before its outputs are used. All code, result tables and the expectations recorded before the runs are in a public repository directory (see Data and Code Availability).</w:t>
       </w:r>
     </w:p>
     <w:p>
@@ -235,7 +235,7 @@
           <w:b w:val="0"/>
           <w:i w:val="0"/>
         </w:rPr>
-        <w:t>The re-implementation followed Sections 2.2 and 2.5 of the consortium study (6) element by element (Table 1). Isothermal atmospheres with random temperatures, abundances of CH₄, H₂O, CO₂ and NH₃, and grey cloud decks were generated for every planet of the Ariel candidate list, four times for training (POP-III) and once for testing (POP-I). Spectra were binned at Tier-3 resolution, scattered with Tier-1 noise and normalised per spectrum. A molecule was labelled present if its abundance exceeded 10⁻⁵, 10⁻⁴ or 10⁻³, and four scikit-learn classifiers at default settings (20) were trained for each molecule and threshold; these defaults have not changed since version 0.22, the version the study cites.</w:t>
+        <w:t>The re-implementation followed Sections 2.2 and 2.5 of the consortium study (6) element by element (Table 1). Isothermal atmospheres with random temperatures, abundances of CH₄, H₂O, CO₂ and NH₃, and gray cloud decks were generated for every planet of the Ariel candidate list, four times for training (POP-III) and once for testing (POP-I). Spectra were binned at Tier-3 resolution, scattered with Tier-1 noise and normalized per spectrum. A molecule was labeled present if its abundance exceeded 10⁻⁵, 10⁻⁴ or 10⁻³, and four scikit-learn classifiers at default settings (20) were trained for each molecule and threshold; these defaults have not changed since version 0.22, the version the study cites.</w:t>
       </w:r>
     </w:p>
     <w:p>
@@ -614,7 +614,7 @@
                 <w:i w:val="0"/>
                 <w:sz w:val="18"/>
               </w:rPr>
-              <w:t>Grey opaque deck, 5 × 10² to 10⁶ Pa (p. 4)</w:t>
+              <w:t>Gray opaque deck, 5 × 10² to 10⁶ Pa (p. 4)</w:t>
             </w:r>
           </w:p>
         </w:tc>
@@ -798,7 +798,7 @@
                 <w:i w:val="0"/>
                 <w:sz w:val="18"/>
               </w:rPr>
-              <w:t>Normalisation</w:t>
+              <w:t>Normalization</w:t>
             </w:r>
           </w:p>
         </w:tc>
@@ -1063,7 +1063,7 @@
           <w:b w:val="0"/>
           <w:i w:val="0"/>
         </w:rPr>
-        <w:t>The second classifier addressed the carbon-to-oxygen ratio, a stated Ariel objective (1): an atmosphere was labelled carbon-rich if C/O &gt; 1, the chemical boundary above which oxygen is locked in CO and water is depleted (14, 26). Its grid held 18,040 training and 9,016 test atmospheres in five test sets, with independently drawn planet radius (1-26 R⊕), mass (1-300 M⊕), host temperature (2,500-7,500 K), atmospheric temperature (500-2,500 K), C/O (uniform, 0.2-1.8) and metallicity (uniform, −1 to 1.5 dex). Abundances of H₂O, CH₄, CO, CO₂, NH₃ and O₃ came from chemical equilibrium computed with FastChem (27) at 10⁻² bar. Spectra were binned to the Tier-3 layout of the mission's radiometric model (R = 15, 100 and 30; 102 points) (28) and to the seven-point Tier-1 layout, with noise at a signal-to-noise ratio of 15 on each spectrum's amplitude, or from the payload model of Section 2.3 for the known Ariel targets. Gradient-boosted trees (29) on per-spectrum-normalised bins, tuned by cross-validation, reached 96.1 % on the test sets (95.9 ± 0.1 % across ten training resamples).</w:t>
+        <w:t>The second classifier addressed the carbon-to-oxygen ratio, a stated Ariel objective (1): an atmosphere was labeled carbon-rich if C/O &gt; 1, the chemical boundary above which oxygen is locked in CO and water is depleted (14, 26). Its grid held 18,040 training and 9,016 test atmospheres in five test sets, with independently drawn planet radius (1-26 R⊕), mass (1-300 M⊕), host temperature (2,500-7,500 K), atmospheric temperature (500-2,500 K), C/O (uniform, 0.2-1.8) and metallicity (uniform, −1 to 1.5 dex). Abundances of H₂O, CH₄, CO, CO₂, NH₃ and O₃ came from chemical equilibrium computed with FastChem (27) at 10⁻² bar. Spectra were binned to the Tier-3 layout of the mission's radiometric model (R = 15, 100 and 30; 102 points) (28) and to the seven-point Tier-1 layout, with noise at a signal-to-noise ratio of 15 on each spectrum's amplitude, or from the payload model of Section 2.3 for the known Ariel targets. Gradient-boosted trees (29) on per-spectrum-normalized bins, tuned by cross-validation, reached 96.1 % on the test sets (95.9 ± 0.1 % across ten training resamples).</w:t>
       </w:r>
     </w:p>
     <w:p>
@@ -1106,7 +1106,7 @@
           <w:b w:val="0"/>
           <w:i w:val="0"/>
         </w:rPr>
-        <w:t>Each departure (Table 2) re-rendered or modified the same test planets, so every loss was a within-planet difference under the same noise draw. Haze followed the Lee et al. prescription (30) with 0.1 µm particles. Retrievals of ten observed hot Jupiters expressed haze opacity at 0.35 µm as a multiple a of the H₂ Rayleigh opacity and found log₁₀ a = 2.1-5.7 (10); at 1 mbar, the densities 3 × 10⁷, 2.4 × 10⁸ and 10¹⁰ m⁻³ used here correspond to log₁₀ a ≈ 2.4-2.7, 3.3-3.6 and 4.9-5.2, placing 3 × 10⁷ m⁻³ at the weak end of the observed range. Spots used PHOENIX spectra (31) at a spot-to-photosphere temperature ratio of 0.85 (11).</w:t>
+        <w:t>Each departure (Table 2) re-rendered or modified the same test planets, so every loss was a within-planet difference under the same noise draw. Haze followed the Lee et al. prescription (30) with particles of 0.1 µm radius. Retrievals of ten observed hot Jupiters expressed haze opacity at 0.35 µm as a multiple, a, of the H₂ Rayleigh opacity and found log₁₀ a = 2.1-5.7 (10); at 1 mbar, the densities 3 × 10⁷, 2.4 × 10⁸ and 10¹⁰ m⁻³ used here correspond to log₁₀ a ≈ 2.4-2.7, 3.3-3.6 and 4.9-5.2, placing 3 × 10⁷ m⁻³ at the weak end of the observed range. Spots used PHOENIX spectra (31) at a spot-to-photosphere temperature ratio of 0.85 (11).</w:t>
       </w:r>
     </w:p>
     <w:p>
@@ -1219,7 +1219,7 @@
                 <w:i w:val="0"/>
                 <w:sz w:val="18"/>
               </w:rPr>
-              <w:t>Grey cloud deck at a fixed pressure</w:t>
+              <w:t>Gray cloud deck at a fixed pressure</w:t>
             </w:r>
           </w:p>
         </w:tc>
@@ -1667,7 +1667,7 @@
           <w:b w:val="0"/>
           <w:i w:val="0"/>
         </w:rPr>
-        <w:t>Unless stated, results are for the 10⁻⁴ threshold, averaged over the four classifiers and four molecules. Five quantities were measured. (i) Loss: clean accuracy minus accuracy under the departure. (ii) Irreducible loss: clean accuracy minus the accuracy of the design retrained with the departure present, so that recovery is measured against what retraining can achieve. (iii) Absorption: the loss of the design retrained on a randomized grid in which each planet independently carried haze (60 % of planets; log-uniform, 10⁵-3 × 10⁸ m⁻³), spots (70 %; 0-20 %) and noise 1-3 times nominal (32); three variants each omitted one ingredient, testing transfer to an unseen departure (15). (iv) Detection: five decline rules (probability margin; spread of the four classifiers' probabilities (33); Mahalanobis distance (34); k-nearest-neighbour distance (35); principal-component reconstruction error), each with a threshold declining 10 % of clean planets and credited only with accepted-planet accuracy above the clean selective baseline at equal coverage (16, 36). (v) Calibration: expected calibration error and the coverage of split-conformal sets calibrated to 90 % on half the clean planets (37, 38), for the three classifiers that output probabilities. Expectations for the consortium classifier were committed to the repository before the runs (Section 3.6).</w:t>
+        <w:t>Unless stated, results are for the 10⁻⁴ threshold, averaged over the four classifiers and four molecules. Five quantities were measured. (i) Loss: clean accuracy minus accuracy under the departure. (ii) Irreducible loss: clean accuracy minus the accuracy of the design retrained with the departure present, so that recovery is measured against what retraining can achieve. (iii) Absorption: the loss of the design retrained on a randomized grid in which each planet independently carried haze (60 % of planets; log-uniform, 10⁵-3 × 10⁸ m⁻³), spots (70 %; 0-20 %) and noise 1-3 times the nominal level (32); three variants each omitted one ingredient, testing transfer to an unseen departure (15). (iv) Detection: five decline rules (probability margin; spread of the four classifiers' probabilities (33); Mahalanobis distance (34); k-nearest-neighbor distance (35); principal-component reconstruction error), each with a threshold declining 10 % of clean planets and credited only with accepted-planet accuracy above the clean selective baseline at equal coverage (16, 36). Rankings were summarized by the area under the receiver operating characteristic curve (AUROC), for which 0.5 is chance. (v) Calibration: expected calibration error and the coverage of split-conformal sets calibrated to 90 % on half the clean planets (37, 38), for the three classifiers that output probabilities. Expectations for the consortium classifier were committed to the repository before the runs (Section 3.6).</w:t>
       </w:r>
     </w:p>
     <w:p>
@@ -1765,7 +1765,7 @@
           <w:i w:val="0"/>
           <w:sz w:val="20"/>
         </w:rPr>
-        <w:t xml:space="preserve"> The re-implementation against the published accuracies for the 48 combinations of classifier, molecule and abundance threshold. (a) Re-implemented against published accuracy; dashed line, equality. (b) Difference between the two for each combination, grouped by molecule, with marker shape giving the abundance threshold. Grey bands: ±5 points.</w:t>
+        <w:t xml:space="preserve"> The re-implementation against the published accuracies for the 48 combinations of classifier, molecule and abundance threshold. (a) Re-implemented against published accuracy; dashed line, equality. (b) Difference between the two for each combination, grouped by molecule, with marker shape giving the abundance threshold. Gray bands: ±5 points.</w:t>
       </w:r>
     </w:p>
     <w:p>
@@ -2235,7 +2235,7 @@
                 <w:i w:val="0"/>
                 <w:sz w:val="18"/>
               </w:rPr>
-              <w:t>Grey cloud deck, 10³ Pa</w:t>
+              <w:t>Gray cloud deck, 10³ Pa</w:t>
             </w:r>
           </w:p>
         </w:tc>
@@ -2381,7 +2381,7 @@
                 <w:i w:val="0"/>
                 <w:sz w:val="18"/>
               </w:rPr>
-              <w:t>Grey cloud deck, 10² Pa</w:t>
+              <w:t>Gray cloud deck, 10² Pa</w:t>
             </w:r>
           </w:p>
         </w:tc>
@@ -4423,7 +4423,7 @@
           <w:b w:val="0"/>
           <w:i w:val="0"/>
         </w:rPr>
-        <w:t>The classifier lost little to a different opacity database (2.9 points), a different radiative-transfer code (3.5), added HCN and C₂H₂ (0.1) or a cloud deck at 10³ Pa, inside its training prior (2.9) (Table 3, Figure 2). It lost far more to haze (12.1 points at 2 × 10⁶ m⁻³, 17.7 at 3 × 10⁷ m⁻³), to spots (10.8 at 20 % coverage), to a cloud deck at 10² Pa (9.8), to spots and haze together (18.8) and to extra noise (9.3-13.5).</w:t>
+        <w:t>The classifier lost little to a different opacity database (2.9 points), a different radiative-transfer code (3.5), added HCN and C₂H₂ (0.1) or a cloud deck at 10³ Pa inside its training prior (2.9 points; Table 3, Figure 2). It lost far more to haze (12.1 points at 2 × 10⁶ m⁻³, 17.7 at 3 × 10⁷ m⁻³), to spots (10.8 at 20 % coverage), to a cloud deck at 10² Pa (9.8), to spots and haze together (18.8) and to extra noise (9.3-13.5).</w:t>
       </w:r>
     </w:p>
     <w:p>
@@ -4435,7 +4435,7 @@
           <w:b w:val="0"/>
           <w:i w:val="0"/>
         </w:rPr>
-        <w:t>Most aerosol and spot losses were recoverable. Retrained with haze, the design reached 78.8 %, so 87 % of the haze loss was reducible and the molecular information survived in the hazy spectra; 65-80 % was reducible for spots, the high deck and the compound. Noise losses were mostly irreducible (13-21 % reducible). The randomized grid cost 1.8 points on clean spectra and recovered 71 % of the reducible haze loss and 75-82 % of the spot loss; with haze omitted from the grid, randomizing spots and noise still recovered 62 % of the improvement on hazy spectra. It did not help with the opacity database, the code or the gain ramp, none of which it contained.</w:t>
+        <w:t>Most aerosol and spot losses were recoverable. Retrained with haze, the design reached 78.8 %, so 87 % of the haze loss was reducible and the molecular information survived in the hazy spectra; 65-80 % was reducible for spots, the high cloud deck and the compound departure. Noise losses were mostly irreducible (13-21 % reducible). The randomized grid cost 1.8 points on clean spectra and recovered 71 % of the reducible haze loss and 75-82 % of the spot loss; with haze omitted from the grid, randomizing spots and noise still recovered 62 % of the improvement on hazy spectra. It did not help with the opacity database, the code or the gain ramp, none of which it contained.</w:t>
       </w:r>
     </w:p>
     <w:p>
@@ -4538,7 +4538,7 @@
           <w:b w:val="0"/>
           <w:i w:val="0"/>
         </w:rPr>
-        <w:t>Four versions of the design, differing only in input, identified the cause (Table 4). Normalising with statistics from the bins above 1.1 µm, while keeping every bin, left the failure unchanged, so normalisation was not the cause. Removing the photometric points cut the loss to haze at 3 × 10⁷ m⁻³ from 17.7 to 5.6 points and to 20 % spots from 10.8 to 3.2; using only the AIRS bins cut them to 0.5 and to none. Transplanting only the three hazy photometric points into clean spectra reproduced the failure (CH₄ detection 1.6 %), and restoring them in hazy spectra removed it (72 %). The sensitivity to haze and spots therefore came through the photometric inputs.</w:t>
+        <w:t>Four versions of the design, differing only in input, identified the cause (Table 4). Normalizing with statistics from the bins above 1.1 µm, while keeping every bin, left the failure unchanged, so normalization was not the cause. Removing the photometric points cut the loss to haze at 3 × 10⁷ m⁻³ from 17.7 to 5.6 points and to 20 % spots from 10.8 to 3.2; using only the AIRS bins cut the haze loss to 0.5 points and removed the spot loss. Transplanting only the three hazy photometric points into clean spectra reproduced the failure (CH₄ detection 1.6 %), and restoring them in hazy spectra removed it (72 %). The sensitivity to haze and spots therefore came through the photometric inputs.</w:t>
       </w:r>
     </w:p>
     <w:p>
@@ -4845,7 +4845,7 @@
                 <w:i w:val="0"/>
                 <w:sz w:val="18"/>
               </w:rPr>
-              <w:t>All bins, normalised with the bins above 1.1 µm</w:t>
+              <w:t>All bins, normalized with the bins above 1.1 µm</w:t>
             </w:r>
           </w:p>
         </w:tc>
@@ -5185,7 +5185,7 @@
           <w:b w:val="0"/>
           <w:i w:val="0"/>
         </w:rPr>
-        <w:t>The mechanism follows from the design: the classifiers use every point including the photometric ones, their training atmospheres have grey clouds but no haze, and a small-particle haze raises the optical points while barely changing the infrared bands. Any implementation of the design is therefore exposed; only the size of the effect depends on implementation choices. Tripling the photometric noise reduced the haze loss to 15.6 points and a tenfold increase to 10.2; 0.03 µm particles at the same optical extinction gave 17.5 points. Particles of 0.5 µm also altered the infrared (AIRS amplitude ratio 1.94), and every input then failed (13.4-19.9 points), a different failure.</w:t>
+        <w:t>The mechanism follows from the design: the classifiers use every point including the photometric ones, their training atmospheres have gray clouds but no haze, and a small-particle haze raises the optical points while barely changing the infrared bands. Any implementation of the design is therefore exposed; only the size of the effect depends on implementation choices. Tripling the photometric noise reduced the haze loss to 15.6 points and a tenfold increase to 10.2; 0.03 µm particles at the same optical extinction gave 17.5 points. Particles of 0.5 µm also altered the infrared (AIRS amplitude ratio 1.94), and every input then failed (13.4-19.9 points), a different failure.</w:t>
       </w:r>
     </w:p>
     <w:p>
@@ -5861,7 +5861,7 @@
           <w:b w:val="0"/>
           <w:i w:val="0"/>
         </w:rPr>
-        <w:t>Table 5 compares the expectations with the outcomes. The largest surprise was not anticipated: the haze failure came from the photometric inputs while the molecular bands were intact, with confidence rising as accuracy fell. Four expectations about recoverability erred in the same direction, since aerosol losses proved largely recoverable. The reversed host dependence of the spot loss, contrary to the stronger chromatic contamination of M dwarfs (11), remains unexplained and is not used in any conclusion.</w:t>
+        <w:t>Table 5 compares the expectations with the outcomes. The largest surprise was not among the expectations: the haze failure came from the photometric inputs while the molecular bands were intact, with confidence rising as accuracy fell. Four expectations about recoverability erred in the same direction, since aerosol losses proved largely recoverable. The reversed host dependence of the spot loss, contrary to the stronger chromatic contamination of M dwarfs (11), remains unexplained and is not used in any conclusion.</w:t>
       </w:r>
     </w:p>
     <w:p>

</xml_diff>

<commit_message>
Introduction tightened (985 -> 659 words, same argument and citations); decline-rule claim made precise
</commit_message>
<xml_diff>
--- a/v3/jhss/manuscript.docx
+++ b/v3/jhss/manuscript.docx
@@ -125,7 +125,7 @@
           <w:b w:val="0"/>
           <w:i w:val="0"/>
         </w:rPr>
-        <w:t>When a planet passes in front of its star, a small fraction of the starlight passes through the planet's atmosphere on its way to the observer. Molecules in the atmosphere absorb that light at their own characteristic wavelengths, so the apparent size of the planet changes with wavelength. The record of that change, the transmission spectrum, shows which molecules are present. Ariel, a European Space Agency mission scheduled for launch in 2029, will measure transmission spectra of about 1,000 transiting exoplanets between 0.5 and 7.8 µm, using three broadband photometers below 1.1 µm and three spectrometer channels above it, NIRSpec, AIRS-CH0 and AIRS-CH1 (1). Telescope time will not allow every planet to be studied deeply. The survey is therefore organized in tiers: every target is observed first at low signal-to-noise in a Tier-1 reconnaissance pass, and a substantial subset is then re-observed at higher precision in Tier 2 (1-4). Tier-1 data are expected to reveal the presence of molecular features and the degree of cloudiness (4), so they are the natural basis for deciding which planets receive the deeper observations. A planet judged uninteresting at Tier 1 may never be observed again.</w:t>
+        <w:t>When a planet transits its star, part of the starlight passes through the planet's atmosphere, and molecules absorb it at their characteristic wavelengths. The resulting transmission spectrum shows which molecules are present. Ariel, a European Space Agency mission scheduled for launch in 2029, will measure transmission spectra of about 1,000 exoplanets between 0.5 and 7.8 µm, using three broadband photometers below 1.1 µm and three spectrometer channels above it, NIRSpec, AIRS-CH0 and AIRS-CH1 (1). Because not every planet can be studied deeply, every target is observed first at low signal-to-noise in a Tier-1 reconnaissance survey, and a subset is then re-observed at higher precision in Tier 2 (1-4). Tier-1 spectra, which reveal molecular features and cloudiness (4), are thus the basis for choosing which planets receive deeper observations; a planet dismissed at Tier 1 may never be observed again.</w:t>
       </w:r>
     </w:p>
     <w:p>
@@ -137,7 +137,7 @@
           <w:b w:val="0"/>
           <w:i w:val="0"/>
         </w:rPr>
-        <w:t>Making that decision for about 1,000 planets is itself a problem. The standard way to read a spectrum, an atmospheric retrieval, fits a physical model with sampling algorithms that need between 10⁵ and 10⁸ model evaluations per planet (5), and its assumptions and priors must be chosen and checked by a specialist (6). Machine-learning classifiers are an attractive alternative: once trained, they return an answer for every planet in seconds. The Ariel consortium's population study of the Tier-1 survey proposed two retrieval-free ways of classifying planets: a band-based metric and, as a preliminary assessment, four scikit-learn classifiers trained to flag the presence of CH₄, H₂O, CO₂ and NH₃ (6). The classifiers reached 64-89 % accuracy on a held-out simulated population. Their code and trained models were not released.</w:t>
+        <w:t>Reading a spectrum with an atmospheric retrieval requires 10⁵-10⁸ model evaluations per planet (5) and specialist choices of assumptions and priors (6), which is impractical for 1,000 planets. Machine-learning classifiers, which answer in seconds once trained, are an attractive alternative. The Ariel consortium's population study of the Tier-1 survey proposed, as a preliminary assessment, four scikit-learn classifiers that flag the presence of CH₄, H₂O, CO₂ and NH₃, reaching 64-89 % accuracy on simulated planets (6). Their code and trained models were not released.</w:t>
       </w:r>
     </w:p>
     <w:p>
@@ -149,7 +149,7 @@
           <w:b w:val="0"/>
           <w:i w:val="0"/>
         </w:rPr>
-        <w:t>Because Ariel has not yet flown, these classifiers, like the classifiers and retrieval networks developed for the Ariel Data Challenges (5) and the wider machine-learning retrieval literature (7, 8), were trained and tested on spectra from the same simulator. That test shows that a classifier has learned its simulator. It cannot show how the classifier behaves when real atmospheres differ from the simulator, and there are well-documented ways in which they will. Hazes and clouds are common in observed hot Jupiters and mute or reshape their spectra across a continuum from clear to strongly obscured (9, 10). Unocculted spots on the host star imprint false spectral features, most strongly for cool stars (11). Opacity data compiled from different line lists give different absorption cross sections (12, 13). Training grids include only a handful of absorbers: the database of the first Ariel Data Challenge contains five (5), while carbon-rich atmospheres, for example, are expected to carry HCN and C₂H₂ in abundance (14). The authors of the consortium study acknowledged the limitation, describing their spectra as "transmission spectral shapes" to test methods against (6). The concern is practical. A classifier that fails in these situations does not announce it; it returns confident answers, and the planets it wrongly dismisses do not receive the observations that would have revealed them.</w:t>
+        <w:t>Like the models developed for the Ariel Data Challenges (5) and elsewhere in the machine-learning retrieval literature (7, 8), these classifiers were trained and tested on spectra from the same simulator. Such a test shows that a classifier has learned its simulator, not how it behaves when real atmospheres differ, and they will differ in documented ways: hazes and clouds are common and mute or reshape spectra (9, 10); unocculted star spots imprint false features (11); opacity data built from different line lists disagree (12, 13); and training grids omit absorbers, the first Ariel Data Challenge grid containing only five (5) although carbon-rich atmospheres, for example, carry HCN and C₂H₂ (14). A classifier that fails in these situations does not announce it. It returns confident answers, and the planets it wrongly dismisses never receive the observations that would have revealed them.</w:t>
       </w:r>
     </w:p>
     <w:p>
@@ -161,7 +161,7 @@
           <w:b w:val="0"/>
           <w:i w:val="0"/>
         </w:rPr>
-        <w:t>Deliberately altering the test data and measuring the consequences is established practice in machine learning (15, 16) and in simulation-based inference (17, 18). In exoplanet atmospheres, the nearest study tested a retrieval network on spectra with an added absorber, a removed absorber and unocculted star spots (19), and a recent flow-matching retrieval left model mismatch such as unmodeled clouds to future work (8). No test of this kind had been reported for a classifier proposed for Ariel's Tier-1 survey, and because the consortium's code was not released, any such test first requires an independent re-implementation that demonstrably matches the published results.</w:t>
+        <w:t>Measuring how models respond to deliberately altered data is established practice in machine learning (15, 16) and in simulation-based inference (17, 18). In exoplanet atmospheres, one study tested a retrieval network against an added absorber, a removed absorber and star spots (19), and a recent retrieval left unmodeled clouds to future work (8). No such test had been reported for a classifier proposed for Ariel's Tier-1 survey, and for the consortium classifiers it first requires an independent re-implementation that reproduces the published results.</w:t>
       </w:r>
     </w:p>
     <w:p>
@@ -173,7 +173,7 @@
           <w:b w:val="0"/>
           <w:i w:val="0"/>
         </w:rPr>
-        <w:t>This technical note asked whether the consortium's Tier-1 molecular classifiers could be trusted when real atmospheres differ from their simulator, and whether the answer carries over to other classifiers. It re-implemented the classifiers from their published description and verified the re-implementation against all 48 published accuracies (Section 3.1). It then subjected them to a stress test of fifteen physically motivated departures from the simulator, measuring for each how much accuracy was lost, how much of the loss any retraining could recover, whether training on a randomized grid absorbed it, and whether the classifiers' confidence, distance-based novelty scores or conformal prediction flagged the errors (Sections 3.2-3.4). To find out whether the resulting trust profile belonged to this classifier or to Ariel classifiers in general, the same test was applied to a second classifier, built for a different Ariel science question, the carbon-to-oxygen ratio; a single classifier with a different profile is enough to show that one classifier's stress test cannot stand in for another's (Section 3.5).</w:t>
+        <w:t>This technical note asked whether the consortium classifiers could be trusted when real atmospheres differ from their simulator, and whether the answer carries over to other classifiers. The classifiers were re-implemented and checked against all 48 published accuracies (Section 3.1), then stress-tested against fifteen physically motivated departures from the simulator (Sections 3.2-3.4). The same test was applied to a second classifier, built for a different Ariel science question, the carbon-to-oxygen (C/O) ratio; a single classifier with a different profile suffices to show that one classifier's test cannot stand in for another's (Section 3.5).</w:t>
       </w:r>
     </w:p>
     <w:p>
@@ -185,7 +185,7 @@
           <w:b w:val="0"/>
           <w:i w:val="0"/>
         </w:rPr>
-        <w:t>The test showed that the published design was robust to a different opacity database, a different radiative-transfer code and omitted absorbers, but was confidently blind to haze of an observed strength: it reported methane and water absent while their infrared bands were intact, because it relied on the three optical photometric points. The second classifier had a nearly opposite profile. These results are useful in three ways. Anyone applying or extending the consortium design gains an openly released re-implementation that reproduces the published results, together with a specific weakness and two remedies. Anyone proposing a classifier for Ariel gains a stress-test procedure, applicable to any classifier trained on simulated spectra, with released scripts for the two classifiers studied here. And anyone selecting Ariel's deeper-tier targets with a simulator-trained classifier gains a concrete requirement: the classifier must be tested on its own, against the ways its simulator can be wrong, before its outputs are used. All code, result tables and the expectations recorded before the runs are in a public repository directory (see Data and Code Availability).</w:t>
+        <w:t>The published design proved robust to a different opacity database, a different radiative-transfer code and omitted absorbers, but confidently blind to haze of an observed strength, through its three optical photometric inputs; the second classifier had a nearly opposite profile. The note therefore provides an openly released re-implementation of the consortium classifiers, with a documented weakness and two remedies; a stress-test procedure for any classifier trained on simulated spectra, with scripts for the two classifiers studied; and a requirement for Ariel target selection: each simulator-trained classifier must be tested on its own before its outputs are used. Code, results and the expectations recorded before the runs are publicly available (see Data and Code Availability).</w:t>
       </w:r>
     </w:p>
     <w:p>
@@ -5228,7 +5228,7 @@
           <w:b w:val="0"/>
           <w:i w:val="0"/>
         </w:rPr>
-        <w:t>No decline rule restored clean-level accuracy under a serious departure, and every rule's credit against the clean selective baseline was negative under haze (−17.5 to −25.8 points), spots and the high cloud deck (Table 3). Confidence gave no warning of haze: the margin rule declined 7.4 % of clean planets but 0.9 % of hazy ones, and its error ranking fell from 0.76 to 0.70. Distance scores separated hazy from clean spectra (AUROC 0.90-0.94) and declined 71-82 % of hazy planets, but did not rank errors within them (0.44-0.51), acting as a population alarm rather than a filter. Conformal coverage fell to 73.7 % under haze and 82.3 % under spots, and expected calibration error rose from 0.088 to 0.231 under haze. Randomizing haze and spots into training lowered the Mahalanobis separation of hazy spectra from 0.94 to 0.38 and of spotted spectra from 0.72 to 0.45: the more robust design could no longer flag the departures it had absorbed.</w:t>
+        <w:t>No decline rule restored clean-level accuracy under any departure that cost more than 5 points, and every rule's credit against the clean selective baseline was negative under haze (−17.5 to −25.8 points), spots and the high cloud deck (Table 3). Confidence gave no warning of haze: the margin rule declined 7.4 % of clean planets but 0.9 % of hazy ones, and its error ranking fell from 0.76 to 0.70. Distance scores separated hazy from clean spectra (AUROC 0.90-0.94) and declined 71-82 % of hazy planets, but did not rank errors within them (0.44-0.51), acting as a population alarm rather than a filter. Conformal coverage fell to 73.7 % under haze and 82.3 % under spots, and expected calibration error rose from 0.088 to 0.231 under haze. Randomizing haze and spots into training lowered the Mahalanobis separation of hazy spectra from 0.94 to 0.38 and of spotted spectra from 0.72 to 0.45: the more robust design could no longer flag the departures it had absorbed.</w:t>
       </w:r>
     </w:p>
     <w:p>

</xml_diff>

<commit_message>
Language and logic pass: ambiguous pronouns and broken constructions fixed, trust profile defined before use, overstatements softened, Section 3.6 recoverability summary corrected
</commit_message>
<xml_diff>
--- a/v3/jhss/manuscript.docx
+++ b/v3/jhss/manuscript.docx
@@ -125,7 +125,7 @@
           <w:b w:val="0"/>
           <w:i w:val="0"/>
         </w:rPr>
-        <w:t>When a planet transits its star, part of the starlight passes through the planet's atmosphere, and molecules absorb it at their characteristic wavelengths. The resulting transmission spectrum shows which molecules are present. Ariel, a European Space Agency mission scheduled for launch in 2029, will measure transmission spectra of about 1,000 exoplanets between 0.5 and 7.8 µm, using three broadband photometers below 1.1 µm and three spectrometer channels above it, NIRSpec, AIRS-CH0 and AIRS-CH1 (1). Because not every planet can be studied deeply, every target is observed first at low signal-to-noise in a Tier-1 reconnaissance survey, and a subset is then re-observed at higher precision in Tier 2 (1-4). Tier-1 spectra, which reveal molecular features and cloudiness (4), are thus the basis for choosing which planets receive deeper observations; a planet dismissed at Tier 1 may never be observed again.</w:t>
+        <w:t>When a planet transits its star, part of the starlight passes through the planet's atmosphere, and molecules in the atmosphere absorb that light at their characteristic wavelengths. The resulting transmission spectrum shows which molecules are present. Ariel, a European Space Agency mission scheduled for launch in 2029, will measure transmission spectra of about 1,000 exoplanets between 0.5 and 7.8 µm, using three broadband photometers below 1.1 µm and three spectrometer channels (NIRSpec, AIRS-CH0 and AIRS-CH1) at longer wavelengths (1). Because not all planets can be studied deeply, each target is observed first at low signal-to-noise in a Tier-1 reconnaissance survey, and a subset is then re-observed at higher precision in Tier 2 (1-4). Tier-1 spectra, which are expected to reveal molecular features and cloudiness (4), are thus the basis for choosing which planets receive deeper observations; a planet dismissed at Tier 1 may never be observed again.</w:t>
       </w:r>
     </w:p>
     <w:p>
@@ -137,7 +137,7 @@
           <w:b w:val="0"/>
           <w:i w:val="0"/>
         </w:rPr>
-        <w:t>Reading a spectrum with an atmospheric retrieval requires 10⁵-10⁸ model evaluations per planet (5) and specialist choices of assumptions and priors (6), which is impractical for 1,000 planets. Machine-learning classifiers, which answer in seconds once trained, are an attractive alternative. The Ariel consortium's population study of the Tier-1 survey proposed, as a preliminary assessment, four scikit-learn classifiers that flag the presence of CH₄, H₂O, CO₂ and NH₃, reaching 64-89 % accuracy on simulated planets (6). Their code and trained models were not released.</w:t>
+        <w:t>Reading a spectrum with an atmospheric retrieval requires 10⁵-10⁸ model evaluations per planet (5) and specialist choices of assumptions and priors (6), which makes retrievals costly as a first pass over 1,000 planets. Machine-learning classifiers, which answer in seconds once trained, are an attractive alternative. The Ariel consortium's population study of the Tier-1 survey proposed, as a preliminary assessment, four scikit-learn classifiers that flag the presence of CH₄, H₂O, CO₂ and NH₃, reaching 64-89 % accuracy on simulated planets (6). Their code and trained models were not released.</w:t>
       </w:r>
     </w:p>
     <w:p>
@@ -149,7 +149,7 @@
           <w:b w:val="0"/>
           <w:i w:val="0"/>
         </w:rPr>
-        <w:t>Like the models developed for the Ariel Data Challenges (5) and elsewhere in the machine-learning retrieval literature (7, 8), these classifiers were trained and tested on spectra from the same simulator. Such a test shows that a classifier has learned its simulator, not how it behaves when real atmospheres differ, and they will differ in documented ways: hazes and clouds are common and mute or reshape spectra (9, 10); unocculted star spots imprint false features (11); opacity data built from different line lists disagree (12, 13); and training grids omit absorbers, the first Ariel Data Challenge grid containing only five (5) although carbon-rich atmospheres, for example, carry HCN and C₂H₂ (14). A classifier that fails in these situations does not announce it. It returns confident answers, and the planets it wrongly dismisses never receive the observations that would have revealed them.</w:t>
+        <w:t>Like the models developed for the Ariel Data Challenges (5) and in the wider machine-learning retrieval literature (7, 8), these classifiers were trained and tested on spectra from the same simulator. Such a test shows that a classifier has learned its simulator, but not how the classifier behaves when real atmospheres differ from the simulator. Real atmospheres will differ in documented ways: hazes and clouds are common and mute or reshape spectra (9, 10); unocculted star spots imprint false features (11); opacity data built from different line lists disagree (12, 13); and training grids omit absorbers: the grid of the first Ariel Data Challenge contains only five (5), whereas carbon-rich atmospheres, for example, are expected to carry HCN and C₂H₂ as well (14). A classifier that fails in these situations does not announce it. It returns confident answers, and the planets it wrongly dismisses never receive the observations that would have revealed them.</w:t>
       </w:r>
     </w:p>
     <w:p>
@@ -161,7 +161,7 @@
           <w:b w:val="0"/>
           <w:i w:val="0"/>
         </w:rPr>
-        <w:t>Measuring how models respond to deliberately altered data is established practice in machine learning (15, 16) and in simulation-based inference (17, 18). In exoplanet atmospheres, one study tested a retrieval network against an added absorber, a removed absorber and star spots (19), and a recent retrieval left unmodeled clouds to future work (8). No such test had been reported for a classifier proposed for Ariel's Tier-1 survey, and for the consortium classifiers it first requires an independent re-implementation that reproduces the published results.</w:t>
+        <w:t>Measuring how models respond to deliberately altered data is established practice in machine learning (15, 16) and in simulation-based inference (17, 18). In exoplanet atmospheres, one study tested a retrieval network against an added absorber, a removed absorber and star spots (19), and a recent retrieval left unmodeled clouds to future work (8). No such test had been reported for a classifier proposed for Ariel's Tier-1 survey, and testing the consortium classifiers first requires an independent re-implementation that reproduces the published results.</w:t>
       </w:r>
     </w:p>
     <w:p>
@@ -173,7 +173,7 @@
           <w:b w:val="0"/>
           <w:i w:val="0"/>
         </w:rPr>
-        <w:t>This technical note asked whether the consortium classifiers could be trusted when real atmospheres differ from their simulator, and whether the answer carries over to other classifiers. The classifiers were re-implemented and checked against all 48 published accuracies (Section 3.1), then stress-tested against fifteen physically motivated departures from the simulator (Sections 3.2-3.4). The same test was applied to a second classifier, built for a different Ariel science question, the carbon-to-oxygen (C/O) ratio; a single classifier with a different profile suffices to show that one classifier's test cannot stand in for another's (Section 3.5).</w:t>
+        <w:t>This technical note asked whether the consortium classifiers could be trusted when real atmospheres differ from their simulator, and whether the answer, which here is called the classifier's trust profile, carries over to other classifiers. The classifiers were re-implemented and checked against all 48 published accuracies (Section 3.1), then stress-tested against fifteen physically motivated departures from the simulator (Sections 3.2-3.4). The same test was applied to a second classifier, built for a different Ariel science question, the carbon-to-oxygen (C/O) ratio; a single classifier with a different trust profile suffices to show that one classifier's test cannot stand in for another's (Section 3.5).</w:t>
       </w:r>
     </w:p>
     <w:p>
@@ -185,7 +185,7 @@
           <w:b w:val="0"/>
           <w:i w:val="0"/>
         </w:rPr>
-        <w:t>The published design proved robust to a different opacity database, a different radiative-transfer code and omitted absorbers, but confidently blind to haze of an observed strength, through its three optical photometric inputs; the second classifier had a nearly opposite profile. The note therefore provides an openly released re-implementation of the consortium classifiers, with a documented weakness and two remedies; a stress-test procedure for any classifier trained on simulated spectra, with scripts for the two classifiers studied; and a requirement for Ariel target selection: each simulator-trained classifier must be tested on its own before its outputs are used. Code, results and the expectations recorded before the runs are publicly available (see Data and Code Availability).</w:t>
+        <w:t>The published design proved robust to a different opacity database, a different radiative-transfer code and omitted absorbers, but confidently blind to haze of an observed strength because of its reliance on three optical photometric inputs; the second classifier had a nearly opposite profile. The note provides an openly released re-implementation of the consortium classifiers, with a documented weakness and two remedies; a stress-test procedure for any classifier trained on simulated spectra, with scripts for the two classifiers studied; and a requirement for Ariel target selection: each simulator-trained classifier must be tested on its own before its outputs are used. Code, results and the expectations recorded before the runs are publicly available (see Data and Code Availability).</w:t>
       </w:r>
     </w:p>
     <w:p>
@@ -977,7 +977,7 @@
           <w:b w:val="0"/>
           <w:i w:val="0"/>
         </w:rPr>
-        <w:t>Three deviations could not be avoided. (i) Opacities came from Exo-Transmit's tables (12, 21); substituting ExoMol cross sections (13) for H₂O, CH₄, CO₂ and CO cost the classifier 2.9 points (Section 3.2), which bounds this choice. (ii) Collision-induced absorption was omitted; adding the H₂-H₂ and H₂-He contributions changed test spectra by at most 3 ppm, against feature amplitudes of 270-1,400 ppm. (iii) Noise came from a payload model instead of ArielRad, which is not public (Section 2.3). The planet list also differed (Table 1).</w:t>
+        <w:t>Three deviations could not be avoided. (i) Opacities came from Exo-Transmit's tables (12, 21); substituting ExoMol cross sections (13) for H₂O, CH₄, CO₂ and CO cost the classifier 2.9 points (Section 3.2), which bounds the effect of this choice. (ii) Collision-induced absorption was omitted; adding the H₂-H₂ and H₂-He contributions changed test spectra by at most 3 ppm, against feature amplitudes of 270-1,400 ppm. (iii) Noise came from a payload model instead of ArielRad, which is not public (Section 2.3). The planet list also differed (Table 1).</w:t>
       </w:r>
     </w:p>
     <w:p>
@@ -1020,7 +1020,7 @@
           <w:b w:val="0"/>
           <w:i w:val="0"/>
         </w:rPr>
-        <w:t>Spectra were computed with TauREx 3 (22) through MultiREx (23) at R ≈ 1,000 and binned by integration. TauREx 3.3.2 reads the pressure grid of Exo-Transmit opacity tables as bar, whereas Exo-Transmit treats it as Pa; the grid was divided by 10⁵ at load, and the inconsistency was reported to the TauREx developers (24). With the correction, TauREx spectra of 1,804 test atmospheres agreed better with Exo-Transmit's own code (median shape correlation 0.9986, against 0.986).</w:t>
+        <w:t>Spectra were computed with TauREx 3 (22) through MultiREx (23) at R ≈ 1,000 and binned by integration. TauREx 3.3.2 reads the pressure grid of Exo-Transmit opacity tables as bar, whereas Exo-Transmit treats it as Pa; the pressure grid was therefore divided by 10⁵ when the tables were loaded, and the inconsistency was reported to the TauREx developers (24). With the correction, TauREx spectra of 1,804 test atmospheres agreed better with Exo-Transmit's own code (median shape correlation 0.9986, against 0.986).</w:t>
       </w:r>
     </w:p>
     <w:p>
@@ -1032,7 +1032,7 @@
           <w:b w:val="0"/>
           <w:i w:val="0"/>
         </w:rPr>
-        <w:t>Per-bin noise came from a payload model built with ExoSim 2 (25): the one-hour noise-to-signal ratio for the host's effective temperature, scaled to the host's distance and radius and to the transit duration, and divided by the square root of the number of transits. Its single free level was calibrated so that a signal-to-noise ratio of 7 on the five-scale-height atmospheric signal reproduced the candidate sample's Tier-3 transit counts, which the model then predicted within 0.07 dex (17 %). For the three example planets in Figure 1 of the consortium study (HD 209458 b, GJ 1214 b and WASP-79 b), its AIRS noise of about 75, 430 and 230 ppm per bin matched the published noise bands in size.</w:t>
+        <w:t>Per-bin noise came from a payload model built with ExoSim 2 (25): the one-hour noise-to-signal ratio for the host's effective temperature, scaled to the host's distance and radius and to the transit duration, and divided by the square root of the number of transits. Its one free parameter, the overall noise level, was calibrated so that a signal-to-noise ratio of 7 on the five-scale-height atmospheric signal reproduced the candidate sample's Tier-3 transit counts, which the model then predicted within 0.07 dex (17 %). For the three example planets in Figure 1 of the consortium study (HD 209458 b, GJ 1214 b and WASP-79 b), its AIRS noise of about 75, 430 and 230 ppm per bin matched the published noise bands in size.</w:t>
       </w:r>
     </w:p>
     <w:p>
@@ -1063,7 +1063,7 @@
           <w:b w:val="0"/>
           <w:i w:val="0"/>
         </w:rPr>
-        <w:t>The second classifier addressed the carbon-to-oxygen ratio, a stated Ariel objective (1): an atmosphere was labeled carbon-rich if C/O &gt; 1, the chemical boundary above which oxygen is locked in CO and water is depleted (14, 26). Its grid held 18,040 training and 9,016 test atmospheres in five test sets, with independently drawn planet radius (1-26 R⊕), mass (1-300 M⊕), host temperature (2,500-7,500 K), atmospheric temperature (500-2,500 K), C/O (uniform, 0.2-1.8) and metallicity (uniform, −1 to 1.5 dex). Abundances of H₂O, CH₄, CO, CO₂, NH₃ and O₃ came from chemical equilibrium computed with FastChem (27) at 10⁻² bar. Spectra were binned to the Tier-3 layout of the mission's radiometric model (R = 15, 100 and 30; 102 points) (28) and to the seven-point Tier-1 layout, with noise at a signal-to-noise ratio of 15 on each spectrum's amplitude, or from the payload model of Section 2.3 for the known Ariel targets. Gradient-boosted trees (29) on per-spectrum-normalized bins, tuned by cross-validation, reached 96.1 % on the test sets (95.9 ± 0.1 % across ten training resamples).</w:t>
+        <w:t>The second classifier addressed the carbon-to-oxygen ratio, a stated Ariel objective (1): an atmosphere was labeled carbon-rich if C/O &gt; 1, the chemical boundary above which oxygen is locked in CO and water is depleted (14, 26). Its grid held 18,040 training and 9,016 test atmospheres in five test sets, with independently drawn planet radius (1-26 R⊕), mass (1-300 M⊕), host temperature (2,500-7,500 K), atmospheric temperature (500-2,500 K), C/O (uniform, 0.2-1.8) and metallicity (uniform, −1 to 1.5 dex). Abundances of H₂O, CH₄, CO, CO₂, NH₃ and O₃ came from chemical equilibrium computed with FastChem (27) at 10⁻² bar. Spectra were binned to the Tier-3 layout of the mission's radiometric model (R = 15, 100 and 30; 102 points) (28) and to the seven-point Tier-1 layout. Noise was set to a signal-to-noise ratio of 15 on each spectrum's amplitude for the simulated test sets, and taken from the payload model of Section 2.3 for the known Ariel targets. Gradient-boosted trees (29) on per-spectrum-normalized bins, tuned by cross-validation, reached 96.1 % on the test sets (95.9 ± 0.1 % across ten training resamples).</w:t>
       </w:r>
     </w:p>
     <w:p>
@@ -1106,7 +1106,7 @@
           <w:b w:val="0"/>
           <w:i w:val="0"/>
         </w:rPr>
-        <w:t>Each departure (Table 2) re-rendered or modified the same test planets, so every loss was a within-planet difference under the same noise draw. Haze followed the Lee et al. prescription (30) with particles of 0.1 µm radius. Retrievals of ten observed hot Jupiters expressed haze opacity at 0.35 µm as a multiple, a, of the H₂ Rayleigh opacity and found log₁₀ a = 2.1-5.7 (10); at 1 mbar, the densities 3 × 10⁷, 2.4 × 10⁸ and 10¹⁰ m⁻³ used here correspond to log₁₀ a ≈ 2.4-2.7, 3.3-3.6 and 4.9-5.2, placing 3 × 10⁷ m⁻³ at the weak end of the observed range. Spots used PHOENIX spectra (31) at a spot-to-photosphere temperature ratio of 0.85 (11).</w:t>
+        <w:t>For each departure (Table 2), the same test planets were re-rendered or modified, so every loss was a within-planet difference under the same noise draw. Haze followed the Lee et al. prescription (30) with particles of 0.1 µm radius. Retrievals of ten observed hot Jupiters expressed haze opacity at 0.35 µm as a multiple, a, of the H₂ Rayleigh opacity and found log₁₀ a = 2.1-5.7 (10); at 1 mbar, the densities 3 × 10⁷, 2.4 × 10⁸ and 10¹⁰ m⁻³ used here correspond to log₁₀ a ≈ 2.4-2.7, 3.3-3.6 and 4.9-5.2, placing 3 × 10⁷ m⁻³ at the weak end of the observed range. Spots used PHOENIX spectra (31) at a spot-to-photosphere temperature ratio of 0.85 (11).</w:t>
       </w:r>
     </w:p>
     <w:p>
@@ -4538,7 +4538,7 @@
           <w:b w:val="0"/>
           <w:i w:val="0"/>
         </w:rPr>
-        <w:t>Four versions of the design, differing only in input, identified the cause (Table 4). Normalizing with statistics from the bins above 1.1 µm, while keeping every bin, left the failure unchanged, so normalization was not the cause. Removing the photometric points cut the loss to haze at 3 × 10⁷ m⁻³ from 17.7 to 5.6 points and to 20 % spots from 10.8 to 3.2; using only the AIRS bins cut the haze loss to 0.5 points and removed the spot loss. Transplanting only the three hazy photometric points into clean spectra reproduced the failure (CH₄ detection 1.6 %), and restoring them in hazy spectra removed it (72 %). The sensitivity to haze and spots therefore came through the photometric inputs.</w:t>
+        <w:t>Comparing four versions of the design that differed only in their input identified the cause (Table 4). Normalizing with statistics from the bins above 1.1 µm, while keeping every bin, left the failure unchanged, so normalization was not the cause. Removing the photometric points cut the loss to haze at 3 × 10⁷ m⁻³ from 17.7 to 5.6 points and to 20 % spots from 10.8 to 3.2; using only the AIRS bins cut the haze loss to 0.5 points and removed the spot loss. Transplanting only the three hazy photometric points into clean spectra reproduced the failure (CH₄ detection 1.6 %), and restoring them in hazy spectra removed it (72 %). The sensitivity to haze and spots therefore came through the photometric inputs.</w:t>
       </w:r>
     </w:p>
     <w:p>
@@ -5185,7 +5185,7 @@
           <w:b w:val="0"/>
           <w:i w:val="0"/>
         </w:rPr>
-        <w:t>The mechanism follows from the design: the classifiers use every point including the photometric ones, their training atmospheres have gray clouds but no haze, and a small-particle haze raises the optical points while barely changing the infrared bands. Any implementation of the design is therefore exposed; only the size of the effect depends on implementation choices. Tripling the photometric noise reduced the haze loss to 15.6 points and a tenfold increase to 10.2; 0.03 µm particles at the same optical extinction gave 17.5 points. Particles of 0.5 µm also altered the infrared (AIRS amplitude ratio 1.94), and every input then failed (13.4-19.9 points), a different failure.</w:t>
+        <w:t>The mechanism follows from the design: the classifiers use every point including the photometric ones, their training atmospheres have gray clouds but no haze, and a small-particle haze raises the optical points while barely changing the infrared bands. Any implementation of the design is therefore susceptible; only the size of the effect depends on implementation choices. Tripling the photometric noise reduced the haze loss to 15.6 points and a tenfold increase to 10.2; 0.03 µm particles at the same optical extinction gave 17.5 points. Particles of 0.5 µm also altered the infrared (AIRS amplitude ratio 1.94), and every input then failed (13.4-19.9 points), a different failure.</w:t>
       </w:r>
     </w:p>
     <w:p>
@@ -5228,7 +5228,7 @@
           <w:b w:val="0"/>
           <w:i w:val="0"/>
         </w:rPr>
-        <w:t>Under every departure that cost more than 5 points, the planets each decline rule accepted were less accurate than those it accepted on clean spectra, and every rule's credit against the clean selective baseline was negative under haze (−17.5 to −25.8 points), spots and the high cloud deck (Table 3). Confidence gave no warning of haze: the margin rule declined 7.4 % of clean planets but 0.9 % of hazy ones, and its error ranking fell from 0.76 to 0.70. Distance scores separated hazy from clean spectra (AUROC 0.90-0.94) and declined 71-82 % of hazy planets, but did not rank errors within them (0.44-0.51), acting as a population alarm rather than a filter. Conformal coverage fell to 73.7 % under haze and 82.3 % under spots, and expected calibration error rose from 0.088 to 0.231 under haze. Randomizing haze and spots into training lowered the Mahalanobis separation of hazy spectra from 0.94 to 0.38 and of spotted spectra from 0.72 to 0.45: the more robust design could no longer flag the departures it had absorbed.</w:t>
+        <w:t>Under every departure that cost more than 5 points, the planets each decline rule accepted were less accurate than those it accepted on clean spectra. Every rule's credit against the clean selective baseline was negative under haze (−17.5 to −25.8 points), spots and the high cloud deck (Table 3). Confidence gave no warning of haze: the margin rule declined 7.4 % of clean planets but 0.9 % of hazy ones, and its AUROC for ranking errors fell from 0.76 to 0.70. Distance scores separated hazy from clean spectra (AUROC 0.90-0.94) and declined 71-82 % of hazy planets, but did not rank errors within them (AUROC 0.44-0.51), acting as a population alarm rather than a filter. Conformal coverage fell to 73.7 % under haze and 82.3 % under spots, and expected calibration error rose from 0.088 to 0.231 under haze. Randomizing haze and spots into training lowered the Mahalanobis separation of hazy spectra from 0.94 to 0.38 and of spotted spectra from 0.72 to 0.45: the more robust design could no longer flag the departures it had absorbed.</w:t>
       </w:r>
     </w:p>
     <w:p>
@@ -5861,7 +5861,7 @@
           <w:b w:val="0"/>
           <w:i w:val="0"/>
         </w:rPr>
-        <w:t>Table 5 compares the expectations with the outcomes. The largest surprise was not among the expectations: the haze failure came from the photometric inputs while the molecular bands were intact, with confidence rising as accuracy fell. Four expectations about recoverability erred in the same direction, since aerosol losses proved largely recoverable. The reversed host dependence of the spot loss, contrary to the stronger chromatic contamination of M dwarfs (11), remains unexplained and is not used in any conclusion.</w:t>
+        <w:t>Table 5 compares the expectations with the outcomes. The largest surprise was not among the expectations: the haze failure came from the photometric inputs while the molecular bands were intact, with confidence rising as accuracy fell. Three expectations underestimated how much of the aerosol loss retraining or randomization could recover, and one overestimated the recovery of spot losses. The reversed host dependence of the spot loss, contrary to the stronger chromatic contamination of M dwarfs (11), remains unexplained and is not used in any conclusion.</w:t>
       </w:r>
     </w:p>
     <w:p>

</xml_diff>

<commit_message>
Reread fixes: consortium classifier defined as the four-classifier average, absorber list item made logical, elliptical and repetitive phrasing fixed, table label spelling
</commit_message>
<xml_diff>
--- a/v3/jhss/manuscript.docx
+++ b/v3/jhss/manuscript.docx
@@ -75,7 +75,7 @@
           <w:b w:val="0"/>
           <w:i w:val="0"/>
         </w:rPr>
-        <w:t>Machine-learning classifiers have been proposed for sorting the roughly 1,000 planets of Ariel's Tier-1 reconnaissance survey by composition, but no Ariel data exist, so such classifiers have been trained and validated only on spectra from the simulator that produced them. This technical note asked whether one such classifier could be trusted when real atmospheres differ from the simulator. The molecular classifiers proposed in the Ariel consortium's Tier-1 population study, whose code was not released, were re-implemented from the published description; the re-implementation reproduced all 48 published accuracies within 3.7 points. The re-implemented classifiers were then tested against fifteen physically motivated departures from their simulator. For each departure the test measured the accuracy lost, the part of that loss a retrained classifier could recover, whether training on a randomized grid absorbed it, and whether confidence scores, distance-based novelty scores or conformal prediction flagged the errors. The classifiers were robust to an alternative opacity database, an alternative radiative-transfer code and two omitted absorbers (losses of 0.1-3.5 points). They were not robust to haze: at a haze strength comparable to the weakest retrieved for observed hot Jupiters, they reported methane and water absent on nearly every planet that contained them, with rising confidence and no warning from their own ensemble, although 87 % of the loss was recoverable. Removing the three optical photometric points from their input removed most of this failure, which identified those points as the cause. A second classifier, built for a different Ariel science question, showed a nearly opposite pattern at full resolution, so the trust profile of one classifier did not carry over to another. Each classifier therefore needs its own stress test before its outputs are used to select planets.</w:t>
+        <w:t>Machine-learning classifiers have been proposed for sorting the roughly 1,000 planets of Ariel's Tier-1 reconnaissance survey by composition, but no Ariel data exist, so such classifiers have been trained and validated only on spectra from the simulator that produced them. This technical note asked whether one such proposal could be trusted when real atmospheres differ from the simulator. The molecular classifiers proposed in the Ariel consortium's Tier-1 population study, whose code was not released, were re-implemented from the published description; the re-implementation reproduced all 48 published accuracies within 3.7 points. The re-implemented classifiers were then tested against fifteen physically motivated departures from their simulator. For each departure the test measured the accuracy lost, the part of that loss a retrained classifier could recover, whether training on a randomized grid absorbed it, and whether confidence scores, distance-based novelty scores or conformal prediction flagged the errors. The classifiers were robust to an alternative opacity database, an alternative radiative-transfer code and two omitted absorbers (losses of 0.1-3.5 points). They were not robust to haze: at a haze strength comparable to the weakest retrieved for observed hot Jupiters, they reported methane and water absent on nearly every planet that contained them, with rising confidence and no warning from their own ensemble, although 87 % of the loss was recoverable. Removing the three optical photometric points from their input removed most of this failure, which identified those points as the cause. A second classifier, built for a different Ariel science question, showed a nearly opposite pattern at full resolution, so the trust profile of one classifier did not carry over to another. Each classifier therefore needs its own stress test before its outputs are used to select planets.</w:t>
       </w:r>
     </w:p>
     <w:p>
@@ -149,7 +149,7 @@
           <w:b w:val="0"/>
           <w:i w:val="0"/>
         </w:rPr>
-        <w:t>Like the models developed for the Ariel Data Challenges (5) and in the wider machine-learning retrieval literature (7, 8), these classifiers were trained and tested on spectra from the same simulator. Such a test shows that a classifier has learned its simulator, but not how the classifier behaves when real atmospheres differ from the simulator. Real atmospheres will differ in documented ways: hazes and clouds are common and mute or reshape spectra (9, 10); unocculted star spots imprint false features (11); opacity data built from different line lists disagree (12, 13); and training grids omit absorbers: the grid of the first Ariel Data Challenge contains only five (5), whereas carbon-rich atmospheres, for example, are expected to carry HCN and C₂H₂ as well (14). A classifier that fails in these situations does not announce it. It returns confident answers, and the planets it wrongly dismisses never receive the observations that would have revealed them.</w:t>
+        <w:t>Like the models developed for the Ariel Data Challenges (5) and in the wider machine-learning retrieval literature (7, 8), these classifiers were trained and tested on spectra from the same simulator. Such a test shows that a classifier has learned its simulator, but not how the classifier behaves when real atmospheres differ from the simulator. Real atmospheres will differ in documented ways: hazes and clouds are common and mute or reshape spectra (9, 10); unocculted star spots imprint false features (11); opacity data built from different line lists disagree (12, 13); and real atmospheres contain absorbers that training grids omit. The grid of the first Ariel Data Challenge, for example, contains only five absorbers (5), whereas carbon-rich atmospheres are expected to carry HCN and C₂H₂ as well (14). A classifier that fails in these situations does not announce it. It returns confident answers, and the planets it wrongly dismisses never receive the observations that would have revealed them.</w:t>
       </w:r>
     </w:p>
     <w:p>
@@ -1667,7 +1667,7 @@
           <w:b w:val="0"/>
           <w:i w:val="0"/>
         </w:rPr>
-        <w:t>Unless stated, results are for the 10⁻⁴ threshold, averaged over the four classifiers and four molecules. Five quantities were measured. (i) Loss: clean accuracy minus accuracy under the departure. (ii) Irreducible loss: clean accuracy minus the accuracy of the design retrained with the departure present, so that recovery is measured against what retraining can achieve. (iii) Absorption: the loss of the design retrained on a randomized grid in which each planet independently carried haze (60 % of planets; log-uniform, 10⁵-3 × 10⁸ m⁻³), spots (70 %; 0-20 %) and noise 1-3 times the nominal level (32); three variants each omitted one ingredient, testing transfer to an unseen departure (15). (iv) Detection: five decline rules (probability margin; spread of the four classifiers' probabilities (33); Mahalanobis distance (34); k-nearest-neighbor distance (35); principal-component reconstruction error), each with a threshold declining 10 % of clean planets and credited only with accepted-planet accuracy above the clean selective baseline at equal coverage (16, 36). Rankings were summarized by the area under the receiver operating characteristic curve (AUROC), for which 0.5 is chance. (v) Calibration: expected calibration error and the coverage of split-conformal sets calibrated to 90 % on half the clean planets (37, 38), for the three classifiers that output probabilities. Expectations for the consortium classifier were committed to the repository before the runs (Section 3.6).</w:t>
+        <w:t>Unless stated, results are for the 10⁻⁴ threshold, averaged over the four classifiers and four molecules; "the consortium classifier" refers to this average. Five quantities were measured. (i) Loss: clean accuracy minus accuracy under the departure. (ii) Irreducible loss: clean accuracy minus the accuracy of the design retrained with the departure present, so that recovery is measured against what retraining can achieve. (iii) Absorption: the loss of the design retrained on a randomized grid in which each planet independently carried haze (60 % of planets; log-uniform, 10⁵-3 × 10⁸ m⁻³), spots (70 %; 0-20 %) and noise 1-3 times the nominal level (32); three variants each omitted one ingredient, testing transfer to an unseen departure (15). (iv) Detection: five decline rules (probability margin; spread of the four classifiers' probabilities (33); Mahalanobis distance (34); k-nearest-neighbor distance (35); principal-component reconstruction error), each with a threshold declining 10 % of clean planets and credited only with accepted-planet accuracy above the clean selective baseline at equal coverage (16, 36). Rankings were summarized by the area under the receiver operating characteristic curve (AUROC), for which 0.5 is chance. (v) Calibration: expected calibration error and the coverage of split-conformal sets calibrated to 90 % on half the clean planets (37, 38), for the three classifiers that output probabilities. Expectations for the consortium classifier were committed to the repository before the runs (Section 3.6).</w:t>
       </w:r>
     </w:p>
     <w:p>
@@ -4538,7 +4538,7 @@
           <w:b w:val="0"/>
           <w:i w:val="0"/>
         </w:rPr>
-        <w:t>Comparing four versions of the design that differed only in their input identified the cause (Table 4). Normalizing with statistics from the bins above 1.1 µm, while keeping every bin, left the failure unchanged, so normalization was not the cause. Removing the photometric points cut the loss to haze at 3 × 10⁷ m⁻³ from 17.7 to 5.6 points and to 20 % spots from 10.8 to 3.2; using only the AIRS bins cut the haze loss to 0.5 points and removed the spot loss. Transplanting only the three hazy photometric points into clean spectra reproduced the failure (CH₄ detection 1.6 %), and restoring them in hazy spectra removed it (72 %). The sensitivity to haze and spots therefore came through the photometric inputs.</w:t>
+        <w:t>Comparing four versions of the design that differed only in their input identified the cause (Table 4). Normalizing with statistics from the bins above 1.1 µm, while keeping every bin, left the failure unchanged, so normalization was not the cause. Removing the photometric points cut the loss to haze at 3 × 10⁷ m⁻³ from 17.7 to 5.6 points and the loss to 20 % spots from 10.8 to 3.2; using only the AIRS bins cut the haze loss to 0.5 points and removed the spot loss. Transplanting only the three hazy photometric points into clean spectra reproduced the failure (CH₄ detection 1.6 %), and restoring them in hazy spectra removed it (72 %). The sensitivity to haze and spots therefore came through the photometric inputs.</w:t>
       </w:r>
     </w:p>
     <w:p>
@@ -5319,7 +5319,7 @@
           <w:b w:val="0"/>
           <w:i w:val="0"/>
         </w:rPr>
-        <w:t>The carbon-rich classifier responded almost oppositely to the two departures that divided trust from distrust for the consortium classifier (Figure 4). HCN and C₂H₂, abundant in carbon-rich atmospheres above about 800 K (14, 26), are absent from its training grid, as from the Ariel Data Challenge grid (5). Added at equilibrium abundances, they lowered accuracy on carbon-rich planets from 97.6 to 48.9 % on the simulated test sets, leaving oxygen-rich planets unaffected (94.5 and 95.7 %). On the known Ariel targets with payload noise, carbon-rich accuracy fell from 93.0 to 65.0 % at Tier-3 binning, from 91.4 to 61.9 % at Tier 2 and from 84.0 to 58.4 % at Tier 1. The classifier stayed confident: expected calibration error rose from 0.009 to 0.240 and the mean probability assigned to true carbon-rich planets fell from 0.96 to 0.47. Retraining with the absorbers restored 96.1 %, while a randomized grid of haze, clouds, spots, noise and disequilibrium chemistry did not help (75.6 %). Its errors, unlike the consortium classifier's errors under haze, were ranked well by distance scores (AUROC 0.90-0.91), though not by confidence (0.70). The contrast has a chemical reading: the added absorbers carry no information on whether CH₄ or H₂O exceeds 10⁻⁴, but are tied to C/O.</w:t>
+        <w:t>The carbon-rich classifier responded almost oppositely to omitted absorbers and haze, the two departures that most clearly separated where the consortium classifier could and could not be trusted (Figure 4). HCN and C₂H₂, abundant in carbon-rich atmospheres above about 800 K (14, 26), are absent from its training grid, as from the Ariel Data Challenge grid (5). Added at equilibrium abundances, they lowered accuracy on carbon-rich planets from 97.6 to 48.9 % on the simulated test sets, leaving oxygen-rich planets unaffected (94.5 and 95.7 %). On the known Ariel targets with payload noise, carbon-rich accuracy fell from 93.0 to 65.0 % at Tier-3 binning, from 91.4 to 61.9 % at Tier 2 and from 84.0 to 58.4 % at Tier 1. The classifier stayed confident: expected calibration error rose from 0.009 to 0.240 and the mean probability assigned to true carbon-rich planets fell from 0.96 to 0.47. Retraining with the absorbers restored 96.1 %, while a randomized grid of haze, clouds, spots, noise and disequilibrium chemistry did not help (75.6 %). Its errors, unlike the consortium classifier's errors under haze, were ranked well by distance scores (AUROC 0.90-0.91), though not by confidence (0.70). The contrast has a chemical reading: the added absorbers carry no information on whether CH₄ or H₂O exceeds 10⁻⁴, but are tied to C/O.</w:t>
       </w:r>
     </w:p>
     <w:p>
@@ -5923,7 +5923,7 @@
           <w:b w:val="0"/>
           <w:i w:val="0"/>
         </w:rPr>
-        <w:t>The molecular classifiers proposed for Ariel's Tier-1 survey were re-implemented from their published description and reproduced the published accuracies within 3.7 points. A stress test against fifteen departures from the simulator showed that the classifiers could be trusted under changes of opacity database, radiative-transfer code and omitted absorbers, and could not be trusted under haze, star spots and high clouds. Under haze at the weak end of the range retrieved for observed hot Jupiters, the classifiers reported methane and water absent while the infrared bands were intact, became more confident, and gave no warning; the failure came from the three optical photometric inputs, and removing those inputs or training with hazes largely removed it. A second classifier, built for Ariel's carbon-to-oxygen objective, had a nearly opposite trust profile at full resolution, so a stress test of one classifier does not stand in for another. Before any simulator-trained classifier is used to select planets for Ariel's deeper tiers, it should be subjected to its own stress test. The procedure applies to any classifier trained on simulated spectra whose forward model can be re-run; the scripts released with this note implement it for the two classifiers studied and can be adapted to others.</w:t>
+        <w:t>The molecular classifiers proposed for Ariel's Tier-1 survey were re-implemented from their published description and reproduced the published accuracies within 3.7 points. A stress test against fifteen departures from the simulator showed that the classifiers could be trusted when the opacity database or radiative-transfer code changed or absorbers were omitted, but not under haze, star spots or high clouds. Under haze at the weak end of the range retrieved for observed hot Jupiters, the classifiers reported methane and water absent while the infrared bands were intact, became more confident, and gave no warning; the failure came from the three optical photometric inputs, and excluding those inputs or training with hazes largely eliminated it. A second classifier, built for Ariel's carbon-to-oxygen objective, had a nearly opposite trust profile at full resolution, so a stress test of one classifier does not stand in for another. Before any simulator-trained classifier is used to select planets for Ariel's deeper tiers, it should be subjected to its own stress test. The procedure applies to any classifier trained on simulated spectra whose forward model can be re-run; the scripts released with this note implement it for the two classifiers studied and can be adapted to others.</w:t>
       </w:r>
     </w:p>
     <w:p>

</xml_diff>

<commit_message>
Reread: remove two word repetitions in abstract and introduction
</commit_message>
<xml_diff>
--- a/v3/jhss/manuscript.docx
+++ b/v3/jhss/manuscript.docx
@@ -75,7 +75,7 @@
           <w:b w:val="0"/>
           <w:i w:val="0"/>
         </w:rPr>
-        <w:t>Machine-learning classifiers have been proposed for sorting the roughly 1,000 planets of Ariel's Tier-1 reconnaissance survey by composition, but no Ariel data exist, so such classifiers have been trained and validated only on spectra from the simulator that produced them. This technical note asked whether one such proposal could be trusted when real atmospheres differ from the simulator. The molecular classifiers proposed in the Ariel consortium's Tier-1 population study, whose code was not released, were re-implemented from the published description; the re-implementation reproduced all 48 published accuracies within 3.7 points. The re-implemented classifiers were then tested against fifteen physically motivated departures from their simulator. For each departure the test measured the accuracy lost, the part of that loss a retrained classifier could recover, whether training on a randomized grid absorbed it, and whether confidence scores, distance-based novelty scores or conformal prediction flagged the errors. The classifiers were robust to an alternative opacity database, an alternative radiative-transfer code and two omitted absorbers (losses of 0.1-3.5 points). They were not robust to haze: at a haze strength comparable to the weakest retrieved for observed hot Jupiters, they reported methane and water absent on nearly every planet that contained them, with rising confidence and no warning from their own ensemble, although 87 % of the loss was recoverable. Removing the three optical photometric points from their input removed most of this failure, which identified those points as the cause. A second classifier, built for a different Ariel science question, showed a nearly opposite pattern at full resolution, so the trust profile of one classifier did not carry over to another. Each classifier therefore needs its own stress test before its outputs are used to select planets.</w:t>
+        <w:t>Machine-learning classifiers have been proposed for sorting the roughly 1,000 planets of Ariel's Tier-1 reconnaissance survey by composition, but no Ariel data exist, so such classifiers have been trained and validated only on spectra from the simulator that produced them. This technical note asked whether one such proposal could be trusted when real atmospheres differ from the simulator. The molecular classifiers proposed in the Ariel consortium's Tier-1 population study, whose code was not released, were re-implemented from the published description; the re-implementation reproduced all 48 published accuracies within 3.7 points. The re-implemented classifiers were then tested against fifteen physically motivated departures from their simulator. For each departure the test measured the accuracy lost, the part of that loss a retrained classifier could recover, whether training on a randomized grid absorbed it, and whether confidence scores, distance-based novelty scores or conformal prediction flagged the errors. The classifiers were robust to an alternative opacity database, an alternative radiative-transfer code and two omitted absorbers (losses of 0.1-3.5 points). They were not robust to haze: at a haze strength comparable to the weakest retrieved for observed hot Jupiters, they reported methane and water absent on nearly every planet that contained them, with rising confidence and no warning from their own ensemble, although 87 % of the loss was recoverable. Removing the three optical photometric points from their input eliminated most of this failure, which identified those points as the cause. A second classifier, built for a different Ariel science question, showed a nearly opposite pattern at full resolution, so the trust profile of one classifier did not carry over to another. Each classifier therefore needs its own stress test before its outputs are used to select planets.</w:t>
       </w:r>
     </w:p>
     <w:p>
@@ -149,7 +149,7 @@
           <w:b w:val="0"/>
           <w:i w:val="0"/>
         </w:rPr>
-        <w:t>Like the models developed for the Ariel Data Challenges (5) and in the wider machine-learning retrieval literature (7, 8), these classifiers were trained and tested on spectra from the same simulator. Such a test shows that a classifier has learned its simulator, but not how the classifier behaves when real atmospheres differ from the simulator. Real atmospheres will differ in documented ways: hazes and clouds are common and mute or reshape spectra (9, 10); unocculted star spots imprint false features (11); opacity data built from different line lists disagree (12, 13); and real atmospheres contain absorbers that training grids omit. The grid of the first Ariel Data Challenge, for example, contains only five absorbers (5), whereas carbon-rich atmospheres are expected to carry HCN and C₂H₂ as well (14). A classifier that fails in these situations does not announce it. It returns confident answers, and the planets it wrongly dismisses never receive the observations that would have revealed them.</w:t>
+        <w:t>Like the models developed for the Ariel Data Challenges (5) and in the wider machine-learning retrieval literature (7, 8), these classifiers were trained and tested on spectra from the same simulator. Such a test shows that a classifier has learned its simulator, but not how the classifier behaves when real atmospheres differ from the simulator. Real atmospheres will differ in documented ways: hazes and clouds are common and mute or reshape spectra (9, 10); unocculted star spots imprint false features (11); opacity data built from different line lists disagree (12, 13); and training grids omit absorbers that real atmospheres contain. The grid of the first Ariel Data Challenge, for example, contains only five absorbers (5), whereas carbon-rich atmospheres are expected to carry HCN and C₂H₂ as well (14). A classifier that fails in these situations does not announce it. It returns confident answers, and the planets it wrongly dismisses never receive the observations that would have revealed them.</w:t>
       </w:r>
     </w:p>
     <w:p>

</xml_diff>

<commit_message>
Label the manuscript as a Technical note above the title
</commit_message>
<xml_diff>
--- a/v3/jhss/manuscript.docx
+++ b/v3/jhss/manuscript.docx
@@ -2,6 +2,18 @@
 <file path=word/document.xml><?xml version="1.0" encoding="utf-8"?>
 <w:document xmlns:wpc="http://schemas.microsoft.com/office/word/2010/wordprocessingCanvas" xmlns:mo="http://schemas.microsoft.com/office/mac/office/2008/main" xmlns:mc="http://schemas.openxmlformats.org/markup-compatibility/2006" xmlns:mv="urn:schemas-microsoft-com:mac:vml" xmlns:o="urn:schemas-microsoft-com:office:office" xmlns:r="http://schemas.openxmlformats.org/officeDocument/2006/relationships" xmlns:m="http://schemas.openxmlformats.org/officeDocument/2006/math" xmlns:v="urn:schemas-microsoft-com:vml" xmlns:wp14="http://schemas.microsoft.com/office/word/2010/wordprocessingDrawing" xmlns:wp="http://schemas.openxmlformats.org/drawingml/2006/wordprocessingDrawing" xmlns:w10="urn:schemas-microsoft-com:office:word" xmlns:w="http://schemas.openxmlformats.org/wordprocessingml/2006/main" xmlns:w14="http://schemas.microsoft.com/office/word/2010/wordml" xmlns:wpg="http://schemas.microsoft.com/office/word/2010/wordprocessingGroup" xmlns:wpi="http://schemas.microsoft.com/office/word/2010/wordprocessingInk" xmlns:wne="http://schemas.microsoft.com/office/word/2006/wordml" xmlns:wps="http://schemas.microsoft.com/office/word/2010/wordprocessingShape" mc:Ignorable="w14 wp14">
   <w:body>
+    <w:p>
+      <w:pPr>
+        <w:jc w:val="both"/>
+      </w:pPr>
+      <w:r>
+        <w:rPr>
+          <w:b/>
+          <w:i w:val="0"/>
+        </w:rPr>
+        <w:t>Technical note</w:t>
+      </w:r>
+    </w:p>
     <w:p>
       <w:pPr>
         <w:pStyle w:val="Title"/>

</xml_diff>

<commit_message>
Add MIT License; manuscript links the supplementary directory and names the license
</commit_message>
<xml_diff>
--- a/v3/jhss/manuscript.docx
+++ b/v3/jhss/manuscript.docx
@@ -6007,21 +6007,21 @@
           <w:b w:val="0"/>
           <w:i w:val="0"/>
         </w:rPr>
-        <w:t xml:space="preserve">The re-implemented classifier, the stress-test scripts, every result table and figure, the expectations committed before the runs, and the corrections made to the forward model are in the directory </w:t>
+        <w:t xml:space="preserve">All code and results are publicly available under the MIT License. The supplementary file of this note is the directory https://github.com/oy2017/BioSignatureDetectionModel/tree/main/ariel_tier1_trust, which contains every result table and figure, the expectations committed before the runs, the evidence that the re-implementation is faithful, and the command that reproduces each result. The scripts it points to are in the directory </w:t>
       </w:r>
       <w:r>
         <w:rPr>
           <w:b w:val="0"/>
           <w:i w:val="0"/>
         </w:rPr>
-        <w:t>ariel_tier1_trust</w:t>
+        <w:t>v3</w:t>
       </w:r>
       <w:r>
         <w:rPr>
           <w:b w:val="0"/>
           <w:i w:val="0"/>
         </w:rPr>
-        <w:t xml:space="preserve"> of https://github.com/oy2017/BioSignatureDetectionModel, which serves as the supplementary file of this note.</w:t>
+        <w:t xml:space="preserve"> of the same repository: the consortium classifiers as re-implemented and released for general use, the carbon-rich classifier, the stress-test code and the corrections made to the forward model. Every reported number can be checked against the committed result files; regenerating the spectra from scratch additionally requires the third-party opacity tables, stellar spectra, chemistry code and noise simulator cited in Section 2.</w:t>
       </w:r>
     </w:p>
     <w:p>

</xml_diff>